<commit_message>
docs(submission): V4.3 design report and submission package
- Design report updated for the assistant entry point, the constrained
  chat agent, grounded regulation answers and model-drafted replies, with
  three live screenshots, current test/CI evidence and the stated
  limitation that the assistant is not yet in the versioned eval set.
- Demo script rewritten around the assistant; evidence, evaluation,
  reproduction, release notes and checklist updated.
- PDF exported with LibreOffice; package, manifest and SHA256 sums
  regenerated for the 2026-10-15 release.

Co-Authored-By: Claude Opus 5.5 <noreply@anthropic.com>
</commit_message>
<xml_diff>
--- a/submission/final/GlobalInfra_AI_AI出海应用设计报告.docx
+++ b/submission/final/GlobalInfra_AI_AI出海应用设计报告.docx
@@ -45,7 +45,7 @@
           <w:color w:val="000000"/>
           <w:sz w:val="28"/>
         </w:rPr>
-        <w:t>作品版本：GlobalInfra AI V4.2 / 阶段 9.7 参赛提交版</w:t>
+        <w:t>作品版本：GlobalInfra AI V4.3 参赛提交版（智能助手与可信执行）</w:t>
       </w:r>
     </w:p>
     <w:p>
@@ -181,7 +181,24 @@
           <w:color w:val="000000"/>
           <w:sz w:val="30"/>
         </w:rPr>
-        <w:t>截至 2026 年 10 月 14 日，版本化 AI 出海评测集包含 30 条合成用例，覆盖多语事件、法规许可、合同索赔、属地 HSE 培训和数字孪生运营五类任务。当前确定性评测中 30 条全部通过；国家、生命周期、风险、工单类型、Top 3 证据召回、引用完整、无证据拒答、结构化输出和离线降级门禁均达到 100%。该结果用于证明当前测试集上的可复现性，不等同于真实项目上的统计性能，也不代替属地专业判断。</w:t>
+        <w:t>V4.3 把智能助手作为默认入口。用户用一句话或一份函件发起任务，大模型结合最近对话从六个固定工具中选择处理方式：上报事件、查询法规、查询已有工单、项目进展、待审批和直接答复。工具名受 JSON schema 枚举约束，工单号和项目编号必须在数据库中真实存在；法规回答只能依据检索到的来源并逐句引用，来源卡片可展开到条文、主管机关、版本和官方链接；回复函在全部人工审批后才由大模型起草，引用必须属于该工单证据，否则退回模板。审批、执行、核验和关闭不是模型工具，只能由有权限的人点击确认。对话只是入口，工单仍是业务实体。</w:t>
+      </w:r>
+    </w:p>
+    <w:p>
+      <w:pPr>
+        <w:widowControl/>
+        <w:spacing w:line="348" w:lineRule="auto" w:after="0"/>
+        <w:ind w:firstLine="639"/>
+        <w:jc w:val="both"/>
+      </w:pPr>
+      <w:r>
+        <w:rPr>
+          <w:rFonts w:ascii="PingFang SC" w:hAnsi="PingFang SC" w:hint="eastAsia" w:eastAsia="PingFang SC" w:cs="PingFang SC"/>
+          <w:b w:val="0"/>
+          <w:color w:val="000000"/>
+          <w:sz w:val="30"/>
+        </w:rPr>
+        <w:t>截至 2026 年 10 月 14 日，版本化 AI 出海评测集包含 30 条合成用例，覆盖多语事件、法规许可、合同索赔、属地 HSE 培训和数字孪生运营五类任务。当前确定性评测中 30 条全部通过；国家、生命周期、风险、工单类型、Top 3 证据召回、引用完整、无证据拒答、结构化输出和离线降级门禁均达到 100%。该结果用于证明当前测试集上的可复现性，不等同于真实项目上的统计性能，也不代替属地专业判断。该评测集覆盖接入、路由和检索路径，不覆盖智能助手的对话意图规划；后者目前由自动化测试和线上人工核查验证，尚无量化评测。</w:t>
       </w:r>
     </w:p>
     <w:p>
@@ -2341,7 +2358,7 @@
           <w:color w:val="000000"/>
           <w:sz w:val="30"/>
         </w:rPr>
-        <w:t>GlobalInfra AI 是面向海外交通基础设施项目的可信 AI 执行与运营数字孪生平台。平台以项目事件和工单作为业务入口，以国家包和知识网络提供属地证据，以多智能体形成跨专业建议，以人工审批控制高风险行动，以执行和核验回执证明闭环完成。系统服务于铁路、公路、桥梁、隧道、港口、机场和城市基础设施等场景。</w:t>
+        <w:t>GlobalInfra AI 是面向海外交通基础设施项目的可信 AI 执行与运营数字孪生平台。用户通过智能助手用自然语言发起任务，平台在后台以项目事件和工单作为业务主线，以国家包和知识网络提供属地证据，以多智能体形成跨专业建议，以人工审批控制高风险行动，以执行和核验回执证明闭环完成。系统服务于铁路、公路、桥梁、隧道、港口、机场和城市基础设施等场景。</w:t>
       </w:r>
     </w:p>
     <w:p>
@@ -2433,7 +2450,7 @@
           <w:color w:val="000000"/>
           <w:sz w:val="30"/>
         </w:rPr>
-        <w:t>架构由五层组成。接入层接收文本、PDF、DOCX、TXT、现场观察、企业连接器、BIM GIS 和遥测；智能层执行分类抽取、检索、智能体协同、模型路由和策略判断；项目数字主线将组织、项目、生命周期、领域、事件、工单、证据、决策、行动和核验连接起来；数字孪生层以稳定 Twin ID 承载模型、4D 进度、5D 成本、调试、遥测和维护状态；治理层提供身份、权限、审计、审批、数据边界、执行回执和独立核验。</w:t>
+        <w:t>架构由五层组成。接入层通过智能助手对话入口和专用页面接收文本、PDF、DOCX、TXT、现场观察、企业连接器、BIM GIS 和遥测；智能层执行分类抽取、检索、智能体协同、模型路由和策略判断；项目数字主线将组织、项目、生命周期、领域、事件、工单、证据、决策、行动和核验连接起来；数字孪生层以稳定 Twin ID 承载模型、4D 进度、5D 成本、调试、遥测和维护状态；治理层提供身份、权限、审计、审批、数据边界、执行回执和独立核验。</w:t>
       </w:r>
     </w:p>
     <w:p>
@@ -4953,6 +4970,886 @@
     <w:p>
       <w:pPr>
         <w:keepNext/>
+        <w:widowControl/>
+        <w:spacing w:before="200" w:after="80" w:line="324" w:lineRule="auto"/>
+        <w:ind w:firstLine="642"/>
+        <w:jc w:val="both"/>
+      </w:pPr>
+      <w:r>
+        <w:rPr>
+          <w:rFonts w:ascii="PingFang SC" w:hAnsi="PingFang SC" w:hint="eastAsia" w:eastAsia="PingFang SC" w:cs="PingFang SC"/>
+          <w:b/>
+          <w:color w:val="000000"/>
+          <w:sz w:val="30"/>
+        </w:rPr>
+        <w:t>八 对话智能体与受约束工具调用</w:t>
+      </w:r>
+    </w:p>
+    <w:p>
+      <w:pPr>
+        <w:widowControl/>
+        <w:spacing w:line="348" w:lineRule="auto" w:after="0"/>
+        <w:ind w:firstLine="639"/>
+        <w:jc w:val="both"/>
+      </w:pPr>
+      <w:r>
+        <w:rPr>
+          <w:rFonts w:ascii="PingFang SC" w:hAnsi="PingFang SC" w:hint="eastAsia" w:eastAsia="PingFang SC" w:cs="PingFang SC"/>
+          <w:b w:val="0"/>
+          <w:color w:val="000000"/>
+          <w:sz w:val="30"/>
+        </w:rPr>
+        <w:t xml:space="preserve">智能助手的后端接口 </w:t>
+      </w:r>
+      <w:r>
+        <w:rPr>
+          <w:rFonts w:ascii="Consolas" w:hAnsi="Consolas" w:hint="default" w:eastAsia="Consolas" w:cs="Consolas"/>
+          <w:b w:val="0"/>
+          <w:color w:val="000000"/>
+          <w:sz w:val="21"/>
+        </w:rPr>
+        <w:t>/assistant/chat</w:t>
+      </w:r>
+      <w:r>
+        <w:rPr>
+          <w:rFonts w:ascii="PingFang SC" w:hAnsi="PingFang SC" w:hint="eastAsia" w:eastAsia="PingFang SC" w:cs="PingFang SC"/>
+          <w:b w:val="0"/>
+          <w:color w:val="000000"/>
+          <w:sz w:val="30"/>
+        </w:rPr>
+        <w:t xml:space="preserve"> 是一个受约束的规划器，而不是新的推理引擎。配置模型时，模型读取当前消息和最近八轮对话，只能输出一个 JSON 对象：工具名、检索查询、工单号、项目编号和直接答复。工具名是 schema 枚举；工单号和项目编号必须能在数据库中查到；任何越界、格式错误或无法核实的结果都会退回确定性关键词规划器。未配置模型时只使用规则，因此离线和 CI 行为保持确定。</w:t>
+      </w:r>
+    </w:p>
+    <w:tbl>
+      <w:tblPr>
+        <w:tblW w:type="pct" w:w="5000"/>
+        <w:jc w:val="center"/>
+        <w:tblLayout w:type="fixed"/>
+        <w:tblLook w:firstColumn="1" w:firstRow="1" w:lastColumn="0" w:lastRow="0" w:noHBand="0" w:noVBand="1" w:val="04A0"/>
+      </w:tblPr>
+      <w:tblGrid>
+        <w:gridCol w:w="2895"/>
+        <w:gridCol w:w="2895"/>
+        <w:gridCol w:w="2895"/>
+      </w:tblGrid>
+      <w:tr>
+        <w:trPr>
+          <w:cantSplit/>
+          <w:tblHeader w:val="true"/>
+        </w:trPr>
+        <w:tc>
+          <w:tcPr>
+            <w:tcW w:type="dxa" w:w="1284"/>
+            <w:vAlign w:val="center"/>
+            <w:tcMar>
+              <w:top w:w="100" w:type="dxa"/>
+              <w:start w:w="120" w:type="dxa"/>
+              <w:bottom w:w="100" w:type="dxa"/>
+              <w:end w:w="120" w:type="dxa"/>
+            </w:tcMar>
+            <w:tcBorders>
+              <w:top w:val="single" w:sz="6" w:color="D9E1F2"/>
+              <w:left w:val="single" w:sz="6" w:color="D9E1F2"/>
+              <w:bottom w:val="single" w:sz="6" w:color="D9E1F2"/>
+              <w:right w:val="single" w:sz="6" w:color="D9E1F2"/>
+              <w:insideH w:val="single" w:sz="6" w:color="D9E1F2"/>
+              <w:insideV w:val="single" w:sz="6" w:color="D9E1F2"/>
+            </w:tcBorders>
+            <w:shd w:fill="17365D"/>
+          </w:tcPr>
+          <w:p>
+            <w:pPr>
+              <w:spacing w:line="276" w:lineRule="auto" w:before="20" w:after="20"/>
+              <w:jc w:val="center"/>
+            </w:pPr>
+            <w:r>
+              <w:rPr>
+                <w:rFonts w:ascii="PingFang SC" w:hAnsi="PingFang SC" w:hint="eastAsia" w:eastAsia="PingFang SC" w:cs="PingFang SC"/>
+                <w:b/>
+                <w:color w:val="FFFFFF"/>
+                <w:sz w:val="21"/>
+              </w:rPr>
+              <w:t>风险</w:t>
+            </w:r>
+          </w:p>
+        </w:tc>
+        <w:tc>
+          <w:tcPr>
+            <w:tcW w:type="dxa" w:w="4219"/>
+            <w:vAlign w:val="center"/>
+            <w:tcMar>
+              <w:top w:w="100" w:type="dxa"/>
+              <w:start w:w="120" w:type="dxa"/>
+              <w:bottom w:w="100" w:type="dxa"/>
+              <w:end w:w="120" w:type="dxa"/>
+            </w:tcMar>
+            <w:tcBorders>
+              <w:top w:val="single" w:sz="6" w:color="D9E1F2"/>
+              <w:left w:val="single" w:sz="6" w:color="D9E1F2"/>
+              <w:bottom w:val="single" w:sz="6" w:color="D9E1F2"/>
+              <w:right w:val="single" w:sz="6" w:color="D9E1F2"/>
+              <w:insideH w:val="single" w:sz="6" w:color="D9E1F2"/>
+              <w:insideV w:val="single" w:sz="6" w:color="D9E1F2"/>
+            </w:tcBorders>
+            <w:shd w:fill="17365D"/>
+          </w:tcPr>
+          <w:p>
+            <w:pPr>
+              <w:spacing w:line="276" w:lineRule="auto" w:before="20" w:after="20"/>
+              <w:jc w:val="center"/>
+            </w:pPr>
+            <w:r>
+              <w:rPr>
+                <w:rFonts w:ascii="PingFang SC" w:hAnsi="PingFang SC" w:hint="eastAsia" w:eastAsia="PingFang SC" w:cs="PingFang SC"/>
+                <w:b/>
+                <w:color w:val="FFFFFF"/>
+                <w:sz w:val="21"/>
+              </w:rPr>
+              <w:t>控制措施</w:t>
+            </w:r>
+          </w:p>
+        </w:tc>
+        <w:tc>
+          <w:tcPr>
+            <w:tcW w:type="dxa" w:w="3137"/>
+            <w:vAlign w:val="center"/>
+            <w:tcMar>
+              <w:top w:w="100" w:type="dxa"/>
+              <w:start w:w="120" w:type="dxa"/>
+              <w:bottom w:w="100" w:type="dxa"/>
+              <w:end w:w="120" w:type="dxa"/>
+            </w:tcMar>
+            <w:tcBorders>
+              <w:top w:val="single" w:sz="6" w:color="D9E1F2"/>
+              <w:left w:val="single" w:sz="6" w:color="D9E1F2"/>
+              <w:bottom w:val="single" w:sz="6" w:color="D9E1F2"/>
+              <w:right w:val="single" w:sz="6" w:color="D9E1F2"/>
+              <w:insideH w:val="single" w:sz="6" w:color="D9E1F2"/>
+              <w:insideV w:val="single" w:sz="6" w:color="D9E1F2"/>
+            </w:tcBorders>
+            <w:shd w:fill="17365D"/>
+          </w:tcPr>
+          <w:p>
+            <w:pPr>
+              <w:spacing w:line="276" w:lineRule="auto" w:before="20" w:after="20"/>
+              <w:jc w:val="center"/>
+            </w:pPr>
+            <w:r>
+              <w:rPr>
+                <w:rFonts w:ascii="PingFang SC" w:hAnsi="PingFang SC" w:hint="eastAsia" w:eastAsia="PingFang SC" w:cs="PingFang SC"/>
+                <w:b/>
+                <w:color w:val="FFFFFF"/>
+                <w:sz w:val="21"/>
+              </w:rPr>
+              <w:t>可验证证据</w:t>
+            </w:r>
+          </w:p>
+        </w:tc>
+      </w:tr>
+      <w:tr>
+        <w:trPr>
+          <w:cantSplit/>
+        </w:trPr>
+        <w:tc>
+          <w:tcPr>
+            <w:tcW w:type="dxa" w:w="1284"/>
+            <w:vAlign w:val="center"/>
+            <w:tcMar>
+              <w:top w:w="100" w:type="dxa"/>
+              <w:start w:w="120" w:type="dxa"/>
+              <w:bottom w:w="100" w:type="dxa"/>
+              <w:end w:w="120" w:type="dxa"/>
+            </w:tcMar>
+            <w:tcBorders>
+              <w:top w:val="single" w:sz="6" w:color="D9E1F2"/>
+              <w:left w:val="single" w:sz="6" w:color="D9E1F2"/>
+              <w:bottom w:val="single" w:sz="6" w:color="D9E1F2"/>
+              <w:right w:val="single" w:sz="6" w:color="D9E1F2"/>
+              <w:insideH w:val="single" w:sz="6" w:color="D9E1F2"/>
+              <w:insideV w:val="single" w:sz="6" w:color="D9E1F2"/>
+            </w:tcBorders>
+            <w:shd w:fill="FFFFFF"/>
+          </w:tcPr>
+          <w:p>
+            <w:pPr>
+              <w:spacing w:line="276" w:lineRule="auto" w:before="20" w:after="20"/>
+              <w:jc w:val="center"/>
+            </w:pPr>
+            <w:r>
+              <w:rPr>
+                <w:rFonts w:ascii="PingFang SC" w:hAnsi="PingFang SC" w:hint="eastAsia" w:eastAsia="PingFang SC" w:cs="PingFang SC"/>
+                <w:b w:val="0"/>
+                <w:color w:val="000000"/>
+                <w:sz w:val="21"/>
+              </w:rPr>
+              <w:t>模型编造法规条文</w:t>
+            </w:r>
+          </w:p>
+        </w:tc>
+        <w:tc>
+          <w:tcPr>
+            <w:tcW w:type="dxa" w:w="4219"/>
+            <w:vAlign w:val="center"/>
+            <w:tcMar>
+              <w:top w:w="100" w:type="dxa"/>
+              <w:start w:w="120" w:type="dxa"/>
+              <w:bottom w:w="100" w:type="dxa"/>
+              <w:end w:w="120" w:type="dxa"/>
+            </w:tcMar>
+            <w:tcBorders>
+              <w:top w:val="single" w:sz="6" w:color="D9E1F2"/>
+              <w:left w:val="single" w:sz="6" w:color="D9E1F2"/>
+              <w:bottom w:val="single" w:sz="6" w:color="D9E1F2"/>
+              <w:right w:val="single" w:sz="6" w:color="D9E1F2"/>
+              <w:insideH w:val="single" w:sz="6" w:color="D9E1F2"/>
+              <w:insideV w:val="single" w:sz="6" w:color="D9E1F2"/>
+            </w:tcBorders>
+            <w:shd w:fill="FFFFFF"/>
+          </w:tcPr>
+          <w:p>
+            <w:pPr>
+              <w:spacing w:line="276" w:lineRule="auto" w:before="20" w:after="20"/>
+              <w:jc w:val="left"/>
+            </w:pPr>
+            <w:r>
+              <w:rPr>
+                <w:rFonts w:ascii="PingFang SC" w:hAnsi="PingFang SC" w:hint="eastAsia" w:eastAsia="PingFang SC" w:cs="PingFang SC"/>
+                <w:b w:val="0"/>
+                <w:color w:val="000000"/>
+                <w:sz w:val="21"/>
+              </w:rPr>
+              <w:t>回答只能依据检索结果，每句须以来源编号引用；未引用或引用未检索来源的回答被丢弃，只展示来源</w:t>
+            </w:r>
+          </w:p>
+        </w:tc>
+        <w:tc>
+          <w:tcPr>
+            <w:tcW w:type="dxa" w:w="3137"/>
+            <w:vAlign w:val="center"/>
+            <w:tcMar>
+              <w:top w:w="100" w:type="dxa"/>
+              <w:start w:w="120" w:type="dxa"/>
+              <w:bottom w:w="100" w:type="dxa"/>
+              <w:end w:w="120" w:type="dxa"/>
+            </w:tcMar>
+            <w:tcBorders>
+              <w:top w:val="single" w:sz="6" w:color="D9E1F2"/>
+              <w:left w:val="single" w:sz="6" w:color="D9E1F2"/>
+              <w:bottom w:val="single" w:sz="6" w:color="D9E1F2"/>
+              <w:right w:val="single" w:sz="6" w:color="D9E1F2"/>
+              <w:insideH w:val="single" w:sz="6" w:color="D9E1F2"/>
+              <w:insideV w:val="single" w:sz="6" w:color="D9E1F2"/>
+            </w:tcBorders>
+            <w:shd w:fill="FFFFFF"/>
+          </w:tcPr>
+          <w:p>
+            <w:pPr>
+              <w:spacing w:line="276" w:lineRule="auto" w:before="20" w:after="20"/>
+              <w:jc w:val="left"/>
+            </w:pPr>
+            <w:r>
+              <w:rPr>
+                <w:rFonts w:ascii="PingFang SC" w:hAnsi="PingFang SC" w:hint="eastAsia" w:eastAsia="PingFang SC" w:cs="PingFang SC"/>
+                <w:b w:val="0"/>
+                <w:color w:val="000000"/>
+                <w:sz w:val="21"/>
+              </w:rPr>
+              <w:t>引用校验函数和对应自动化测试</w:t>
+            </w:r>
+          </w:p>
+        </w:tc>
+      </w:tr>
+      <w:tr>
+        <w:trPr>
+          <w:cantSplit/>
+        </w:trPr>
+        <w:tc>
+          <w:tcPr>
+            <w:tcW w:type="dxa" w:w="1284"/>
+            <w:vAlign w:val="center"/>
+            <w:tcMar>
+              <w:top w:w="100" w:type="dxa"/>
+              <w:start w:w="120" w:type="dxa"/>
+              <w:bottom w:w="100" w:type="dxa"/>
+              <w:end w:w="120" w:type="dxa"/>
+            </w:tcMar>
+            <w:tcBorders>
+              <w:top w:val="single" w:sz="6" w:color="D9E1F2"/>
+              <w:left w:val="single" w:sz="6" w:color="D9E1F2"/>
+              <w:bottom w:val="single" w:sz="6" w:color="D9E1F2"/>
+              <w:right w:val="single" w:sz="6" w:color="D9E1F2"/>
+              <w:insideH w:val="single" w:sz="6" w:color="D9E1F2"/>
+              <w:insideV w:val="single" w:sz="6" w:color="D9E1F2"/>
+            </w:tcBorders>
+            <w:shd w:fill="EAF2F8"/>
+          </w:tcPr>
+          <w:p>
+            <w:pPr>
+              <w:spacing w:line="276" w:lineRule="auto" w:before="20" w:after="20"/>
+              <w:jc w:val="center"/>
+            </w:pPr>
+            <w:r>
+              <w:rPr>
+                <w:rFonts w:ascii="PingFang SC" w:hAnsi="PingFang SC" w:hint="eastAsia" w:eastAsia="PingFang SC" w:cs="PingFang SC"/>
+                <w:b w:val="0"/>
+                <w:color w:val="000000"/>
+                <w:sz w:val="21"/>
+              </w:rPr>
+              <w:t>模型改写查询导致漏检</w:t>
+            </w:r>
+          </w:p>
+        </w:tc>
+        <w:tc>
+          <w:tcPr>
+            <w:tcW w:type="dxa" w:w="4219"/>
+            <w:vAlign w:val="center"/>
+            <w:tcMar>
+              <w:top w:w="100" w:type="dxa"/>
+              <w:start w:w="120" w:type="dxa"/>
+              <w:bottom w:w="100" w:type="dxa"/>
+              <w:end w:w="120" w:type="dxa"/>
+            </w:tcMar>
+            <w:tcBorders>
+              <w:top w:val="single" w:sz="6" w:color="D9E1F2"/>
+              <w:left w:val="single" w:sz="6" w:color="D9E1F2"/>
+              <w:bottom w:val="single" w:sz="6" w:color="D9E1F2"/>
+              <w:right w:val="single" w:sz="6" w:color="D9E1F2"/>
+              <w:insideH w:val="single" w:sz="6" w:color="D9E1F2"/>
+              <w:insideV w:val="single" w:sz="6" w:color="D9E1F2"/>
+            </w:tcBorders>
+            <w:shd w:fill="EAF2F8"/>
+          </w:tcPr>
+          <w:p>
+            <w:pPr>
+              <w:spacing w:line="276" w:lineRule="auto" w:before="20" w:after="20"/>
+              <w:jc w:val="left"/>
+            </w:pPr>
+            <w:r>
+              <w:rPr>
+                <w:rFonts w:ascii="PingFang SC" w:hAnsi="PingFang SC" w:hint="eastAsia" w:eastAsia="PingFang SC" w:cs="PingFang SC"/>
+                <w:b w:val="0"/>
+                <w:color w:val="000000"/>
+                <w:sz w:val="21"/>
+              </w:rPr>
+              <w:t>同时以用户原话和模型改写查询检索，按文档取最高分合并</w:t>
+            </w:r>
+          </w:p>
+        </w:tc>
+        <w:tc>
+          <w:tcPr>
+            <w:tcW w:type="dxa" w:w="3137"/>
+            <w:vAlign w:val="center"/>
+            <w:tcMar>
+              <w:top w:w="100" w:type="dxa"/>
+              <w:start w:w="120" w:type="dxa"/>
+              <w:bottom w:w="100" w:type="dxa"/>
+              <w:end w:w="120" w:type="dxa"/>
+            </w:tcMar>
+            <w:tcBorders>
+              <w:top w:val="single" w:sz="6" w:color="D9E1F2"/>
+              <w:left w:val="single" w:sz="6" w:color="D9E1F2"/>
+              <w:bottom w:val="single" w:sz="6" w:color="D9E1F2"/>
+              <w:right w:val="single" w:sz="6" w:color="D9E1F2"/>
+              <w:insideH w:val="single" w:sz="6" w:color="D9E1F2"/>
+              <w:insideV w:val="single" w:sz="6" w:color="D9E1F2"/>
+            </w:tcBorders>
+            <w:shd w:fill="EAF2F8"/>
+          </w:tcPr>
+          <w:p>
+            <w:pPr>
+              <w:spacing w:line="276" w:lineRule="auto" w:before="20" w:after="20"/>
+              <w:jc w:val="left"/>
+            </w:pPr>
+            <w:r>
+              <w:rPr>
+                <w:rFonts w:ascii="PingFang SC" w:hAnsi="PingFang SC" w:hint="eastAsia" w:eastAsia="PingFang SC" w:cs="PingFang SC"/>
+                <w:b w:val="0"/>
+                <w:color w:val="000000"/>
+                <w:sz w:val="21"/>
+              </w:rPr>
+              <w:t>改写查询不丢失命中的回归测试</w:t>
+            </w:r>
+          </w:p>
+        </w:tc>
+      </w:tr>
+      <w:tr>
+        <w:trPr>
+          <w:cantSplit/>
+        </w:trPr>
+        <w:tc>
+          <w:tcPr>
+            <w:tcW w:type="dxa" w:w="1284"/>
+            <w:vAlign w:val="center"/>
+            <w:tcMar>
+              <w:top w:w="100" w:type="dxa"/>
+              <w:start w:w="120" w:type="dxa"/>
+              <w:bottom w:w="100" w:type="dxa"/>
+              <w:end w:w="120" w:type="dxa"/>
+            </w:tcMar>
+            <w:tcBorders>
+              <w:top w:val="single" w:sz="6" w:color="D9E1F2"/>
+              <w:left w:val="single" w:sz="6" w:color="D9E1F2"/>
+              <w:bottom w:val="single" w:sz="6" w:color="D9E1F2"/>
+              <w:right w:val="single" w:sz="6" w:color="D9E1F2"/>
+              <w:insideH w:val="single" w:sz="6" w:color="D9E1F2"/>
+              <w:insideV w:val="single" w:sz="6" w:color="D9E1F2"/>
+            </w:tcBorders>
+            <w:shd w:fill="FFFFFF"/>
+          </w:tcPr>
+          <w:p>
+            <w:pPr>
+              <w:spacing w:line="276" w:lineRule="auto" w:before="20" w:after="20"/>
+              <w:jc w:val="center"/>
+            </w:pPr>
+            <w:r>
+              <w:rPr>
+                <w:rFonts w:ascii="PingFang SC" w:hAnsi="PingFang SC" w:hint="eastAsia" w:eastAsia="PingFang SC" w:cs="PingFang SC"/>
+                <w:b w:val="0"/>
+                <w:color w:val="000000"/>
+                <w:sz w:val="21"/>
+              </w:rPr>
+              <w:t>模型越权执行</w:t>
+            </w:r>
+          </w:p>
+        </w:tc>
+        <w:tc>
+          <w:tcPr>
+            <w:tcW w:type="dxa" w:w="4219"/>
+            <w:vAlign w:val="center"/>
+            <w:tcMar>
+              <w:top w:w="100" w:type="dxa"/>
+              <w:start w:w="120" w:type="dxa"/>
+              <w:bottom w:w="100" w:type="dxa"/>
+              <w:end w:w="120" w:type="dxa"/>
+            </w:tcMar>
+            <w:tcBorders>
+              <w:top w:val="single" w:sz="6" w:color="D9E1F2"/>
+              <w:left w:val="single" w:sz="6" w:color="D9E1F2"/>
+              <w:bottom w:val="single" w:sz="6" w:color="D9E1F2"/>
+              <w:right w:val="single" w:sz="6" w:color="D9E1F2"/>
+              <w:insideH w:val="single" w:sz="6" w:color="D9E1F2"/>
+              <w:insideV w:val="single" w:sz="6" w:color="D9E1F2"/>
+            </w:tcBorders>
+            <w:shd w:fill="FFFFFF"/>
+          </w:tcPr>
+          <w:p>
+            <w:pPr>
+              <w:spacing w:line="276" w:lineRule="auto" w:before="20" w:after="20"/>
+              <w:jc w:val="left"/>
+            </w:pPr>
+            <w:r>
+              <w:rPr>
+                <w:rFonts w:ascii="PingFang SC" w:hAnsi="PingFang SC" w:hint="eastAsia" w:eastAsia="PingFang SC" w:cs="PingFang SC"/>
+                <w:b w:val="0"/>
+                <w:color w:val="000000"/>
+                <w:sz w:val="21"/>
+              </w:rPr>
+              <w:t>审批、执行、核验和关闭不在工具清单内；要求代为批准时只列出待审批事项</w:t>
+            </w:r>
+          </w:p>
+        </w:tc>
+        <w:tc>
+          <w:tcPr>
+            <w:tcW w:type="dxa" w:w="3137"/>
+            <w:vAlign w:val="center"/>
+            <w:tcMar>
+              <w:top w:w="100" w:type="dxa"/>
+              <w:start w:w="120" w:type="dxa"/>
+              <w:bottom w:w="100" w:type="dxa"/>
+              <w:end w:w="120" w:type="dxa"/>
+            </w:tcMar>
+            <w:tcBorders>
+              <w:top w:val="single" w:sz="6" w:color="D9E1F2"/>
+              <w:left w:val="single" w:sz="6" w:color="D9E1F2"/>
+              <w:bottom w:val="single" w:sz="6" w:color="D9E1F2"/>
+              <w:right w:val="single" w:sz="6" w:color="D9E1F2"/>
+              <w:insideH w:val="single" w:sz="6" w:color="D9E1F2"/>
+              <w:insideV w:val="single" w:sz="6" w:color="D9E1F2"/>
+            </w:tcBorders>
+            <w:shd w:fill="FFFFFF"/>
+          </w:tcPr>
+          <w:p>
+            <w:pPr>
+              <w:spacing w:line="276" w:lineRule="auto" w:before="20" w:after="20"/>
+              <w:jc w:val="center"/>
+            </w:pPr>
+            <w:r>
+              <w:rPr>
+                <w:rFonts w:ascii="PingFang SC" w:hAnsi="PingFang SC" w:hint="eastAsia" w:eastAsia="PingFang SC" w:cs="PingFang SC"/>
+                <w:b w:val="0"/>
+                <w:color w:val="000000"/>
+                <w:sz w:val="21"/>
+              </w:rPr>
+              <w:t>工具枚举和线上核查记录</w:t>
+            </w:r>
+          </w:p>
+        </w:tc>
+      </w:tr>
+      <w:tr>
+        <w:trPr>
+          <w:cantSplit/>
+        </w:trPr>
+        <w:tc>
+          <w:tcPr>
+            <w:tcW w:type="dxa" w:w="1284"/>
+            <w:vAlign w:val="center"/>
+            <w:tcMar>
+              <w:top w:w="100" w:type="dxa"/>
+              <w:start w:w="120" w:type="dxa"/>
+              <w:bottom w:w="100" w:type="dxa"/>
+              <w:end w:w="120" w:type="dxa"/>
+            </w:tcMar>
+            <w:tcBorders>
+              <w:top w:val="single" w:sz="6" w:color="D9E1F2"/>
+              <w:left w:val="single" w:sz="6" w:color="D9E1F2"/>
+              <w:bottom w:val="single" w:sz="6" w:color="D9E1F2"/>
+              <w:right w:val="single" w:sz="6" w:color="D9E1F2"/>
+              <w:insideH w:val="single" w:sz="6" w:color="D9E1F2"/>
+              <w:insideV w:val="single" w:sz="6" w:color="D9E1F2"/>
+            </w:tcBorders>
+            <w:shd w:fill="EAF2F8"/>
+          </w:tcPr>
+          <w:p>
+            <w:pPr>
+              <w:spacing w:line="276" w:lineRule="auto" w:before="20" w:after="20"/>
+              <w:jc w:val="center"/>
+            </w:pPr>
+            <w:r>
+              <w:rPr>
+                <w:rFonts w:ascii="PingFang SC" w:hAnsi="PingFang SC" w:hint="eastAsia" w:eastAsia="PingFang SC" w:cs="PingFang SC"/>
+                <w:b w:val="0"/>
+                <w:color w:val="000000"/>
+                <w:sz w:val="21"/>
+              </w:rPr>
+              <w:t>事件被闲聊打发</w:t>
+            </w:r>
+          </w:p>
+        </w:tc>
+        <w:tc>
+          <w:tcPr>
+            <w:tcW w:type="dxa" w:w="4219"/>
+            <w:vAlign w:val="center"/>
+            <w:tcMar>
+              <w:top w:w="100" w:type="dxa"/>
+              <w:start w:w="120" w:type="dxa"/>
+              <w:bottom w:w="100" w:type="dxa"/>
+              <w:end w:w="120" w:type="dxa"/>
+            </w:tcMar>
+            <w:tcBorders>
+              <w:top w:val="single" w:sz="6" w:color="D9E1F2"/>
+              <w:left w:val="single" w:sz="6" w:color="D9E1F2"/>
+              <w:bottom w:val="single" w:sz="6" w:color="D9E1F2"/>
+              <w:right w:val="single" w:sz="6" w:color="D9E1F2"/>
+              <w:insideH w:val="single" w:sz="6" w:color="D9E1F2"/>
+              <w:insideV w:val="single" w:sz="6" w:color="D9E1F2"/>
+            </w:tcBorders>
+            <w:shd w:fill="EAF2F8"/>
+          </w:tcPr>
+          <w:p>
+            <w:pPr>
+              <w:spacing w:line="276" w:lineRule="auto" w:before="20" w:after="20"/>
+              <w:jc w:val="left"/>
+            </w:pPr>
+            <w:r>
+              <w:rPr>
+                <w:rFonts w:ascii="PingFang SC" w:hAnsi="PingFang SC" w:hint="eastAsia" w:eastAsia="PingFang SC" w:cs="PingFang SC"/>
+                <w:b w:val="0"/>
+                <w:color w:val="000000"/>
+                <w:sz w:val="21"/>
+              </w:rPr>
+              <w:t>含事件特征的消息不接受模型的直接答复，强制进入接入流程</w:t>
+            </w:r>
+          </w:p>
+        </w:tc>
+        <w:tc>
+          <w:tcPr>
+            <w:tcW w:type="dxa" w:w="3137"/>
+            <w:vAlign w:val="center"/>
+            <w:tcMar>
+              <w:top w:w="100" w:type="dxa"/>
+              <w:start w:w="120" w:type="dxa"/>
+              <w:bottom w:w="100" w:type="dxa"/>
+              <w:end w:w="120" w:type="dxa"/>
+            </w:tcMar>
+            <w:tcBorders>
+              <w:top w:val="single" w:sz="6" w:color="D9E1F2"/>
+              <w:left w:val="single" w:sz="6" w:color="D9E1F2"/>
+              <w:bottom w:val="single" w:sz="6" w:color="D9E1F2"/>
+              <w:right w:val="single" w:sz="6" w:color="D9E1F2"/>
+              <w:insideH w:val="single" w:sz="6" w:color="D9E1F2"/>
+              <w:insideV w:val="single" w:sz="6" w:color="D9E1F2"/>
+            </w:tcBorders>
+            <w:shd w:fill="EAF2F8"/>
+          </w:tcPr>
+          <w:p>
+            <w:pPr>
+              <w:spacing w:line="276" w:lineRule="auto" w:before="20" w:after="20"/>
+              <w:jc w:val="center"/>
+            </w:pPr>
+            <w:r>
+              <w:rPr>
+                <w:rFonts w:ascii="PingFang SC" w:hAnsi="PingFang SC" w:hint="eastAsia" w:eastAsia="PingFang SC" w:cs="PingFang SC"/>
+                <w:b w:val="0"/>
+                <w:color w:val="000000"/>
+                <w:sz w:val="21"/>
+              </w:rPr>
+              <w:t>对应自动化测试</w:t>
+            </w:r>
+          </w:p>
+        </w:tc>
+      </w:tr>
+      <w:tr>
+        <w:trPr>
+          <w:cantSplit/>
+        </w:trPr>
+        <w:tc>
+          <w:tcPr>
+            <w:tcW w:type="dxa" w:w="1284"/>
+            <w:vAlign w:val="center"/>
+            <w:tcMar>
+              <w:top w:w="100" w:type="dxa"/>
+              <w:start w:w="120" w:type="dxa"/>
+              <w:bottom w:w="100" w:type="dxa"/>
+              <w:end w:w="120" w:type="dxa"/>
+            </w:tcMar>
+            <w:tcBorders>
+              <w:top w:val="single" w:sz="6" w:color="D9E1F2"/>
+              <w:left w:val="single" w:sz="6" w:color="D9E1F2"/>
+              <w:bottom w:val="single" w:sz="6" w:color="D9E1F2"/>
+              <w:right w:val="single" w:sz="6" w:color="D9E1F2"/>
+              <w:insideH w:val="single" w:sz="6" w:color="D9E1F2"/>
+              <w:insideV w:val="single" w:sz="6" w:color="D9E1F2"/>
+            </w:tcBorders>
+            <w:shd w:fill="FFFFFF"/>
+          </w:tcPr>
+          <w:p>
+            <w:pPr>
+              <w:spacing w:line="276" w:lineRule="auto" w:before="20" w:after="20"/>
+              <w:jc w:val="center"/>
+            </w:pPr>
+            <w:r>
+              <w:rPr>
+                <w:rFonts w:ascii="PingFang SC" w:hAnsi="PingFang SC" w:hint="eastAsia" w:eastAsia="PingFang SC" w:cs="PingFang SC"/>
+                <w:b w:val="0"/>
+                <w:color w:val="000000"/>
+                <w:sz w:val="21"/>
+              </w:rPr>
+              <w:t>敏感数据外发</w:t>
+            </w:r>
+          </w:p>
+        </w:tc>
+        <w:tc>
+          <w:tcPr>
+            <w:tcW w:type="dxa" w:w="4219"/>
+            <w:vAlign w:val="center"/>
+            <w:tcMar>
+              <w:top w:w="100" w:type="dxa"/>
+              <w:start w:w="120" w:type="dxa"/>
+              <w:bottom w:w="100" w:type="dxa"/>
+              <w:end w:w="120" w:type="dxa"/>
+            </w:tcMar>
+            <w:tcBorders>
+              <w:top w:val="single" w:sz="6" w:color="D9E1F2"/>
+              <w:left w:val="single" w:sz="6" w:color="D9E1F2"/>
+              <w:bottom w:val="single" w:sz="6" w:color="D9E1F2"/>
+              <w:right w:val="single" w:sz="6" w:color="D9E1F2"/>
+              <w:insideH w:val="single" w:sz="6" w:color="D9E1F2"/>
+              <w:insideV w:val="single" w:sz="6" w:color="D9E1F2"/>
+            </w:tcBorders>
+            <w:shd w:fill="FFFFFF"/>
+          </w:tcPr>
+          <w:p>
+            <w:pPr>
+              <w:spacing w:line="276" w:lineRule="auto" w:before="20" w:after="20"/>
+              <w:jc w:val="left"/>
+            </w:pPr>
+            <w:r>
+              <w:rPr>
+                <w:rFonts w:ascii="PingFang SC" w:hAnsi="PingFang SC" w:hint="eastAsia" w:eastAsia="PingFang SC" w:cs="PingFang SC"/>
+                <w:b w:val="0"/>
+                <w:color w:val="000000"/>
+                <w:sz w:val="21"/>
+              </w:rPr>
+              <w:t>`restricted` 数据在任何云端请求前被限制为本地模型；不允许的路由视为无模型并退回规则</w:t>
+            </w:r>
+          </w:p>
+        </w:tc>
+        <w:tc>
+          <w:tcPr>
+            <w:tcW w:type="dxa" w:w="3137"/>
+            <w:vAlign w:val="center"/>
+            <w:tcMar>
+              <w:top w:w="100" w:type="dxa"/>
+              <w:start w:w="120" w:type="dxa"/>
+              <w:bottom w:w="100" w:type="dxa"/>
+              <w:end w:w="120" w:type="dxa"/>
+            </w:tcMar>
+            <w:tcBorders>
+              <w:top w:val="single" w:sz="6" w:color="D9E1F2"/>
+              <w:left w:val="single" w:sz="6" w:color="D9E1F2"/>
+              <w:bottom w:val="single" w:sz="6" w:color="D9E1F2"/>
+              <w:right w:val="single" w:sz="6" w:color="D9E1F2"/>
+              <w:insideH w:val="single" w:sz="6" w:color="D9E1F2"/>
+              <w:insideV w:val="single" w:sz="6" w:color="D9E1F2"/>
+            </w:tcBorders>
+            <w:shd w:fill="FFFFFF"/>
+          </w:tcPr>
+          <w:p>
+            <w:pPr>
+              <w:spacing w:line="276" w:lineRule="auto" w:before="20" w:after="20"/>
+              <w:jc w:val="center"/>
+            </w:pPr>
+            <w:r>
+              <w:rPr>
+                <w:rFonts w:ascii="PingFang SC" w:hAnsi="PingFang SC" w:hint="eastAsia" w:eastAsia="PingFang SC" w:cs="PingFang SC"/>
+                <w:b w:val="0"/>
+                <w:color w:val="000000"/>
+                <w:sz w:val="21"/>
+              </w:rPr>
+              <w:t>敏感数据路由测试</w:t>
+            </w:r>
+          </w:p>
+        </w:tc>
+      </w:tr>
+      <w:tr>
+        <w:trPr>
+          <w:cantSplit/>
+        </w:trPr>
+        <w:tc>
+          <w:tcPr>
+            <w:tcW w:type="dxa" w:w="1284"/>
+            <w:vAlign w:val="center"/>
+            <w:tcMar>
+              <w:top w:w="100" w:type="dxa"/>
+              <w:start w:w="120" w:type="dxa"/>
+              <w:bottom w:w="100" w:type="dxa"/>
+              <w:end w:w="120" w:type="dxa"/>
+            </w:tcMar>
+            <w:tcBorders>
+              <w:top w:val="single" w:sz="6" w:color="D9E1F2"/>
+              <w:left w:val="single" w:sz="6" w:color="D9E1F2"/>
+              <w:bottom w:val="single" w:sz="6" w:color="D9E1F2"/>
+              <w:right w:val="single" w:sz="6" w:color="D9E1F2"/>
+              <w:insideH w:val="single" w:sz="6" w:color="D9E1F2"/>
+              <w:insideV w:val="single" w:sz="6" w:color="D9E1F2"/>
+            </w:tcBorders>
+            <w:shd w:fill="EAF2F8"/>
+          </w:tcPr>
+          <w:p>
+            <w:pPr>
+              <w:spacing w:line="276" w:lineRule="auto" w:before="20" w:after="20"/>
+              <w:jc w:val="center"/>
+            </w:pPr>
+            <w:r>
+              <w:rPr>
+                <w:rFonts w:ascii="PingFang SC" w:hAnsi="PingFang SC" w:hint="eastAsia" w:eastAsia="PingFang SC" w:cs="PingFang SC"/>
+                <w:b w:val="0"/>
+                <w:color w:val="000000"/>
+                <w:sz w:val="21"/>
+              </w:rPr>
+              <w:t>回复函承诺越界</w:t>
+            </w:r>
+          </w:p>
+        </w:tc>
+        <w:tc>
+          <w:tcPr>
+            <w:tcW w:type="dxa" w:w="4219"/>
+            <w:vAlign w:val="center"/>
+            <w:tcMar>
+              <w:top w:w="100" w:type="dxa"/>
+              <w:start w:w="120" w:type="dxa"/>
+              <w:bottom w:w="100" w:type="dxa"/>
+              <w:end w:w="120" w:type="dxa"/>
+            </w:tcMar>
+            <w:tcBorders>
+              <w:top w:val="single" w:sz="6" w:color="D9E1F2"/>
+              <w:left w:val="single" w:sz="6" w:color="D9E1F2"/>
+              <w:bottom w:val="single" w:sz="6" w:color="D9E1F2"/>
+              <w:right w:val="single" w:sz="6" w:color="D9E1F2"/>
+              <w:insideH w:val="single" w:sz="6" w:color="D9E1F2"/>
+              <w:insideV w:val="single" w:sz="6" w:color="D9E1F2"/>
+            </w:tcBorders>
+            <w:shd w:fill="EAF2F8"/>
+          </w:tcPr>
+          <w:p>
+            <w:pPr>
+              <w:spacing w:line="276" w:lineRule="auto" w:before="20" w:after="20"/>
+              <w:jc w:val="left"/>
+            </w:pPr>
+            <w:r>
+              <w:rPr>
+                <w:rFonts w:ascii="PingFang SC" w:hAnsi="PingFang SC" w:hint="eastAsia" w:eastAsia="PingFang SC" w:cs="PingFang SC"/>
+                <w:b w:val="0"/>
+                <w:color w:val="000000"/>
+                <w:sz w:val="21"/>
+              </w:rPr>
+              <w:t>起草提示禁止承认责任、费用和工期，未知信息用 [●] 占位；引用须属于本工单证据，否则退回模板</w:t>
+            </w:r>
+          </w:p>
+        </w:tc>
+        <w:tc>
+          <w:tcPr>
+            <w:tcW w:type="dxa" w:w="3137"/>
+            <w:vAlign w:val="center"/>
+            <w:tcMar>
+              <w:top w:w="100" w:type="dxa"/>
+              <w:start w:w="120" w:type="dxa"/>
+              <w:bottom w:w="100" w:type="dxa"/>
+              <w:end w:w="120" w:type="dxa"/>
+            </w:tcMar>
+            <w:tcBorders>
+              <w:top w:val="single" w:sz="6" w:color="D9E1F2"/>
+              <w:left w:val="single" w:sz="6" w:color="D9E1F2"/>
+              <w:bottom w:val="single" w:sz="6" w:color="D9E1F2"/>
+              <w:right w:val="single" w:sz="6" w:color="D9E1F2"/>
+              <w:insideH w:val="single" w:sz="6" w:color="D9E1F2"/>
+              <w:insideV w:val="single" w:sz="6" w:color="D9E1F2"/>
+            </w:tcBorders>
+            <w:shd w:fill="EAF2F8"/>
+          </w:tcPr>
+          <w:p>
+            <w:pPr>
+              <w:spacing w:line="276" w:lineRule="auto" w:before="20" w:after="20"/>
+              <w:jc w:val="left"/>
+            </w:pPr>
+            <w:r>
+              <w:rPr>
+                <w:rFonts w:ascii="PingFang SC" w:hAnsi="PingFang SC" w:hint="eastAsia" w:eastAsia="PingFang SC" w:cs="PingFang SC"/>
+                <w:b w:val="0"/>
+                <w:color w:val="000000"/>
+                <w:sz w:val="21"/>
+              </w:rPr>
+              <w:t>回复起草测试和产物 `composition` 字段</w:t>
+            </w:r>
+          </w:p>
+        </w:tc>
+      </w:tr>
+    </w:tbl>
+    <w:p>
+      <w:pPr>
+        <w:spacing w:after="40"/>
+      </w:pPr>
+    </w:p>
+    <w:p>
+      <w:pPr>
+        <w:widowControl/>
+        <w:spacing w:line="348" w:lineRule="auto" w:after="0"/>
+        <w:ind w:firstLine="639"/>
+        <w:jc w:val="both"/>
+      </w:pPr>
+      <w:r>
+        <w:rPr>
+          <w:rFonts w:ascii="PingFang SC" w:hAnsi="PingFang SC" w:hint="eastAsia" w:eastAsia="PingFang SC" w:cs="PingFang SC"/>
+          <w:b w:val="0"/>
+          <w:color w:val="000000"/>
+          <w:sz w:val="30"/>
+        </w:rPr>
+        <w:t>每条回复都标明处理来源为「大模型理解」「规则识别」或「按你的选择」，用户可以判断结果是否来自模型。</w:t>
+      </w:r>
+    </w:p>
+    <w:p>
+      <w:pPr>
+        <w:keepNext/>
         <w:pageBreakBefore/>
         <w:widowControl/>
         <w:spacing w:before="0" w:after="160" w:line="360" w:lineRule="auto"/>
@@ -4984,7 +5881,910 @@
           <w:color w:val="000000"/>
           <w:sz w:val="30"/>
         </w:rPr>
-        <w:t>一 七步黄金主线</w:t>
+        <w:t>一 智能助手对话入口</w:t>
+      </w:r>
+    </w:p>
+    <w:p>
+      <w:pPr>
+        <w:widowControl/>
+        <w:spacing w:line="348" w:lineRule="auto" w:after="0"/>
+        <w:ind w:firstLine="639"/>
+        <w:jc w:val="both"/>
+      </w:pPr>
+      <w:r>
+        <w:rPr>
+          <w:rFonts w:ascii="PingFang SC" w:hAnsi="PingFang SC" w:hint="eastAsia" w:eastAsia="PingFang SC" w:cs="PingFang SC"/>
+          <w:b w:val="0"/>
+          <w:color w:val="000000"/>
+          <w:sz w:val="30"/>
+        </w:rPr>
+        <w:t>打开系统即进入智能助手。输入框支持文字和 PDF、DOCX、TXT 附件，可选择项目、模型路由（自动、本地、云端）和「敏感」标记；快捷按钮提供上报现场问题、处理业主函件、查当地法规、项目进展和待我审批五个任务。原指挥中心保留为全景页，其余工作台不变。</w:t>
+      </w:r>
+    </w:p>
+    <w:tbl>
+      <w:tblPr>
+        <w:tblW w:type="pct" w:w="5000"/>
+        <w:jc w:val="center"/>
+        <w:tblLayout w:type="fixed"/>
+        <w:tblLook w:firstColumn="1" w:firstRow="1" w:lastColumn="0" w:lastRow="0" w:noHBand="0" w:noVBand="1" w:val="04A0"/>
+      </w:tblPr>
+      <w:tblGrid>
+        <w:gridCol w:w="2895"/>
+        <w:gridCol w:w="2895"/>
+        <w:gridCol w:w="2895"/>
+      </w:tblGrid>
+      <w:tr>
+        <w:trPr>
+          <w:cantSplit/>
+          <w:tblHeader w:val="true"/>
+        </w:trPr>
+        <w:tc>
+          <w:tcPr>
+            <w:tcW w:type="dxa" w:w="1184"/>
+            <w:vAlign w:val="center"/>
+            <w:tcMar>
+              <w:top w:w="100" w:type="dxa"/>
+              <w:start w:w="120" w:type="dxa"/>
+              <w:bottom w:w="100" w:type="dxa"/>
+              <w:end w:w="120" w:type="dxa"/>
+            </w:tcMar>
+            <w:tcBorders>
+              <w:top w:val="single" w:sz="6" w:color="D9E1F2"/>
+              <w:left w:val="single" w:sz="6" w:color="D9E1F2"/>
+              <w:bottom w:val="single" w:sz="6" w:color="D9E1F2"/>
+              <w:right w:val="single" w:sz="6" w:color="D9E1F2"/>
+              <w:insideH w:val="single" w:sz="6" w:color="D9E1F2"/>
+              <w:insideV w:val="single" w:sz="6" w:color="D9E1F2"/>
+            </w:tcBorders>
+            <w:shd w:fill="17365D"/>
+          </w:tcPr>
+          <w:p>
+            <w:pPr>
+              <w:spacing w:line="276" w:lineRule="auto" w:before="20" w:after="20"/>
+              <w:jc w:val="center"/>
+            </w:pPr>
+            <w:r>
+              <w:rPr>
+                <w:rFonts w:ascii="PingFang SC" w:hAnsi="PingFang SC" w:hint="eastAsia" w:eastAsia="PingFang SC" w:cs="PingFang SC"/>
+                <w:b/>
+                <w:color w:val="FFFFFF"/>
+                <w:sz w:val="21"/>
+              </w:rPr>
+              <w:t>用户输入</w:t>
+            </w:r>
+          </w:p>
+        </w:tc>
+        <w:tc>
+          <w:tcPr>
+            <w:tcW w:type="dxa" w:w="3784"/>
+            <w:vAlign w:val="center"/>
+            <w:tcMar>
+              <w:top w:w="100" w:type="dxa"/>
+              <w:start w:w="120" w:type="dxa"/>
+              <w:bottom w:w="100" w:type="dxa"/>
+              <w:end w:w="120" w:type="dxa"/>
+            </w:tcMar>
+            <w:tcBorders>
+              <w:top w:val="single" w:sz="6" w:color="D9E1F2"/>
+              <w:left w:val="single" w:sz="6" w:color="D9E1F2"/>
+              <w:bottom w:val="single" w:sz="6" w:color="D9E1F2"/>
+              <w:right w:val="single" w:sz="6" w:color="D9E1F2"/>
+              <w:insideH w:val="single" w:sz="6" w:color="D9E1F2"/>
+              <w:insideV w:val="single" w:sz="6" w:color="D9E1F2"/>
+            </w:tcBorders>
+            <w:shd w:fill="17365D"/>
+          </w:tcPr>
+          <w:p>
+            <w:pPr>
+              <w:spacing w:line="276" w:lineRule="auto" w:before="20" w:after="20"/>
+              <w:jc w:val="center"/>
+            </w:pPr>
+            <w:r>
+              <w:rPr>
+                <w:rFonts w:ascii="PingFang SC" w:hAnsi="PingFang SC" w:hint="eastAsia" w:eastAsia="PingFang SC" w:cs="PingFang SC"/>
+                <w:b/>
+                <w:color w:val="FFFFFF"/>
+                <w:sz w:val="21"/>
+              </w:rPr>
+              <w:t>智能助手处理</w:t>
+            </w:r>
+          </w:p>
+        </w:tc>
+        <w:tc>
+          <w:tcPr>
+            <w:tcW w:type="dxa" w:w="3672"/>
+            <w:vAlign w:val="center"/>
+            <w:tcMar>
+              <w:top w:w="100" w:type="dxa"/>
+              <w:start w:w="120" w:type="dxa"/>
+              <w:bottom w:w="100" w:type="dxa"/>
+              <w:end w:w="120" w:type="dxa"/>
+            </w:tcMar>
+            <w:tcBorders>
+              <w:top w:val="single" w:sz="6" w:color="D9E1F2"/>
+              <w:left w:val="single" w:sz="6" w:color="D9E1F2"/>
+              <w:bottom w:val="single" w:sz="6" w:color="D9E1F2"/>
+              <w:right w:val="single" w:sz="6" w:color="D9E1F2"/>
+              <w:insideH w:val="single" w:sz="6" w:color="D9E1F2"/>
+              <w:insideV w:val="single" w:sz="6" w:color="D9E1F2"/>
+            </w:tcBorders>
+            <w:shd w:fill="17365D"/>
+          </w:tcPr>
+          <w:p>
+            <w:pPr>
+              <w:spacing w:line="276" w:lineRule="auto" w:before="20" w:after="20"/>
+              <w:jc w:val="center"/>
+            </w:pPr>
+            <w:r>
+              <w:rPr>
+                <w:rFonts w:ascii="PingFang SC" w:hAnsi="PingFang SC" w:hint="eastAsia" w:eastAsia="PingFang SC" w:cs="PingFang SC"/>
+                <w:b/>
+                <w:color w:val="FFFFFF"/>
+                <w:sz w:val="21"/>
+              </w:rPr>
+              <w:t>对话中呈现</w:t>
+            </w:r>
+          </w:p>
+        </w:tc>
+      </w:tr>
+      <w:tr>
+        <w:trPr>
+          <w:cantSplit/>
+        </w:trPr>
+        <w:tc>
+          <w:tcPr>
+            <w:tcW w:type="dxa" w:w="1184"/>
+            <w:vAlign w:val="center"/>
+            <w:tcMar>
+              <w:top w:w="100" w:type="dxa"/>
+              <w:start w:w="120" w:type="dxa"/>
+              <w:bottom w:w="100" w:type="dxa"/>
+              <w:end w:w="120" w:type="dxa"/>
+            </w:tcMar>
+            <w:tcBorders>
+              <w:top w:val="single" w:sz="6" w:color="D9E1F2"/>
+              <w:left w:val="single" w:sz="6" w:color="D9E1F2"/>
+              <w:bottom w:val="single" w:sz="6" w:color="D9E1F2"/>
+              <w:right w:val="single" w:sz="6" w:color="D9E1F2"/>
+              <w:insideH w:val="single" w:sz="6" w:color="D9E1F2"/>
+              <w:insideV w:val="single" w:sz="6" w:color="D9E1F2"/>
+            </w:tcBorders>
+            <w:shd w:fill="FFFFFF"/>
+          </w:tcPr>
+          <w:p>
+            <w:pPr>
+              <w:spacing w:line="276" w:lineRule="auto" w:before="20" w:after="20"/>
+              <w:jc w:val="center"/>
+            </w:pPr>
+            <w:r>
+              <w:rPr>
+                <w:rFonts w:ascii="PingFang SC" w:hAnsi="PingFang SC" w:hint="eastAsia" w:eastAsia="PingFang SC" w:cs="PingFang SC"/>
+                <w:b w:val="0"/>
+                <w:color w:val="000000"/>
+                <w:sz w:val="21"/>
+              </w:rPr>
+              <w:t>现场问题或业主函件</w:t>
+            </w:r>
+          </w:p>
+        </w:tc>
+        <w:tc>
+          <w:tcPr>
+            <w:tcW w:type="dxa" w:w="3784"/>
+            <w:vAlign w:val="center"/>
+            <w:tcMar>
+              <w:top w:w="100" w:type="dxa"/>
+              <w:start w:w="120" w:type="dxa"/>
+              <w:bottom w:w="100" w:type="dxa"/>
+              <w:end w:w="120" w:type="dxa"/>
+            </w:tcMar>
+            <w:tcBorders>
+              <w:top w:val="single" w:sz="6" w:color="D9E1F2"/>
+              <w:left w:val="single" w:sz="6" w:color="D9E1F2"/>
+              <w:bottom w:val="single" w:sz="6" w:color="D9E1F2"/>
+              <w:right w:val="single" w:sz="6" w:color="D9E1F2"/>
+              <w:insideH w:val="single" w:sz="6" w:color="D9E1F2"/>
+              <w:insideV w:val="single" w:sz="6" w:color="D9E1F2"/>
+            </w:tcBorders>
+            <w:shd w:fill="FFFFFF"/>
+          </w:tcPr>
+          <w:p>
+            <w:pPr>
+              <w:spacing w:line="276" w:lineRule="auto" w:before="20" w:after="20"/>
+              <w:jc w:val="left"/>
+            </w:pPr>
+            <w:r>
+              <w:rPr>
+                <w:rFonts w:ascii="PingFang SC" w:hAnsi="PingFang SC" w:hint="eastAsia" w:eastAsia="PingFang SC" w:cs="PingFang SC"/>
+                <w:b w:val="0"/>
+                <w:color w:val="000000"/>
+                <w:sz w:val="21"/>
+              </w:rPr>
+              <w:t>建立工单并运行专家分析；项目无法识别时请用户确认项目，系统不代为猜测</w:t>
+            </w:r>
+          </w:p>
+        </w:tc>
+        <w:tc>
+          <w:tcPr>
+            <w:tcW w:type="dxa" w:w="3672"/>
+            <w:vAlign w:val="center"/>
+            <w:tcMar>
+              <w:top w:w="100" w:type="dxa"/>
+              <w:start w:w="120" w:type="dxa"/>
+              <w:bottom w:w="100" w:type="dxa"/>
+              <w:end w:w="120" w:type="dxa"/>
+            </w:tcMar>
+            <w:tcBorders>
+              <w:top w:val="single" w:sz="6" w:color="D9E1F2"/>
+              <w:left w:val="single" w:sz="6" w:color="D9E1F2"/>
+              <w:bottom w:val="single" w:sz="6" w:color="D9E1F2"/>
+              <w:right w:val="single" w:sz="6" w:color="D9E1F2"/>
+              <w:insideH w:val="single" w:sz="6" w:color="D9E1F2"/>
+              <w:insideV w:val="single" w:sz="6" w:color="D9E1F2"/>
+            </w:tcBorders>
+            <w:shd w:fill="FFFFFF"/>
+          </w:tcPr>
+          <w:p>
+            <w:pPr>
+              <w:spacing w:line="276" w:lineRule="auto" w:before="20" w:after="20"/>
+              <w:jc w:val="left"/>
+            </w:pPr>
+            <w:r>
+              <w:rPr>
+                <w:rFonts w:ascii="PingFang SC" w:hAnsi="PingFang SC" w:hint="eastAsia" w:eastAsia="PingFang SC" w:cs="PingFang SC"/>
+                <w:b w:val="0"/>
+                <w:color w:val="000000"/>
+                <w:sz w:val="21"/>
+              </w:rPr>
+              <w:t>结论卡、处置计划、可展开的依据和处理过程</w:t>
+            </w:r>
+          </w:p>
+        </w:tc>
+      </w:tr>
+      <w:tr>
+        <w:trPr>
+          <w:cantSplit/>
+        </w:trPr>
+        <w:tc>
+          <w:tcPr>
+            <w:tcW w:type="dxa" w:w="1184"/>
+            <w:vAlign w:val="center"/>
+            <w:tcMar>
+              <w:top w:w="100" w:type="dxa"/>
+              <w:start w:w="120" w:type="dxa"/>
+              <w:bottom w:w="100" w:type="dxa"/>
+              <w:end w:w="120" w:type="dxa"/>
+            </w:tcMar>
+            <w:tcBorders>
+              <w:top w:val="single" w:sz="6" w:color="D9E1F2"/>
+              <w:left w:val="single" w:sz="6" w:color="D9E1F2"/>
+              <w:bottom w:val="single" w:sz="6" w:color="D9E1F2"/>
+              <w:right w:val="single" w:sz="6" w:color="D9E1F2"/>
+              <w:insideH w:val="single" w:sz="6" w:color="D9E1F2"/>
+              <w:insideV w:val="single" w:sz="6" w:color="D9E1F2"/>
+            </w:tcBorders>
+            <w:shd w:fill="EAF2F8"/>
+          </w:tcPr>
+          <w:p>
+            <w:pPr>
+              <w:spacing w:line="276" w:lineRule="auto" w:before="20" w:after="20"/>
+              <w:jc w:val="center"/>
+            </w:pPr>
+            <w:r>
+              <w:rPr>
+                <w:rFonts w:ascii="PingFang SC" w:hAnsi="PingFang SC" w:hint="eastAsia" w:eastAsia="PingFang SC" w:cs="PingFang SC"/>
+                <w:b w:val="0"/>
+                <w:color w:val="000000"/>
+                <w:sz w:val="21"/>
+              </w:rPr>
+              <w:t>法规或要求问题</w:t>
+            </w:r>
+          </w:p>
+        </w:tc>
+        <w:tc>
+          <w:tcPr>
+            <w:tcW w:type="dxa" w:w="3784"/>
+            <w:vAlign w:val="center"/>
+            <w:tcMar>
+              <w:top w:w="100" w:type="dxa"/>
+              <w:start w:w="120" w:type="dxa"/>
+              <w:bottom w:w="100" w:type="dxa"/>
+              <w:end w:w="120" w:type="dxa"/>
+            </w:tcMar>
+            <w:tcBorders>
+              <w:top w:val="single" w:sz="6" w:color="D9E1F2"/>
+              <w:left w:val="single" w:sz="6" w:color="D9E1F2"/>
+              <w:bottom w:val="single" w:sz="6" w:color="D9E1F2"/>
+              <w:right w:val="single" w:sz="6" w:color="D9E1F2"/>
+              <w:insideH w:val="single" w:sz="6" w:color="D9E1F2"/>
+              <w:insideV w:val="single" w:sz="6" w:color="D9E1F2"/>
+            </w:tcBorders>
+            <w:shd w:fill="EAF2F8"/>
+          </w:tcPr>
+          <w:p>
+            <w:pPr>
+              <w:spacing w:line="276" w:lineRule="auto" w:before="20" w:after="20"/>
+              <w:jc w:val="left"/>
+            </w:pPr>
+            <w:r>
+              <w:rPr>
+                <w:rFonts w:ascii="PingFang SC" w:hAnsi="PingFang SC" w:hint="eastAsia" w:eastAsia="PingFang SC" w:cs="PingFang SC"/>
+                <w:b w:val="0"/>
+                <w:color w:val="000000"/>
+                <w:sz w:val="21"/>
+              </w:rPr>
+              <w:t>确定性检索后由模型依据来源组织回答</w:t>
+            </w:r>
+          </w:p>
+        </w:tc>
+        <w:tc>
+          <w:tcPr>
+            <w:tcW w:type="dxa" w:w="3672"/>
+            <w:vAlign w:val="center"/>
+            <w:tcMar>
+              <w:top w:w="100" w:type="dxa"/>
+              <w:start w:w="120" w:type="dxa"/>
+              <w:bottom w:w="100" w:type="dxa"/>
+              <w:end w:w="120" w:type="dxa"/>
+            </w:tcMar>
+            <w:tcBorders>
+              <w:top w:val="single" w:sz="6" w:color="D9E1F2"/>
+              <w:left w:val="single" w:sz="6" w:color="D9E1F2"/>
+              <w:bottom w:val="single" w:sz="6" w:color="D9E1F2"/>
+              <w:right w:val="single" w:sz="6" w:color="D9E1F2"/>
+              <w:insideH w:val="single" w:sz="6" w:color="D9E1F2"/>
+              <w:insideV w:val="single" w:sz="6" w:color="D9E1F2"/>
+            </w:tcBorders>
+            <w:shd w:fill="EAF2F8"/>
+          </w:tcPr>
+          <w:p>
+            <w:pPr>
+              <w:spacing w:line="276" w:lineRule="auto" w:before="20" w:after="20"/>
+              <w:jc w:val="left"/>
+            </w:pPr>
+            <w:r>
+              <w:rPr>
+                <w:rFonts w:ascii="PingFang SC" w:hAnsi="PingFang SC" w:hint="eastAsia" w:eastAsia="PingFang SC" w:cs="PingFang SC"/>
+                <w:b w:val="0"/>
+                <w:color w:val="000000"/>
+                <w:sz w:val="21"/>
+              </w:rPr>
+              <w:t>逐句引用；来源卡片展开显示条文、主管机关、版本、复核日期和官方链接</w:t>
+            </w:r>
+          </w:p>
+        </w:tc>
+      </w:tr>
+      <w:tr>
+        <w:trPr>
+          <w:cantSplit/>
+        </w:trPr>
+        <w:tc>
+          <w:tcPr>
+            <w:tcW w:type="dxa" w:w="1184"/>
+            <w:vAlign w:val="center"/>
+            <w:tcMar>
+              <w:top w:w="100" w:type="dxa"/>
+              <w:start w:w="120" w:type="dxa"/>
+              <w:bottom w:w="100" w:type="dxa"/>
+              <w:end w:w="120" w:type="dxa"/>
+            </w:tcMar>
+            <w:tcBorders>
+              <w:top w:val="single" w:sz="6" w:color="D9E1F2"/>
+              <w:left w:val="single" w:sz="6" w:color="D9E1F2"/>
+              <w:bottom w:val="single" w:sz="6" w:color="D9E1F2"/>
+              <w:right w:val="single" w:sz="6" w:color="D9E1F2"/>
+              <w:insideH w:val="single" w:sz="6" w:color="D9E1F2"/>
+              <w:insideV w:val="single" w:sz="6" w:color="D9E1F2"/>
+            </w:tcBorders>
+            <w:shd w:fill="FFFFFF"/>
+          </w:tcPr>
+          <w:p>
+            <w:pPr>
+              <w:spacing w:line="276" w:lineRule="auto" w:before="20" w:after="20"/>
+              <w:jc w:val="center"/>
+            </w:pPr>
+            <w:r>
+              <w:rPr>
+                <w:rFonts w:ascii="PingFang SC" w:hAnsi="PingFang SC" w:hint="eastAsia" w:eastAsia="PingFang SC" w:cs="PingFang SC"/>
+                <w:b w:val="0"/>
+                <w:color w:val="000000"/>
+                <w:sz w:val="21"/>
+              </w:rPr>
+              <w:t>追问已有工单</w:t>
+            </w:r>
+          </w:p>
+        </w:tc>
+        <w:tc>
+          <w:tcPr>
+            <w:tcW w:type="dxa" w:w="3784"/>
+            <w:vAlign w:val="center"/>
+            <w:tcMar>
+              <w:top w:w="100" w:type="dxa"/>
+              <w:start w:w="120" w:type="dxa"/>
+              <w:bottom w:w="100" w:type="dxa"/>
+              <w:end w:w="120" w:type="dxa"/>
+            </w:tcMar>
+            <w:tcBorders>
+              <w:top w:val="single" w:sz="6" w:color="D9E1F2"/>
+              <w:left w:val="single" w:sz="6" w:color="D9E1F2"/>
+              <w:bottom w:val="single" w:sz="6" w:color="D9E1F2"/>
+              <w:right w:val="single" w:sz="6" w:color="D9E1F2"/>
+              <w:insideH w:val="single" w:sz="6" w:color="D9E1F2"/>
+              <w:insideV w:val="single" w:sz="6" w:color="D9E1F2"/>
+            </w:tcBorders>
+            <w:shd w:fill="FFFFFF"/>
+          </w:tcPr>
+          <w:p>
+            <w:pPr>
+              <w:spacing w:line="276" w:lineRule="auto" w:before="20" w:after="20"/>
+              <w:jc w:val="center"/>
+            </w:pPr>
+            <w:r>
+              <w:rPr>
+                <w:rFonts w:ascii="PingFang SC" w:hAnsi="PingFang SC" w:hint="eastAsia" w:eastAsia="PingFang SC" w:cs="PingFang SC"/>
+                <w:b w:val="0"/>
+                <w:color w:val="000000"/>
+                <w:sz w:val="21"/>
+              </w:rPr>
+              <w:t>结合对话上下文定位工单</w:t>
+            </w:r>
+          </w:p>
+        </w:tc>
+        <w:tc>
+          <w:tcPr>
+            <w:tcW w:type="dxa" w:w="3672"/>
+            <w:vAlign w:val="center"/>
+            <w:tcMar>
+              <w:top w:w="100" w:type="dxa"/>
+              <w:start w:w="120" w:type="dxa"/>
+              <w:bottom w:w="100" w:type="dxa"/>
+              <w:end w:w="120" w:type="dxa"/>
+            </w:tcMar>
+            <w:tcBorders>
+              <w:top w:val="single" w:sz="6" w:color="D9E1F2"/>
+              <w:left w:val="single" w:sz="6" w:color="D9E1F2"/>
+              <w:bottom w:val="single" w:sz="6" w:color="D9E1F2"/>
+              <w:right w:val="single" w:sz="6" w:color="D9E1F2"/>
+              <w:insideH w:val="single" w:sz="6" w:color="D9E1F2"/>
+              <w:insideV w:val="single" w:sz="6" w:color="D9E1F2"/>
+            </w:tcBorders>
+            <w:shd w:fill="FFFFFF"/>
+          </w:tcPr>
+          <w:p>
+            <w:pPr>
+              <w:spacing w:line="276" w:lineRule="auto" w:before="20" w:after="20"/>
+              <w:jc w:val="center"/>
+            </w:pPr>
+            <w:r>
+              <w:rPr>
+                <w:rFonts w:ascii="PingFang SC" w:hAnsi="PingFang SC" w:hint="eastAsia" w:eastAsia="PingFang SC" w:cs="PingFang SC"/>
+                <w:b w:val="0"/>
+                <w:color w:val="000000"/>
+                <w:sz w:val="21"/>
+              </w:rPr>
+              <w:t>工单状态卡和下一步操作</w:t>
+            </w:r>
+          </w:p>
+        </w:tc>
+      </w:tr>
+      <w:tr>
+        <w:trPr>
+          <w:cantSplit/>
+        </w:trPr>
+        <w:tc>
+          <w:tcPr>
+            <w:tcW w:type="dxa" w:w="1184"/>
+            <w:vAlign w:val="center"/>
+            <w:tcMar>
+              <w:top w:w="100" w:type="dxa"/>
+              <w:start w:w="120" w:type="dxa"/>
+              <w:bottom w:w="100" w:type="dxa"/>
+              <w:end w:w="120" w:type="dxa"/>
+            </w:tcMar>
+            <w:tcBorders>
+              <w:top w:val="single" w:sz="6" w:color="D9E1F2"/>
+              <w:left w:val="single" w:sz="6" w:color="D9E1F2"/>
+              <w:bottom w:val="single" w:sz="6" w:color="D9E1F2"/>
+              <w:right w:val="single" w:sz="6" w:color="D9E1F2"/>
+              <w:insideH w:val="single" w:sz="6" w:color="D9E1F2"/>
+              <w:insideV w:val="single" w:sz="6" w:color="D9E1F2"/>
+            </w:tcBorders>
+            <w:shd w:fill="EAF2F8"/>
+          </w:tcPr>
+          <w:p>
+            <w:pPr>
+              <w:spacing w:line="276" w:lineRule="auto" w:before="20" w:after="20"/>
+              <w:jc w:val="center"/>
+            </w:pPr>
+            <w:r>
+              <w:rPr>
+                <w:rFonts w:ascii="PingFang SC" w:hAnsi="PingFang SC" w:hint="eastAsia" w:eastAsia="PingFang SC" w:cs="PingFang SC"/>
+                <w:b w:val="0"/>
+                <w:color w:val="000000"/>
+                <w:sz w:val="21"/>
+              </w:rPr>
+              <w:t>项目进展、待审批</w:t>
+            </w:r>
+          </w:p>
+        </w:tc>
+        <w:tc>
+          <w:tcPr>
+            <w:tcW w:type="dxa" w:w="3784"/>
+            <w:vAlign w:val="center"/>
+            <w:tcMar>
+              <w:top w:w="100" w:type="dxa"/>
+              <w:start w:w="120" w:type="dxa"/>
+              <w:bottom w:w="100" w:type="dxa"/>
+              <w:end w:w="120" w:type="dxa"/>
+            </w:tcMar>
+            <w:tcBorders>
+              <w:top w:val="single" w:sz="6" w:color="D9E1F2"/>
+              <w:left w:val="single" w:sz="6" w:color="D9E1F2"/>
+              <w:bottom w:val="single" w:sz="6" w:color="D9E1F2"/>
+              <w:right w:val="single" w:sz="6" w:color="D9E1F2"/>
+              <w:insideH w:val="single" w:sz="6" w:color="D9E1F2"/>
+              <w:insideV w:val="single" w:sz="6" w:color="D9E1F2"/>
+            </w:tcBorders>
+            <w:shd w:fill="EAF2F8"/>
+          </w:tcPr>
+          <w:p>
+            <w:pPr>
+              <w:spacing w:line="276" w:lineRule="auto" w:before="20" w:after="20"/>
+              <w:jc w:val="left"/>
+            </w:pPr>
+            <w:r>
+              <w:rPr>
+                <w:rFonts w:ascii="PingFang SC" w:hAnsi="PingFang SC" w:hint="eastAsia" w:eastAsia="PingFang SC" w:cs="PingFang SC"/>
+                <w:b w:val="0"/>
+                <w:color w:val="000000"/>
+                <w:sz w:val="21"/>
+              </w:rPr>
+              <w:t>汇总项目进度、工期偏差、下一关口和待审批事项</w:t>
+            </w:r>
+          </w:p>
+        </w:tc>
+        <w:tc>
+          <w:tcPr>
+            <w:tcW w:type="dxa" w:w="3672"/>
+            <w:vAlign w:val="center"/>
+            <w:tcMar>
+              <w:top w:w="100" w:type="dxa"/>
+              <w:start w:w="120" w:type="dxa"/>
+              <w:bottom w:w="100" w:type="dxa"/>
+              <w:end w:w="120" w:type="dxa"/>
+            </w:tcMar>
+            <w:tcBorders>
+              <w:top w:val="single" w:sz="6" w:color="D9E1F2"/>
+              <w:left w:val="single" w:sz="6" w:color="D9E1F2"/>
+              <w:bottom w:val="single" w:sz="6" w:color="D9E1F2"/>
+              <w:right w:val="single" w:sz="6" w:color="D9E1F2"/>
+              <w:insideH w:val="single" w:sz="6" w:color="D9E1F2"/>
+              <w:insideV w:val="single" w:sz="6" w:color="D9E1F2"/>
+            </w:tcBorders>
+            <w:shd w:fill="EAF2F8"/>
+          </w:tcPr>
+          <w:p>
+            <w:pPr>
+              <w:spacing w:line="276" w:lineRule="auto" w:before="20" w:after="20"/>
+              <w:jc w:val="center"/>
+            </w:pPr>
+            <w:r>
+              <w:rPr>
+                <w:rFonts w:ascii="PingFang SC" w:hAnsi="PingFang SC" w:hint="eastAsia" w:eastAsia="PingFang SC" w:cs="PingFang SC"/>
+                <w:b w:val="0"/>
+                <w:color w:val="000000"/>
+                <w:sz w:val="21"/>
+              </w:rPr>
+              <w:t>进度卡片和审批按钮</w:t>
+            </w:r>
+          </w:p>
+        </w:tc>
+      </w:tr>
+      <w:tr>
+        <w:trPr>
+          <w:cantSplit/>
+        </w:trPr>
+        <w:tc>
+          <w:tcPr>
+            <w:tcW w:type="dxa" w:w="1184"/>
+            <w:vAlign w:val="center"/>
+            <w:tcMar>
+              <w:top w:w="100" w:type="dxa"/>
+              <w:start w:w="120" w:type="dxa"/>
+              <w:bottom w:w="100" w:type="dxa"/>
+              <w:end w:w="120" w:type="dxa"/>
+            </w:tcMar>
+            <w:tcBorders>
+              <w:top w:val="single" w:sz="6" w:color="D9E1F2"/>
+              <w:left w:val="single" w:sz="6" w:color="D9E1F2"/>
+              <w:bottom w:val="single" w:sz="6" w:color="D9E1F2"/>
+              <w:right w:val="single" w:sz="6" w:color="D9E1F2"/>
+              <w:insideH w:val="single" w:sz="6" w:color="D9E1F2"/>
+              <w:insideV w:val="single" w:sz="6" w:color="D9E1F2"/>
+            </w:tcBorders>
+            <w:shd w:fill="FFFFFF"/>
+          </w:tcPr>
+          <w:p>
+            <w:pPr>
+              <w:spacing w:line="276" w:lineRule="auto" w:before="20" w:after="20"/>
+              <w:jc w:val="center"/>
+            </w:pPr>
+            <w:r>
+              <w:rPr>
+                <w:rFonts w:ascii="PingFang SC" w:hAnsi="PingFang SC" w:hint="eastAsia" w:eastAsia="PingFang SC" w:cs="PingFang SC"/>
+                <w:b w:val="0"/>
+                <w:color w:val="000000"/>
+                <w:sz w:val="21"/>
+              </w:rPr>
+              <w:t>审批与执行</w:t>
+            </w:r>
+          </w:p>
+        </w:tc>
+        <w:tc>
+          <w:tcPr>
+            <w:tcW w:type="dxa" w:w="3784"/>
+            <w:vAlign w:val="center"/>
+            <w:tcMar>
+              <w:top w:w="100" w:type="dxa"/>
+              <w:start w:w="120" w:type="dxa"/>
+              <w:bottom w:w="100" w:type="dxa"/>
+              <w:end w:w="120" w:type="dxa"/>
+            </w:tcMar>
+            <w:tcBorders>
+              <w:top w:val="single" w:sz="6" w:color="D9E1F2"/>
+              <w:left w:val="single" w:sz="6" w:color="D9E1F2"/>
+              <w:bottom w:val="single" w:sz="6" w:color="D9E1F2"/>
+              <w:right w:val="single" w:sz="6" w:color="D9E1F2"/>
+              <w:insideH w:val="single" w:sz="6" w:color="D9E1F2"/>
+              <w:insideV w:val="single" w:sz="6" w:color="D9E1F2"/>
+            </w:tcBorders>
+            <w:shd w:fill="FFFFFF"/>
+          </w:tcPr>
+          <w:p>
+            <w:pPr>
+              <w:spacing w:line="276" w:lineRule="auto" w:before="20" w:after="20"/>
+              <w:jc w:val="left"/>
+            </w:pPr>
+            <w:r>
+              <w:rPr>
+                <w:rFonts w:ascii="PingFang SC" w:hAnsi="PingFang SC" w:hint="eastAsia" w:eastAsia="PingFang SC" w:cs="PingFang SC"/>
+                <w:b w:val="0"/>
+                <w:color w:val="000000"/>
+                <w:sz w:val="21"/>
+              </w:rPr>
+              <w:t>用户在卡片上逐项批准、生成草稿、独立核验和关闭</w:t>
+            </w:r>
+          </w:p>
+        </w:tc>
+        <w:tc>
+          <w:tcPr>
+            <w:tcW w:type="dxa" w:w="3672"/>
+            <w:vAlign w:val="center"/>
+            <w:tcMar>
+              <w:top w:w="100" w:type="dxa"/>
+              <w:start w:w="120" w:type="dxa"/>
+              <w:bottom w:w="100" w:type="dxa"/>
+              <w:end w:w="120" w:type="dxa"/>
+            </w:tcMar>
+            <w:tcBorders>
+              <w:top w:val="single" w:sz="6" w:color="D9E1F2"/>
+              <w:left w:val="single" w:sz="6" w:color="D9E1F2"/>
+              <w:bottom w:val="single" w:sz="6" w:color="D9E1F2"/>
+              <w:right w:val="single" w:sz="6" w:color="D9E1F2"/>
+              <w:insideH w:val="single" w:sz="6" w:color="D9E1F2"/>
+              <w:insideV w:val="single" w:sz="6" w:color="D9E1F2"/>
+            </w:tcBorders>
+            <w:shd w:fill="FFFFFF"/>
+          </w:tcPr>
+          <w:p>
+            <w:pPr>
+              <w:spacing w:line="276" w:lineRule="auto" w:before="20" w:after="20"/>
+              <w:jc w:val="left"/>
+            </w:pPr>
+            <w:r>
+              <w:rPr>
+                <w:rFonts w:ascii="PingFang SC" w:hAnsi="PingFang SC" w:hint="eastAsia" w:eastAsia="PingFang SC" w:cs="PingFang SC"/>
+                <w:b w:val="0"/>
+                <w:color w:val="000000"/>
+                <w:sz w:val="21"/>
+              </w:rPr>
+              <w:t>回复草稿全文、执行回执和六项核验结果</w:t>
+            </w:r>
+          </w:p>
+        </w:tc>
+      </w:tr>
+    </w:tbl>
+    <w:p>
+      <w:pPr>
+        <w:spacing w:after="40"/>
+      </w:pPr>
+    </w:p>
+    <w:p>
+      <w:pPr>
+        <w:keepNext/>
+        <w:spacing w:before="160" w:after="80"/>
+        <w:jc w:val="center"/>
+      </w:pPr>
+      <w:r>
+        <w:drawing>
+          <wp:inline xmlns:a="http://schemas.openxmlformats.org/drawingml/2006/main" xmlns:pic="http://schemas.openxmlformats.org/drawingml/2006/picture">
+            <wp:extent cx="3931920" cy="2673706"/>
+            <wp:docPr id="3" name="Picture 3" descr="图 4 智能助手接收函件并建立工单" title="图 4 智能助手接收函件并建立工单"/>
+            <wp:cNvGraphicFramePr>
+              <a:graphicFrameLocks noChangeAspect="1"/>
+            </wp:cNvGraphicFramePr>
+            <a:graphic>
+              <a:graphicData uri="http://schemas.openxmlformats.org/drawingml/2006/picture">
+                <pic:pic>
+                  <pic:nvPicPr>
+                    <pic:cNvPr id="0" name="assistant-case.png"/>
+                    <pic:cNvPicPr/>
+                  </pic:nvPicPr>
+                  <pic:blipFill>
+                    <a:blip r:embed="rId11"/>
+                    <a:stretch>
+                      <a:fillRect/>
+                    </a:stretch>
+                  </pic:blipFill>
+                  <pic:spPr>
+                    <a:xfrm>
+                      <a:off x="0" y="0"/>
+                      <a:ext cx="3931920" cy="2673706"/>
+                    </a:xfrm>
+                    <a:prstGeom prst="rect"/>
+                  </pic:spPr>
+                </pic:pic>
+              </a:graphicData>
+            </a:graphic>
+          </wp:inline>
+        </w:drawing>
+      </w:r>
+    </w:p>
+    <w:p>
+      <w:pPr>
+        <w:keepNext w:val="0"/>
+        <w:spacing w:after="160"/>
+        <w:jc w:val="center"/>
+      </w:pPr>
+      <w:r>
+        <w:rPr>
+          <w:rFonts w:ascii="PingFang SC" w:hAnsi="PingFang SC" w:hint="eastAsia" w:eastAsia="PingFang SC" w:cs="PingFang SC"/>
+          <w:b w:val="0"/>
+          <w:color w:val="000000"/>
+          <w:sz w:val="24"/>
+        </w:rPr>
+        <w:t>图 4 智能助手接收函件并建立工单</w:t>
+      </w:r>
+    </w:p>
+    <w:p>
+      <w:pPr>
+        <w:keepNext/>
+        <w:spacing w:before="160" w:after="80"/>
+        <w:jc w:val="center"/>
+      </w:pPr>
+      <w:r>
+        <w:drawing>
+          <wp:inline xmlns:a="http://schemas.openxmlformats.org/drawingml/2006/main" xmlns:pic="http://schemas.openxmlformats.org/drawingml/2006/picture">
+            <wp:extent cx="3931920" cy="3049695"/>
+            <wp:docPr id="4" name="Picture 4" descr="图 5 法规问答的逐句引用与可展开来源卡片" title="图 5 法规问答的逐句引用与可展开来源卡片"/>
+            <wp:cNvGraphicFramePr>
+              <a:graphicFrameLocks noChangeAspect="1"/>
+            </wp:cNvGraphicFramePr>
+            <a:graphic>
+              <a:graphicData uri="http://schemas.openxmlformats.org/drawingml/2006/picture">
+                <pic:pic>
+                  <pic:nvPicPr>
+                    <pic:cNvPr id="0" name="assistant-regulation.png"/>
+                    <pic:cNvPicPr/>
+                  </pic:nvPicPr>
+                  <pic:blipFill>
+                    <a:blip r:embed="rId12"/>
+                    <a:stretch>
+                      <a:fillRect/>
+                    </a:stretch>
+                  </pic:blipFill>
+                  <pic:spPr>
+                    <a:xfrm>
+                      <a:off x="0" y="0"/>
+                      <a:ext cx="3931920" cy="3049695"/>
+                    </a:xfrm>
+                    <a:prstGeom prst="rect"/>
+                  </pic:spPr>
+                </pic:pic>
+              </a:graphicData>
+            </a:graphic>
+          </wp:inline>
+        </w:drawing>
+      </w:r>
+    </w:p>
+    <w:p>
+      <w:pPr>
+        <w:keepNext w:val="0"/>
+        <w:spacing w:after="160"/>
+        <w:jc w:val="center"/>
+      </w:pPr>
+      <w:r>
+        <w:rPr>
+          <w:rFonts w:ascii="PingFang SC" w:hAnsi="PingFang SC" w:hint="eastAsia" w:eastAsia="PingFang SC" w:cs="PingFang SC"/>
+          <w:b w:val="0"/>
+          <w:color w:val="000000"/>
+          <w:sz w:val="24"/>
+        </w:rPr>
+        <w:t>图 5 法规问答的逐句引用与可展开来源卡片</w:t>
+      </w:r>
+    </w:p>
+    <w:p>
+      <w:pPr>
+        <w:keepNext/>
+        <w:spacing w:before="160" w:after="80"/>
+        <w:jc w:val="center"/>
+      </w:pPr>
+      <w:r>
+        <w:drawing>
+          <wp:inline xmlns:a="http://schemas.openxmlformats.org/drawingml/2006/main" xmlns:pic="http://schemas.openxmlformats.org/drawingml/2006/picture">
+            <wp:extent cx="3931920" cy="3049695"/>
+            <wp:docPr id="5" name="Picture 5" descr="图 6 全部审批后由大模型起草并标注引用的回复草稿" title="图 6 全部审批后由大模型起草并标注引用的回复草稿"/>
+            <wp:cNvGraphicFramePr>
+              <a:graphicFrameLocks noChangeAspect="1"/>
+            </wp:cNvGraphicFramePr>
+            <a:graphic>
+              <a:graphicData uri="http://schemas.openxmlformats.org/drawingml/2006/picture">
+                <pic:pic>
+                  <pic:nvPicPr>
+                    <pic:cNvPr id="0" name="assistant-draft.png"/>
+                    <pic:cNvPicPr/>
+                  </pic:nvPicPr>
+                  <pic:blipFill>
+                    <a:blip r:embed="rId13"/>
+                    <a:stretch>
+                      <a:fillRect/>
+                    </a:stretch>
+                  </pic:blipFill>
+                  <pic:spPr>
+                    <a:xfrm>
+                      <a:off x="0" y="0"/>
+                      <a:ext cx="3931920" cy="3049695"/>
+                    </a:xfrm>
+                    <a:prstGeom prst="rect"/>
+                  </pic:spPr>
+                </pic:pic>
+              </a:graphicData>
+            </a:graphic>
+          </wp:inline>
+        </w:drawing>
+      </w:r>
+    </w:p>
+    <w:p>
+      <w:pPr>
+        <w:keepNext w:val="0"/>
+        <w:spacing w:after="160"/>
+        <w:jc w:val="center"/>
+      </w:pPr>
+      <w:r>
+        <w:rPr>
+          <w:rFonts w:ascii="PingFang SC" w:hAnsi="PingFang SC" w:hint="eastAsia" w:eastAsia="PingFang SC" w:cs="PingFang SC"/>
+          <w:b w:val="0"/>
+          <w:color w:val="000000"/>
+          <w:sz w:val="24"/>
+        </w:rPr>
+        <w:t>图 6 全部审批后由大模型起草并标注引用的回复草稿</w:t>
+      </w:r>
+    </w:p>
+    <w:p>
+      <w:pPr>
+        <w:keepNext/>
+        <w:widowControl/>
+        <w:spacing w:before="200" w:after="80" w:line="324" w:lineRule="auto"/>
+        <w:ind w:firstLine="642"/>
+        <w:jc w:val="both"/>
+      </w:pPr>
+      <w:r>
+        <w:rPr>
+          <w:rFonts w:ascii="PingFang SC" w:hAnsi="PingFang SC" w:hint="eastAsia" w:eastAsia="PingFang SC" w:cs="PingFang SC"/>
+          <w:b/>
+          <w:color w:val="000000"/>
+          <w:sz w:val="30"/>
+        </w:rPr>
+        <w:t>二 七步黄金主线</w:t>
       </w:r>
     </w:p>
     <w:tbl>
@@ -6214,7 +8014,7 @@
           <w:color w:val="000000"/>
           <w:sz w:val="30"/>
         </w:rPr>
-        <w:t>二 项目组合与全生命周期工作台</w:t>
+        <w:t>三 项目组合与全生命周期工作台</w:t>
       </w:r>
     </w:p>
     <w:p>
@@ -6231,7 +8031,7 @@
           <w:color w:val="000000"/>
           <w:sz w:val="30"/>
         </w:rPr>
-        <w:t>指挥中心汇总项目组合、国家、风险、待审批和经核验决策。项目工作台按生命周期显示阶段关口、专业健康和优先工单。用户可以从组合异常进入项目，再进入工单、证据、Twin ID 和执行回执，不需要在多个系统中手工拼接上下文。</w:t>
+        <w:t>指挥中心（全景页）汇总项目组合、国家、风险、待审批和经核验决策。项目工作台按生命周期显示阶段关口、专业健康和优先工单。用户可以从组合异常进入项目，再进入工单、证据、Twin ID 和执行回执，不需要在多个系统中手工拼接上下文。</w:t>
       </w:r>
     </w:p>
     <w:p>
@@ -6249,7 +8049,7 @@
           <w:color w:val="000000"/>
           <w:sz w:val="30"/>
         </w:rPr>
-        <w:t>三 现场移动端</w:t>
+        <w:t>四 现场移动端</w:t>
       </w:r>
     </w:p>
     <w:p>
@@ -6284,7 +8084,7 @@
           <w:color w:val="000000"/>
           <w:sz w:val="30"/>
         </w:rPr>
-        <w:t>四 国家包 知识库和培训</w:t>
+        <w:t>五 国家包 知识库和培训</w:t>
       </w:r>
     </w:p>
     <w:p>
@@ -6319,7 +8119,7 @@
           <w:color w:val="000000"/>
           <w:sz w:val="30"/>
         </w:rPr>
-        <w:t>五 数字孪生与运营场景</w:t>
+        <w:t>六 数字孪生与运营场景</w:t>
       </w:r>
     </w:p>
     <w:p>
@@ -6372,7 +8172,7 @@
           <w:color w:val="000000"/>
           <w:sz w:val="30"/>
         </w:rPr>
-        <w:t>六 管理与可观测能力</w:t>
+        <w:t>七 管理与可观测能力</w:t>
       </w:r>
     </w:p>
     <w:p>
@@ -6574,6 +8374,23 @@
     </w:p>
     <w:p>
       <w:pPr>
+        <w:widowControl/>
+        <w:spacing w:line="348" w:lineRule="auto" w:after="0"/>
+        <w:ind w:firstLine="639"/>
+        <w:jc w:val="both"/>
+      </w:pPr>
+      <w:r>
+        <w:rPr>
+          <w:rFonts w:ascii="PingFang SC" w:hAnsi="PingFang SC" w:hint="eastAsia" w:eastAsia="PingFang SC" w:cs="PingFang SC"/>
+          <w:b w:val="0"/>
+          <w:color w:val="000000"/>
+          <w:sz w:val="30"/>
+        </w:rPr>
+        <w:t>2026 年 10 月 15 日，智能助手在线上使用云端 OpenAI 兼容模型完成人工核查：对「你能做什么」「明天吉隆坡天气」和「帮我批准所有待审批事项」分别给出能力说明、范围外说明和待审批清单，未代为批准；「印尼那个高速项目进度如何」被定位到 ID HWY B；马来西亚高处作业问题的回答逐句引用 MY-HSE-WAH-01 与 MY-DOSH-OSHA，并可打开 DOSH 官方来源。使用一份合成的分包商变更申请函时，单次实测建工单约 12 秒、审批后起草回复约 16 秒；回复确认收函、要求补充书面指令和计价资料、保留合同权利，未知信息以 [●] 占位，独立核验六项全部通过。以上为单次线上核查，不代表统计意义上的延迟或准确率。</w:t>
+      </w:r>
+    </w:p>
+    <w:p>
+      <w:pPr>
         <w:keepNext/>
         <w:spacing w:before="160" w:after="80"/>
         <w:jc w:val="center"/>
@@ -6582,7 +8399,7 @@
         <w:drawing>
           <wp:inline xmlns:a="http://schemas.openxmlformats.org/drawingml/2006/main" xmlns:pic="http://schemas.openxmlformats.org/drawingml/2006/picture">
             <wp:extent cx="5349240" cy="3008948"/>
-            <wp:docPr id="3" name="Picture 3" descr="图 3 线上阶段 9.1 参赛证据页" title="图 3 线上阶段 9.1 参赛证据页"/>
+            <wp:docPr id="6" name="Picture 6" descr="图 3 线上阶段 9.1 参赛证据页" title="图 3 线上阶段 9.1 参赛证据页"/>
             <wp:cNvGraphicFramePr>
               <a:graphicFrameLocks noChangeAspect="1"/>
             </wp:cNvGraphicFramePr>
@@ -6594,7 +8411,7 @@
                     <pic:cNvPicPr/>
                   </pic:nvPicPr>
                   <pic:blipFill>
-                    <a:blip r:embed="rId11"/>
+                    <a:blip r:embed="rId14"/>
                     <a:stretch>
                       <a:fillRect/>
                     </a:stretch>
@@ -9105,7 +10922,7 @@
           <w:color w:val="000000"/>
           <w:sz w:val="30"/>
         </w:rPr>
-        <w:t xml:space="preserve">API 自动化测试共 165 项并通过；Web 生产构建通过；三套评测脚本通过；数据库从空库升级到最新版本并通过模型一致性检查；Docker Compose 全栈启动后，对健康检查、接入、数字孪生、评测、黄金主线和主要页面执行烟测。GitHub Actions 运行 </w:t>
+        <w:t xml:space="preserve">API 自动化测试共 207 项并通过，其中包括智能助手规划与引用校验 24 项、回复起草与标题解析 8 项、项目归属确认和限流回归测试；Web 生产构建通过；三套评测脚本通过；数据库从空库升级到最新版本并通过模型一致性检查；Docker Compose 全栈启动后，对健康检查、接入、数字孪生、评测、黄金主线和主要页面执行烟测。GitHub Actions 运行 </w:t>
       </w:r>
       <w:r>
         <w:rPr>
@@ -9114,7 +10931,7 @@
           <w:color w:val="000000"/>
           <w:sz w:val="21"/>
         </w:rPr>
-        <w:t>38570085404</w:t>
+        <w:t>38658264378</w:t>
       </w:r>
       <w:r>
         <w:rPr>
@@ -9163,7 +10980,7 @@
         </w:trPr>
         <w:tc>
           <w:tcPr>
-            <w:tcW w:type="dxa" w:w="1403"/>
+            <w:tcW w:type="dxa" w:w="1441"/>
             <w:vAlign w:val="center"/>
             <w:tcMar>
               <w:top w:w="100" w:type="dxa"/>
@@ -9199,7 +11016,7 @@
         </w:tc>
         <w:tc>
           <w:tcPr>
-            <w:tcW w:type="dxa" w:w="2625"/>
+            <w:tcW w:type="dxa" w:w="2462"/>
             <w:vAlign w:val="center"/>
             <w:tcMar>
               <w:top w:w="100" w:type="dxa"/>
@@ -9235,7 +11052,7 @@
         </w:tc>
         <w:tc>
           <w:tcPr>
-            <w:tcW w:type="dxa" w:w="4611"/>
+            <w:tcW w:type="dxa" w:w="4736"/>
             <w:vAlign w:val="center"/>
             <w:tcMar>
               <w:top w:w="100" w:type="dxa"/>
@@ -9276,7 +11093,7 @@
         </w:trPr>
         <w:tc>
           <w:tcPr>
-            <w:tcW w:type="dxa" w:w="1403"/>
+            <w:tcW w:type="dxa" w:w="1441"/>
             <w:vAlign w:val="center"/>
             <w:tcMar>
               <w:top w:w="100" w:type="dxa"/>
@@ -9312,7 +11129,7 @@
         </w:tc>
         <w:tc>
           <w:tcPr>
-            <w:tcW w:type="dxa" w:w="2625"/>
+            <w:tcW w:type="dxa" w:w="2462"/>
             <w:vAlign w:val="center"/>
             <w:tcMar>
               <w:top w:w="100" w:type="dxa"/>
@@ -9348,7 +11165,7 @@
         </w:tc>
         <w:tc>
           <w:tcPr>
-            <w:tcW w:type="dxa" w:w="4611"/>
+            <w:tcW w:type="dxa" w:w="4736"/>
             <w:vAlign w:val="center"/>
             <w:tcMar>
               <w:top w:w="100" w:type="dxa"/>
@@ -9389,7 +11206,7 @@
         </w:trPr>
         <w:tc>
           <w:tcPr>
-            <w:tcW w:type="dxa" w:w="1403"/>
+            <w:tcW w:type="dxa" w:w="1441"/>
             <w:vAlign w:val="center"/>
             <w:tcMar>
               <w:top w:w="100" w:type="dxa"/>
@@ -9425,7 +11242,7 @@
         </w:tc>
         <w:tc>
           <w:tcPr>
-            <w:tcW w:type="dxa" w:w="2625"/>
+            <w:tcW w:type="dxa" w:w="2462"/>
             <w:vAlign w:val="center"/>
             <w:tcMar>
               <w:top w:w="100" w:type="dxa"/>
@@ -9461,7 +11278,7 @@
         </w:tc>
         <w:tc>
           <w:tcPr>
-            <w:tcW w:type="dxa" w:w="4611"/>
+            <w:tcW w:type="dxa" w:w="4736"/>
             <w:vAlign w:val="center"/>
             <w:tcMar>
               <w:top w:w="100" w:type="dxa"/>
@@ -9502,7 +11319,7 @@
         </w:trPr>
         <w:tc>
           <w:tcPr>
-            <w:tcW w:type="dxa" w:w="1403"/>
+            <w:tcW w:type="dxa" w:w="1441"/>
             <w:vAlign w:val="center"/>
             <w:tcMar>
               <w:top w:w="100" w:type="dxa"/>
@@ -9538,7 +11355,7 @@
         </w:tc>
         <w:tc>
           <w:tcPr>
-            <w:tcW w:type="dxa" w:w="2625"/>
+            <w:tcW w:type="dxa" w:w="2462"/>
             <w:vAlign w:val="center"/>
             <w:tcMar>
               <w:top w:w="100" w:type="dxa"/>
@@ -9574,7 +11391,7 @@
         </w:tc>
         <w:tc>
           <w:tcPr>
-            <w:tcW w:type="dxa" w:w="4611"/>
+            <w:tcW w:type="dxa" w:w="4736"/>
             <w:vAlign w:val="center"/>
             <w:tcMar>
               <w:top w:w="100" w:type="dxa"/>
@@ -9615,7 +11432,7 @@
         </w:trPr>
         <w:tc>
           <w:tcPr>
-            <w:tcW w:type="dxa" w:w="1403"/>
+            <w:tcW w:type="dxa" w:w="1441"/>
             <w:vAlign w:val="center"/>
             <w:tcMar>
               <w:top w:w="100" w:type="dxa"/>
@@ -9651,7 +11468,7 @@
         </w:tc>
         <w:tc>
           <w:tcPr>
-            <w:tcW w:type="dxa" w:w="2625"/>
+            <w:tcW w:type="dxa" w:w="2462"/>
             <w:vAlign w:val="center"/>
             <w:tcMar>
               <w:top w:w="100" w:type="dxa"/>
@@ -9687,7 +11504,7 @@
         </w:tc>
         <w:tc>
           <w:tcPr>
-            <w:tcW w:type="dxa" w:w="4611"/>
+            <w:tcW w:type="dxa" w:w="4736"/>
             <w:vAlign w:val="center"/>
             <w:tcMar>
               <w:top w:w="100" w:type="dxa"/>
@@ -9728,7 +11545,7 @@
         </w:trPr>
         <w:tc>
           <w:tcPr>
-            <w:tcW w:type="dxa" w:w="1403"/>
+            <w:tcW w:type="dxa" w:w="1441"/>
             <w:vAlign w:val="center"/>
             <w:tcMar>
               <w:top w:w="100" w:type="dxa"/>
@@ -9758,13 +11575,13 @@
                 <w:color w:val="000000"/>
                 <w:sz w:val="21"/>
               </w:rPr>
-              <w:t>数字孪生</w:t>
-            </w:r>
-          </w:p>
-        </w:tc>
-        <w:tc>
-          <w:tcPr>
-            <w:tcW w:type="dxa" w:w="2625"/>
+              <w:t>函件答复</w:t>
+            </w:r>
+          </w:p>
+        </w:tc>
+        <w:tc>
+          <w:tcPr>
+            <w:tcW w:type="dxa" w:w="2462"/>
             <w:vAlign w:val="center"/>
             <w:tcMar>
               <w:top w:w="100" w:type="dxa"/>
@@ -9794,13 +11611,13 @@
                 <w:color w:val="000000"/>
                 <w:sz w:val="21"/>
               </w:rPr>
-              <w:t>模型浏览与业务记录分开</w:t>
-            </w:r>
-          </w:p>
-        </w:tc>
-        <w:tc>
-          <w:tcPr>
-            <w:tcW w:type="dxa" w:w="4611"/>
+              <w:t>人工反复查条款后起草</w:t>
+            </w:r>
+          </w:p>
+        </w:tc>
+        <w:tc>
+          <w:tcPr>
+            <w:tcW w:type="dxa" w:w="4736"/>
             <w:vAlign w:val="center"/>
             <w:tcMar>
               <w:top w:w="100" w:type="dxa"/>
@@ -9830,7 +11647,7 @@
                 <w:color w:val="000000"/>
                 <w:sz w:val="21"/>
               </w:rPr>
-              <w:t>Twin ID 连接模型、事件、进度、成本和运营数据</w:t>
+              <w:t>审批后由模型依据来函和已引用证据起草，引用越界自动退回模板</w:t>
             </w:r>
           </w:p>
         </w:tc>
@@ -9841,7 +11658,7 @@
         </w:trPr>
         <w:tc>
           <w:tcPr>
-            <w:tcW w:type="dxa" w:w="1403"/>
+            <w:tcW w:type="dxa" w:w="1441"/>
             <w:vAlign w:val="center"/>
             <w:tcMar>
               <w:top w:w="100" w:type="dxa"/>
@@ -9871,13 +11688,239 @@
                 <w:color w:val="000000"/>
                 <w:sz w:val="21"/>
               </w:rPr>
+              <w:t>系统使用门槛</w:t>
+            </w:r>
+          </w:p>
+        </w:tc>
+        <w:tc>
+          <w:tcPr>
+            <w:tcW w:type="dxa" w:w="2462"/>
+            <w:vAlign w:val="center"/>
+            <w:tcMar>
+              <w:top w:w="100" w:type="dxa"/>
+              <w:start w:w="120" w:type="dxa"/>
+              <w:bottom w:w="100" w:type="dxa"/>
+              <w:end w:w="120" w:type="dxa"/>
+            </w:tcMar>
+            <w:tcBorders>
+              <w:top w:val="single" w:sz="6" w:color="D9E1F2"/>
+              <w:left w:val="single" w:sz="6" w:color="D9E1F2"/>
+              <w:bottom w:val="single" w:sz="6" w:color="D9E1F2"/>
+              <w:right w:val="single" w:sz="6" w:color="D9E1F2"/>
+              <w:insideH w:val="single" w:sz="6" w:color="D9E1F2"/>
+              <w:insideV w:val="single" w:sz="6" w:color="D9E1F2"/>
+            </w:tcBorders>
+            <w:shd w:fill="EAF2F8"/>
+          </w:tcPr>
+          <w:p>
+            <w:pPr>
+              <w:spacing w:line="276" w:lineRule="auto" w:before="20" w:after="20"/>
+              <w:jc w:val="center"/>
+            </w:pPr>
+            <w:r>
+              <w:rPr>
+                <w:rFonts w:ascii="PingFang SC" w:hAnsi="PingFang SC" w:hint="eastAsia" w:eastAsia="PingFang SC" w:cs="PingFang SC"/>
+                <w:b w:val="0"/>
+                <w:color w:val="000000"/>
+                <w:sz w:val="21"/>
+              </w:rPr>
+              <w:t>在多个模块之间查找功能</w:t>
+            </w:r>
+          </w:p>
+        </w:tc>
+        <w:tc>
+          <w:tcPr>
+            <w:tcW w:type="dxa" w:w="4736"/>
+            <w:vAlign w:val="center"/>
+            <w:tcMar>
+              <w:top w:w="100" w:type="dxa"/>
+              <w:start w:w="120" w:type="dxa"/>
+              <w:bottom w:w="100" w:type="dxa"/>
+              <w:end w:w="120" w:type="dxa"/>
+            </w:tcMar>
+            <w:tcBorders>
+              <w:top w:val="single" w:sz="6" w:color="D9E1F2"/>
+              <w:left w:val="single" w:sz="6" w:color="D9E1F2"/>
+              <w:bottom w:val="single" w:sz="6" w:color="D9E1F2"/>
+              <w:right w:val="single" w:sz="6" w:color="D9E1F2"/>
+              <w:insideH w:val="single" w:sz="6" w:color="D9E1F2"/>
+              <w:insideV w:val="single" w:sz="6" w:color="D9E1F2"/>
+            </w:tcBorders>
+            <w:shd w:fill="EAF2F8"/>
+          </w:tcPr>
+          <w:p>
+            <w:pPr>
+              <w:spacing w:line="276" w:lineRule="auto" w:before="20" w:after="20"/>
+              <w:jc w:val="left"/>
+            </w:pPr>
+            <w:r>
+              <w:rPr>
+                <w:rFonts w:ascii="PingFang SC" w:hAnsi="PingFang SC" w:hint="eastAsia" w:eastAsia="PingFang SC" w:cs="PingFang SC"/>
+                <w:b w:val="0"/>
+                <w:color w:val="000000"/>
+                <w:sz w:val="21"/>
+              </w:rPr>
+              <w:t>一个对话入口发起任务，审批和核验以卡片完成</w:t>
+            </w:r>
+          </w:p>
+        </w:tc>
+      </w:tr>
+      <w:tr>
+        <w:trPr>
+          <w:cantSplit/>
+        </w:trPr>
+        <w:tc>
+          <w:tcPr>
+            <w:tcW w:type="dxa" w:w="1441"/>
+            <w:vAlign w:val="center"/>
+            <w:tcMar>
+              <w:top w:w="100" w:type="dxa"/>
+              <w:start w:w="120" w:type="dxa"/>
+              <w:bottom w:w="100" w:type="dxa"/>
+              <w:end w:w="120" w:type="dxa"/>
+            </w:tcMar>
+            <w:tcBorders>
+              <w:top w:val="single" w:sz="6" w:color="D9E1F2"/>
+              <w:left w:val="single" w:sz="6" w:color="D9E1F2"/>
+              <w:bottom w:val="single" w:sz="6" w:color="D9E1F2"/>
+              <w:right w:val="single" w:sz="6" w:color="D9E1F2"/>
+              <w:insideH w:val="single" w:sz="6" w:color="D9E1F2"/>
+              <w:insideV w:val="single" w:sz="6" w:color="D9E1F2"/>
+            </w:tcBorders>
+            <w:shd w:fill="FFFFFF"/>
+          </w:tcPr>
+          <w:p>
+            <w:pPr>
+              <w:spacing w:line="276" w:lineRule="auto" w:before="20" w:after="20"/>
+              <w:jc w:val="center"/>
+            </w:pPr>
+            <w:r>
+              <w:rPr>
+                <w:rFonts w:ascii="PingFang SC" w:hAnsi="PingFang SC" w:hint="eastAsia" w:eastAsia="PingFang SC" w:cs="PingFang SC"/>
+                <w:b w:val="0"/>
+                <w:color w:val="000000"/>
+                <w:sz w:val="21"/>
+              </w:rPr>
+              <w:t>数字孪生</w:t>
+            </w:r>
+          </w:p>
+        </w:tc>
+        <w:tc>
+          <w:tcPr>
+            <w:tcW w:type="dxa" w:w="2462"/>
+            <w:vAlign w:val="center"/>
+            <w:tcMar>
+              <w:top w:w="100" w:type="dxa"/>
+              <w:start w:w="120" w:type="dxa"/>
+              <w:bottom w:w="100" w:type="dxa"/>
+              <w:end w:w="120" w:type="dxa"/>
+            </w:tcMar>
+            <w:tcBorders>
+              <w:top w:val="single" w:sz="6" w:color="D9E1F2"/>
+              <w:left w:val="single" w:sz="6" w:color="D9E1F2"/>
+              <w:bottom w:val="single" w:sz="6" w:color="D9E1F2"/>
+              <w:right w:val="single" w:sz="6" w:color="D9E1F2"/>
+              <w:insideH w:val="single" w:sz="6" w:color="D9E1F2"/>
+              <w:insideV w:val="single" w:sz="6" w:color="D9E1F2"/>
+            </w:tcBorders>
+            <w:shd w:fill="FFFFFF"/>
+          </w:tcPr>
+          <w:p>
+            <w:pPr>
+              <w:spacing w:line="276" w:lineRule="auto" w:before="20" w:after="20"/>
+              <w:jc w:val="center"/>
+            </w:pPr>
+            <w:r>
+              <w:rPr>
+                <w:rFonts w:ascii="PingFang SC" w:hAnsi="PingFang SC" w:hint="eastAsia" w:eastAsia="PingFang SC" w:cs="PingFang SC"/>
+                <w:b w:val="0"/>
+                <w:color w:val="000000"/>
+                <w:sz w:val="21"/>
+              </w:rPr>
+              <w:t>模型浏览与业务记录分开</w:t>
+            </w:r>
+          </w:p>
+        </w:tc>
+        <w:tc>
+          <w:tcPr>
+            <w:tcW w:type="dxa" w:w="4736"/>
+            <w:vAlign w:val="center"/>
+            <w:tcMar>
+              <w:top w:w="100" w:type="dxa"/>
+              <w:start w:w="120" w:type="dxa"/>
+              <w:bottom w:w="100" w:type="dxa"/>
+              <w:end w:w="120" w:type="dxa"/>
+            </w:tcMar>
+            <w:tcBorders>
+              <w:top w:val="single" w:sz="6" w:color="D9E1F2"/>
+              <w:left w:val="single" w:sz="6" w:color="D9E1F2"/>
+              <w:bottom w:val="single" w:sz="6" w:color="D9E1F2"/>
+              <w:right w:val="single" w:sz="6" w:color="D9E1F2"/>
+              <w:insideH w:val="single" w:sz="6" w:color="D9E1F2"/>
+              <w:insideV w:val="single" w:sz="6" w:color="D9E1F2"/>
+            </w:tcBorders>
+            <w:shd w:fill="FFFFFF"/>
+          </w:tcPr>
+          <w:p>
+            <w:pPr>
+              <w:spacing w:line="276" w:lineRule="auto" w:before="20" w:after="20"/>
+              <w:jc w:val="left"/>
+            </w:pPr>
+            <w:r>
+              <w:rPr>
+                <w:rFonts w:ascii="PingFang SC" w:hAnsi="PingFang SC" w:hint="eastAsia" w:eastAsia="PingFang SC" w:cs="PingFang SC"/>
+                <w:b w:val="0"/>
+                <w:color w:val="000000"/>
+                <w:sz w:val="21"/>
+              </w:rPr>
+              <w:t>Twin ID 连接模型、事件、进度、成本和运营数据</w:t>
+            </w:r>
+          </w:p>
+        </w:tc>
+      </w:tr>
+      <w:tr>
+        <w:trPr>
+          <w:cantSplit/>
+        </w:trPr>
+        <w:tc>
+          <w:tcPr>
+            <w:tcW w:type="dxa" w:w="1441"/>
+            <w:vAlign w:val="center"/>
+            <w:tcMar>
+              <w:top w:w="100" w:type="dxa"/>
+              <w:start w:w="120" w:type="dxa"/>
+              <w:bottom w:w="100" w:type="dxa"/>
+              <w:end w:w="120" w:type="dxa"/>
+            </w:tcMar>
+            <w:tcBorders>
+              <w:top w:val="single" w:sz="6" w:color="D9E1F2"/>
+              <w:left w:val="single" w:sz="6" w:color="D9E1F2"/>
+              <w:bottom w:val="single" w:sz="6" w:color="D9E1F2"/>
+              <w:right w:val="single" w:sz="6" w:color="D9E1F2"/>
+              <w:insideH w:val="single" w:sz="6" w:color="D9E1F2"/>
+              <w:insideV w:val="single" w:sz="6" w:color="D9E1F2"/>
+            </w:tcBorders>
+            <w:shd w:fill="EAF2F8"/>
+          </w:tcPr>
+          <w:p>
+            <w:pPr>
+              <w:spacing w:line="276" w:lineRule="auto" w:before="20" w:after="20"/>
+              <w:jc w:val="center"/>
+            </w:pPr>
+            <w:r>
+              <w:rPr>
+                <w:rFonts w:ascii="PingFang SC" w:hAnsi="PingFang SC" w:hint="eastAsia" w:eastAsia="PingFang SC" w:cs="PingFang SC"/>
+                <w:b w:val="0"/>
+                <w:color w:val="000000"/>
+                <w:sz w:val="21"/>
+              </w:rPr>
               <w:t>审计</w:t>
             </w:r>
           </w:p>
         </w:tc>
         <w:tc>
           <w:tcPr>
-            <w:tcW w:type="dxa" w:w="2625"/>
+            <w:tcW w:type="dxa" w:w="2462"/>
             <w:vAlign w:val="center"/>
             <w:tcMar>
               <w:top w:w="100" w:type="dxa"/>
@@ -9913,7 +11956,7 @@
         </w:tc>
         <w:tc>
           <w:tcPr>
-            <w:tcW w:type="dxa" w:w="4611"/>
+            <w:tcW w:type="dxa" w:w="4736"/>
             <w:vAlign w:val="center"/>
             <w:tcMar>
               <w:top w:w="100" w:type="dxa"/>
@@ -10022,7 +12065,7 @@
           <w:color w:val="000000"/>
           <w:sz w:val="30"/>
         </w:rPr>
-        <w:t>作品的技术重点不是扩大聊天问答范围，而是证明一个项目事件如何经过证据检索、跨专业分析、人工授权、工具执行和独立核验后成为可审计的结果。执行产物采用内容寻址，核验器重新检查审批和产物，使 AI 建议、人工责任和工具状态各自可辨。</w:t>
+        <w:t>作品的技术重点不是扩大聊天问答范围，而是证明一个项目事件如何经过证据检索、跨专业分析、人工授权、工具执行和独立核验后成为可审计的结果。智能助手降低了使用门槛，但模型只负责理解意图、组织有出处的回答和起草草稿，任何具有外部影响的动作仍由人确认、由独立核验器证明。执行产物采用内容寻址，核验器重新检查审批和产物，使 AI 建议、人工责任和工具状态各自可辨。</w:t>
       </w:r>
     </w:p>
     <w:p>
@@ -10097,7 +12140,7 @@
         </w:trPr>
         <w:tc>
           <w:tcPr>
-            <w:tcW w:type="dxa" w:w="1600"/>
+            <w:tcW w:type="dxa" w:w="1252"/>
             <w:vAlign w:val="center"/>
             <w:tcMar>
               <w:top w:w="100" w:type="dxa"/>
@@ -10133,7 +12176,7 @@
         </w:tc>
         <w:tc>
           <w:tcPr>
-            <w:tcW w:type="dxa" w:w="3680"/>
+            <w:tcW w:type="dxa" w:w="3882"/>
             <w:vAlign w:val="center"/>
             <w:tcMar>
               <w:top w:w="100" w:type="dxa"/>
@@ -10169,7 +12212,7 @@
         </w:tc>
         <w:tc>
           <w:tcPr>
-            <w:tcW w:type="dxa" w:w="3360"/>
+            <w:tcW w:type="dxa" w:w="3506"/>
             <w:vAlign w:val="center"/>
             <w:tcMar>
               <w:top w:w="100" w:type="dxa"/>
@@ -10210,7 +12253,7 @@
         </w:trPr>
         <w:tc>
           <w:tcPr>
-            <w:tcW w:type="dxa" w:w="1600"/>
+            <w:tcW w:type="dxa" w:w="1252"/>
             <w:vAlign w:val="center"/>
             <w:tcMar>
               <w:top w:w="100" w:type="dxa"/>
@@ -10246,7 +12289,7 @@
         </w:tc>
         <w:tc>
           <w:tcPr>
-            <w:tcW w:type="dxa" w:w="3680"/>
+            <w:tcW w:type="dxa" w:w="3882"/>
             <w:vAlign w:val="center"/>
             <w:tcMar>
               <w:top w:w="100" w:type="dxa"/>
@@ -10276,13 +12319,13 @@
                 <w:color w:val="000000"/>
                 <w:sz w:val="21"/>
               </w:rPr>
-              <w:t>可选分类抽取、翻译和草案生成</w:t>
-            </w:r>
-          </w:p>
-        </w:tc>
-        <w:tc>
-          <w:tcPr>
-            <w:tcW w:type="dxa" w:w="3360"/>
+              <w:t>对话意图规划、法规问答组织、回复函起草，以及可选分类抽取和翻译</w:t>
+            </w:r>
+          </w:p>
+        </w:tc>
+        <w:tc>
+          <w:tcPr>
+            <w:tcW w:type="dxa" w:w="3506"/>
             <w:vAlign w:val="center"/>
             <w:tcMar>
               <w:top w:w="100" w:type="dxa"/>
@@ -10312,7 +12355,7 @@
                 <w:color w:val="000000"/>
                 <w:sz w:val="21"/>
               </w:rPr>
-              <w:t>模型路由轨迹、schema 校验和草案产物</w:t>
+              <w:t>工具枚举约束、引用校验、失败退回规则或模板、模型路由轨迹</w:t>
             </w:r>
           </w:p>
         </w:tc>
@@ -10323,7 +12366,7 @@
         </w:trPr>
         <w:tc>
           <w:tcPr>
-            <w:tcW w:type="dxa" w:w="1600"/>
+            <w:tcW w:type="dxa" w:w="1252"/>
             <w:vAlign w:val="center"/>
             <w:tcMar>
               <w:top w:w="100" w:type="dxa"/>
@@ -10359,7 +12402,7 @@
         </w:tc>
         <w:tc>
           <w:tcPr>
-            <w:tcW w:type="dxa" w:w="3680"/>
+            <w:tcW w:type="dxa" w:w="3882"/>
             <w:vAlign w:val="center"/>
             <w:tcMar>
               <w:top w:w="100" w:type="dxa"/>
@@ -10395,7 +12438,7 @@
         </w:tc>
         <w:tc>
           <w:tcPr>
-            <w:tcW w:type="dxa" w:w="3360"/>
+            <w:tcW w:type="dxa" w:w="3506"/>
             <w:vAlign w:val="center"/>
             <w:tcMar>
               <w:top w:w="100" w:type="dxa"/>
@@ -10436,7 +12479,7 @@
         </w:trPr>
         <w:tc>
           <w:tcPr>
-            <w:tcW w:type="dxa" w:w="1600"/>
+            <w:tcW w:type="dxa" w:w="1252"/>
             <w:vAlign w:val="center"/>
             <w:tcMar>
               <w:top w:w="100" w:type="dxa"/>
@@ -10472,7 +12515,7 @@
         </w:tc>
         <w:tc>
           <w:tcPr>
-            <w:tcW w:type="dxa" w:w="3680"/>
+            <w:tcW w:type="dxa" w:w="3882"/>
             <w:vAlign w:val="center"/>
             <w:tcMar>
               <w:top w:w="100" w:type="dxa"/>
@@ -10508,7 +12551,7 @@
         </w:tc>
         <w:tc>
           <w:tcPr>
-            <w:tcW w:type="dxa" w:w="3360"/>
+            <w:tcW w:type="dxa" w:w="3506"/>
             <w:vAlign w:val="center"/>
             <w:tcMar>
               <w:top w:w="100" w:type="dxa"/>
@@ -10549,7 +12592,7 @@
         </w:trPr>
         <w:tc>
           <w:tcPr>
-            <w:tcW w:type="dxa" w:w="1600"/>
+            <w:tcW w:type="dxa" w:w="1252"/>
             <w:vAlign w:val="center"/>
             <w:tcMar>
               <w:top w:w="100" w:type="dxa"/>
@@ -10585,7 +12628,7 @@
         </w:tc>
         <w:tc>
           <w:tcPr>
-            <w:tcW w:type="dxa" w:w="3680"/>
+            <w:tcW w:type="dxa" w:w="3882"/>
             <w:vAlign w:val="center"/>
             <w:tcMar>
               <w:top w:w="100" w:type="dxa"/>
@@ -10621,7 +12664,7 @@
         </w:tc>
         <w:tc>
           <w:tcPr>
-            <w:tcW w:type="dxa" w:w="3360"/>
+            <w:tcW w:type="dxa" w:w="3506"/>
             <w:vAlign w:val="center"/>
             <w:tcMar>
               <w:top w:w="100" w:type="dxa"/>
@@ -10662,7 +12705,7 @@
         </w:trPr>
         <w:tc>
           <w:tcPr>
-            <w:tcW w:type="dxa" w:w="1600"/>
+            <w:tcW w:type="dxa" w:w="1252"/>
             <w:vAlign w:val="center"/>
             <w:tcMar>
               <w:top w:w="100" w:type="dxa"/>
@@ -10698,7 +12741,7 @@
         </w:tc>
         <w:tc>
           <w:tcPr>
-            <w:tcW w:type="dxa" w:w="3680"/>
+            <w:tcW w:type="dxa" w:w="3882"/>
             <w:vAlign w:val="center"/>
             <w:tcMar>
               <w:top w:w="100" w:type="dxa"/>
@@ -10734,7 +12777,7 @@
         </w:tc>
         <w:tc>
           <w:tcPr>
-            <w:tcW w:type="dxa" w:w="3360"/>
+            <w:tcW w:type="dxa" w:w="3506"/>
             <w:vAlign w:val="center"/>
             <w:tcMar>
               <w:top w:w="100" w:type="dxa"/>
@@ -10775,7 +12818,7 @@
         </w:trPr>
         <w:tc>
           <w:tcPr>
-            <w:tcW w:type="dxa" w:w="1600"/>
+            <w:tcW w:type="dxa" w:w="1252"/>
             <w:vAlign w:val="center"/>
             <w:tcMar>
               <w:top w:w="100" w:type="dxa"/>
@@ -10811,7 +12854,7 @@
         </w:tc>
         <w:tc>
           <w:tcPr>
-            <w:tcW w:type="dxa" w:w="3680"/>
+            <w:tcW w:type="dxa" w:w="3882"/>
             <w:vAlign w:val="center"/>
             <w:tcMar>
               <w:top w:w="100" w:type="dxa"/>
@@ -10847,7 +12890,7 @@
         </w:tc>
         <w:tc>
           <w:tcPr>
-            <w:tcW w:type="dxa" w:w="3360"/>
+            <w:tcW w:type="dxa" w:w="3506"/>
             <w:vAlign w:val="center"/>
             <w:tcMar>
               <w:top w:w="100" w:type="dxa"/>
@@ -10888,7 +12931,7 @@
         </w:trPr>
         <w:tc>
           <w:tcPr>
-            <w:tcW w:type="dxa" w:w="1600"/>
+            <w:tcW w:type="dxa" w:w="1252"/>
             <w:vAlign w:val="center"/>
             <w:tcMar>
               <w:top w:w="100" w:type="dxa"/>
@@ -10924,7 +12967,7 @@
         </w:tc>
         <w:tc>
           <w:tcPr>
-            <w:tcW w:type="dxa" w:w="3680"/>
+            <w:tcW w:type="dxa" w:w="3882"/>
             <w:vAlign w:val="center"/>
             <w:tcMar>
               <w:top w:w="100" w:type="dxa"/>
@@ -10960,7 +13003,7 @@
         </w:tc>
         <w:tc>
           <w:tcPr>
-            <w:tcW w:type="dxa" w:w="3360"/>
+            <w:tcW w:type="dxa" w:w="3506"/>
             <w:vAlign w:val="center"/>
             <w:tcMar>
               <w:top w:w="100" w:type="dxa"/>
@@ -12032,7 +14075,7 @@
         </w:trPr>
         <w:tc>
           <w:tcPr>
-            <w:tcW w:type="dxa" w:w="2587"/>
+            <w:tcW w:type="dxa" w:w="2298"/>
             <w:vAlign w:val="center"/>
             <w:tcMar>
               <w:top w:w="100" w:type="dxa"/>
@@ -12068,7 +14111,7 @@
         </w:tc>
         <w:tc>
           <w:tcPr>
-            <w:tcW w:type="dxa" w:w="1412"/>
+            <w:tcW w:type="dxa" w:w="1480"/>
             <w:vAlign w:val="center"/>
             <w:tcMar>
               <w:top w:w="100" w:type="dxa"/>
@@ -12104,7 +14147,7 @@
         </w:tc>
         <w:tc>
           <w:tcPr>
-            <w:tcW w:type="dxa" w:w="4641"/>
+            <w:tcW w:type="dxa" w:w="4862"/>
             <w:vAlign w:val="center"/>
             <w:tcMar>
               <w:top w:w="100" w:type="dxa"/>
@@ -12145,7 +14188,7 @@
         </w:trPr>
         <w:tc>
           <w:tcPr>
-            <w:tcW w:type="dxa" w:w="2587"/>
+            <w:tcW w:type="dxa" w:w="2298"/>
             <w:vAlign w:val="center"/>
             <w:tcMar>
               <w:top w:w="100" w:type="dxa"/>
@@ -12181,7 +14224,7 @@
         </w:tc>
         <w:tc>
           <w:tcPr>
-            <w:tcW w:type="dxa" w:w="1412"/>
+            <w:tcW w:type="dxa" w:w="1480"/>
             <w:vAlign w:val="center"/>
             <w:tcMar>
               <w:top w:w="100" w:type="dxa"/>
@@ -12217,7 +14260,7 @@
         </w:tc>
         <w:tc>
           <w:tcPr>
-            <w:tcW w:type="dxa" w:w="4641"/>
+            <w:tcW w:type="dxa" w:w="4862"/>
             <w:vAlign w:val="center"/>
             <w:tcMar>
               <w:top w:w="100" w:type="dxa"/>
@@ -12247,7 +14290,7 @@
                 <w:color w:val="000000"/>
                 <w:sz w:val="21"/>
               </w:rPr>
-              <w:t>第一章痛点矩阵；七步黄金场景；现场事件到闭环回执</w:t>
+              <w:t>第一章痛点矩阵；七步黄金场景；智能助手一句话发起到闭环回执</w:t>
             </w:r>
           </w:p>
         </w:tc>
@@ -12258,7 +14301,7 @@
         </w:trPr>
         <w:tc>
           <w:tcPr>
-            <w:tcW w:type="dxa" w:w="2587"/>
+            <w:tcW w:type="dxa" w:w="2298"/>
             <w:vAlign w:val="center"/>
             <w:tcMar>
               <w:top w:w="100" w:type="dxa"/>
@@ -12294,7 +14337,7 @@
         </w:tc>
         <w:tc>
           <w:tcPr>
-            <w:tcW w:type="dxa" w:w="1412"/>
+            <w:tcW w:type="dxa" w:w="1480"/>
             <w:vAlign w:val="center"/>
             <w:tcMar>
               <w:top w:w="100" w:type="dxa"/>
@@ -12330,7 +14373,7 @@
         </w:tc>
         <w:tc>
           <w:tcPr>
-            <w:tcW w:type="dxa" w:w="4641"/>
+            <w:tcW w:type="dxa" w:w="4862"/>
             <w:vAlign w:val="center"/>
             <w:tcMar>
               <w:top w:w="100" w:type="dxa"/>
@@ -12360,7 +14403,7 @@
                 <w:color w:val="000000"/>
                 <w:sz w:val="21"/>
               </w:rPr>
-              <w:t>第三章关键技术；第六章技术融合；可运行 API</w:t>
+              <w:t>第三章关键技术与受约束对话智能体；第六章技术融合；可运行 API</w:t>
             </w:r>
           </w:p>
         </w:tc>
@@ -12371,7 +14414,7 @@
         </w:trPr>
         <w:tc>
           <w:tcPr>
-            <w:tcW w:type="dxa" w:w="2587"/>
+            <w:tcW w:type="dxa" w:w="2298"/>
             <w:vAlign w:val="center"/>
             <w:tcMar>
               <w:top w:w="100" w:type="dxa"/>
@@ -12407,7 +14450,7 @@
         </w:tc>
         <w:tc>
           <w:tcPr>
-            <w:tcW w:type="dxa" w:w="1412"/>
+            <w:tcW w:type="dxa" w:w="1480"/>
             <w:vAlign w:val="center"/>
             <w:tcMar>
               <w:top w:w="100" w:type="dxa"/>
@@ -12443,7 +14486,7 @@
         </w:tc>
         <w:tc>
           <w:tcPr>
-            <w:tcW w:type="dxa" w:w="4641"/>
+            <w:tcW w:type="dxa" w:w="4862"/>
             <w:vAlign w:val="center"/>
             <w:tcMar>
               <w:top w:w="100" w:type="dxa"/>
@@ -12484,7 +14527,7 @@
         </w:trPr>
         <w:tc>
           <w:tcPr>
-            <w:tcW w:type="dxa" w:w="2587"/>
+            <w:tcW w:type="dxa" w:w="2298"/>
             <w:vAlign w:val="center"/>
             <w:tcMar>
               <w:top w:w="100" w:type="dxa"/>
@@ -12520,7 +14563,7 @@
         </w:tc>
         <w:tc>
           <w:tcPr>
-            <w:tcW w:type="dxa" w:w="1412"/>
+            <w:tcW w:type="dxa" w:w="1480"/>
             <w:vAlign w:val="center"/>
             <w:tcMar>
               <w:top w:w="100" w:type="dxa"/>
@@ -12556,7 +14599,7 @@
         </w:tc>
         <w:tc>
           <w:tcPr>
-            <w:tcW w:type="dxa" w:w="4641"/>
+            <w:tcW w:type="dxa" w:w="4862"/>
             <w:vAlign w:val="center"/>
             <w:tcMar>
               <w:top w:w="100" w:type="dxa"/>
@@ -12597,7 +14640,7 @@
         </w:trPr>
         <w:tc>
           <w:tcPr>
-            <w:tcW w:type="dxa" w:w="2587"/>
+            <w:tcW w:type="dxa" w:w="2298"/>
             <w:vAlign w:val="center"/>
             <w:tcMar>
               <w:top w:w="100" w:type="dxa"/>
@@ -12633,7 +14676,7 @@
         </w:tc>
         <w:tc>
           <w:tcPr>
-            <w:tcW w:type="dxa" w:w="1412"/>
+            <w:tcW w:type="dxa" w:w="1480"/>
             <w:vAlign w:val="center"/>
             <w:tcMar>
               <w:top w:w="100" w:type="dxa"/>
@@ -12669,7 +14712,7 @@
         </w:tc>
         <w:tc>
           <w:tcPr>
-            <w:tcW w:type="dxa" w:w="4641"/>
+            <w:tcW w:type="dxa" w:w="4862"/>
             <w:vAlign w:val="center"/>
             <w:tcMar>
               <w:top w:w="100" w:type="dxa"/>
@@ -12710,7 +14753,7 @@
         </w:trPr>
         <w:tc>
           <w:tcPr>
-            <w:tcW w:type="dxa" w:w="2587"/>
+            <w:tcW w:type="dxa" w:w="2298"/>
             <w:vAlign w:val="center"/>
             <w:tcMar>
               <w:top w:w="100" w:type="dxa"/>
@@ -12746,7 +14789,7 @@
         </w:tc>
         <w:tc>
           <w:tcPr>
-            <w:tcW w:type="dxa" w:w="1412"/>
+            <w:tcW w:type="dxa" w:w="1480"/>
             <w:vAlign w:val="center"/>
             <w:tcMar>
               <w:top w:w="100" w:type="dxa"/>
@@ -12782,7 +14825,7 @@
         </w:tc>
         <w:tc>
           <w:tcPr>
-            <w:tcW w:type="dxa" w:w="4641"/>
+            <w:tcW w:type="dxa" w:w="4862"/>
             <w:vAlign w:val="center"/>
             <w:tcMar>
               <w:top w:w="100" w:type="dxa"/>
@@ -12823,7 +14866,7 @@
         </w:trPr>
         <w:tc>
           <w:tcPr>
-            <w:tcW w:type="dxa" w:w="2587"/>
+            <w:tcW w:type="dxa" w:w="2298"/>
             <w:vAlign w:val="center"/>
             <w:tcMar>
               <w:top w:w="100" w:type="dxa"/>
@@ -12859,7 +14902,7 @@
         </w:tc>
         <w:tc>
           <w:tcPr>
-            <w:tcW w:type="dxa" w:w="1412"/>
+            <w:tcW w:type="dxa" w:w="1480"/>
             <w:vAlign w:val="center"/>
             <w:tcMar>
               <w:top w:w="100" w:type="dxa"/>
@@ -12895,7 +14938,7 @@
         </w:tc>
         <w:tc>
           <w:tcPr>
-            <w:tcW w:type="dxa" w:w="4641"/>
+            <w:tcW w:type="dxa" w:w="4862"/>
             <w:vAlign w:val="center"/>
             <w:tcMar>
               <w:top w:w="100" w:type="dxa"/>
@@ -12936,7 +14979,7 @@
         </w:trPr>
         <w:tc>
           <w:tcPr>
-            <w:tcW w:type="dxa" w:w="2587"/>
+            <w:tcW w:type="dxa" w:w="2298"/>
             <w:vAlign w:val="center"/>
             <w:tcMar>
               <w:top w:w="100" w:type="dxa"/>
@@ -12972,7 +15015,7 @@
         </w:tc>
         <w:tc>
           <w:tcPr>
-            <w:tcW w:type="dxa" w:w="1412"/>
+            <w:tcW w:type="dxa" w:w="1480"/>
             <w:vAlign w:val="center"/>
             <w:tcMar>
               <w:top w:w="100" w:type="dxa"/>
@@ -13008,7 +15051,7 @@
         </w:tc>
         <w:tc>
           <w:tcPr>
-            <w:tcW w:type="dxa" w:w="4641"/>
+            <w:tcW w:type="dxa" w:w="4862"/>
             <w:vAlign w:val="center"/>
             <w:tcMar>
               <w:top w:w="100" w:type="dxa"/>
@@ -13049,7 +15092,7 @@
         </w:trPr>
         <w:tc>
           <w:tcPr>
-            <w:tcW w:type="dxa" w:w="2587"/>
+            <w:tcW w:type="dxa" w:w="2298"/>
             <w:vAlign w:val="center"/>
             <w:tcMar>
               <w:top w:w="100" w:type="dxa"/>
@@ -13085,7 +15128,7 @@
         </w:tc>
         <w:tc>
           <w:tcPr>
-            <w:tcW w:type="dxa" w:w="1412"/>
+            <w:tcW w:type="dxa" w:w="1480"/>
             <w:vAlign w:val="center"/>
             <w:tcMar>
               <w:top w:w="100" w:type="dxa"/>
@@ -13121,7 +15164,7 @@
         </w:tc>
         <w:tc>
           <w:tcPr>
-            <w:tcW w:type="dxa" w:w="4641"/>
+            <w:tcW w:type="dxa" w:w="4862"/>
             <w:vAlign w:val="center"/>
             <w:tcMar>
               <w:top w:w="100" w:type="dxa"/>
@@ -13162,7 +15205,7 @@
         </w:trPr>
         <w:tc>
           <w:tcPr>
-            <w:tcW w:type="dxa" w:w="2587"/>
+            <w:tcW w:type="dxa" w:w="2298"/>
             <w:vAlign w:val="center"/>
             <w:tcMar>
               <w:top w:w="100" w:type="dxa"/>
@@ -13198,7 +15241,7 @@
         </w:tc>
         <w:tc>
           <w:tcPr>
-            <w:tcW w:type="dxa" w:w="1412"/>
+            <w:tcW w:type="dxa" w:w="1480"/>
             <w:vAlign w:val="center"/>
             <w:tcMar>
               <w:top w:w="100" w:type="dxa"/>
@@ -13234,7 +15277,7 @@
         </w:tc>
         <w:tc>
           <w:tcPr>
-            <w:tcW w:type="dxa" w:w="4641"/>
+            <w:tcW w:type="dxa" w:w="4862"/>
             <w:vAlign w:val="center"/>
             <w:tcMar>
               <w:top w:w="100" w:type="dxa"/>
@@ -13308,7 +15351,7 @@
           <w:color w:val="000000"/>
           <w:sz w:val="30"/>
         </w:rPr>
-        <w:t>线上参赛入口：</w:t>
+        <w:t>线上智能助手：</w:t>
       </w:r>
       <w:r>
         <w:rPr>
@@ -13317,7 +15360,7 @@
           <w:color w:val="000000"/>
           <w:sz w:val="21"/>
         </w:rPr>
-        <w:t>https://globalinfra-ai-production.up.railway.app/competition</w:t>
+        <w:t>https://globalinfra-ai-production.up.railway.app/</w:t>
       </w:r>
     </w:p>
     <w:p>
@@ -13334,7 +15377,7 @@
           <w:color w:val="000000"/>
           <w:sz w:val="30"/>
         </w:rPr>
-        <w:t>线上健康检查：</w:t>
+        <w:t>线上参赛入口：</w:t>
       </w:r>
       <w:r>
         <w:rPr>
@@ -13343,7 +15386,7 @@
           <w:color w:val="000000"/>
           <w:sz w:val="21"/>
         </w:rPr>
-        <w:t>https://globalinfra-ai-production.up.railway.app/backend/health</w:t>
+        <w:t>https://globalinfra-ai-production.up.railway.app/competition</w:t>
       </w:r>
     </w:p>
     <w:p>
@@ -13360,7 +15403,7 @@
           <w:color w:val="000000"/>
           <w:sz w:val="30"/>
         </w:rPr>
-        <w:t>完整评测证据：</w:t>
+        <w:t>线上健康检查：</w:t>
       </w:r>
       <w:r>
         <w:rPr>
@@ -13369,7 +15412,7 @@
           <w:color w:val="000000"/>
           <w:sz w:val="21"/>
         </w:rPr>
-        <w:t>https://globalinfra-ai-production.up.railway.app/backend/competition/evaluation?include_cases=true</w:t>
+        <w:t>https://globalinfra-ai-production.up.railway.app/backend/health</w:t>
       </w:r>
     </w:p>
     <w:p>
@@ -13386,7 +15429,7 @@
           <w:color w:val="000000"/>
           <w:sz w:val="30"/>
         </w:rPr>
-        <w:t>本地复现命令：</w:t>
+        <w:t>完整评测证据：</w:t>
       </w:r>
       <w:r>
         <w:rPr>
@@ -13395,7 +15438,7 @@
           <w:color w:val="000000"/>
           <w:sz w:val="21"/>
         </w:rPr>
-        <w:t>docker compose up --build</w:t>
+        <w:t>https://globalinfra-ai-production.up.railway.app/backend/competition/evaluation?include_cases=true</w:t>
       </w:r>
     </w:p>
     <w:p>
@@ -13412,7 +15455,7 @@
           <w:color w:val="000000"/>
           <w:sz w:val="30"/>
         </w:rPr>
-        <w:t>竞赛评测命令：</w:t>
+        <w:t>本地复现命令：</w:t>
       </w:r>
       <w:r>
         <w:rPr>
@@ -13421,7 +15464,7 @@
           <w:color w:val="000000"/>
           <w:sz w:val="21"/>
         </w:rPr>
-        <w:t>python evals/run_competition_eval.py</w:t>
+        <w:t>docker compose up --build</w:t>
       </w:r>
     </w:p>
     <w:p>
@@ -13438,7 +15481,7 @@
           <w:color w:val="000000"/>
           <w:sz w:val="30"/>
         </w:rPr>
-        <w:t>API 自动化测试命令：</w:t>
+        <w:t>竞赛评测命令：</w:t>
       </w:r>
       <w:r>
         <w:rPr>
@@ -13447,7 +15490,7 @@
           <w:color w:val="000000"/>
           <w:sz w:val="21"/>
         </w:rPr>
-        <w:t>python -m pytest services/api/tests -q</w:t>
+        <w:t>python evals/run_competition_eval.py</w:t>
       </w:r>
     </w:p>
     <w:p>
@@ -13464,7 +15507,7 @@
           <w:color w:val="000000"/>
           <w:sz w:val="30"/>
         </w:rPr>
-        <w:t>GitHub CI：</w:t>
+        <w:t>API 自动化测试命令：</w:t>
       </w:r>
       <w:r>
         <w:rPr>
@@ -13473,7 +15516,33 @@
           <w:color w:val="000000"/>
           <w:sz w:val="21"/>
         </w:rPr>
-        <w:t>https://github.com/weareoneconnection/globalinfra-ai/actions/runs/38570085404</w:t>
+        <w:t>python -m pytest services/api/tests -q</w:t>
+      </w:r>
+    </w:p>
+    <w:p>
+      <w:pPr>
+        <w:widowControl/>
+        <w:spacing w:line="348" w:lineRule="auto" w:after="0"/>
+        <w:ind w:firstLine="639"/>
+        <w:jc w:val="both"/>
+      </w:pPr>
+      <w:r>
+        <w:rPr>
+          <w:rFonts w:ascii="PingFang SC" w:hAnsi="PingFang SC" w:hint="eastAsia" w:eastAsia="PingFang SC" w:cs="PingFang SC"/>
+          <w:b w:val="0"/>
+          <w:color w:val="000000"/>
+          <w:sz w:val="30"/>
+        </w:rPr>
+        <w:t>GitHub CI：</w:t>
+      </w:r>
+      <w:r>
+        <w:rPr>
+          <w:rFonts w:ascii="Consolas" w:hAnsi="Consolas" w:hint="default" w:eastAsia="Consolas" w:cs="Consolas"/>
+          <w:b w:val="0"/>
+          <w:color w:val="000000"/>
+          <w:sz w:val="21"/>
+        </w:rPr>
+        <w:t>https://github.com/weareoneconnection/globalinfra-ai/actions/runs/38658264378</w:t>
       </w:r>
     </w:p>
     <w:p>
@@ -13616,7 +15685,7 @@
           <w:color w:val="000000"/>
           <w:sz w:val="30"/>
         </w:rPr>
-        <w:t>当前版本已经完成竞赛级端到端闭环、自动化测试、在线部署和可复现评测，但尚未形成真实客户项目的生产验收记录。下一阶段应选择一个获授权的海外项目，导入经过脱敏和批准的数据，完成安全评估、属地专业复核、真实系统连接、盲测和用户验收，并以试点基线量化处理时间、人工复核负担、证据完整率和风险事件闭环时间。</w:t>
+        <w:t>当前版本已经完成竞赛级端到端闭环、自动化测试、在线部署和可复现评测，但尚未形成真实客户项目的生产验收记录。智能助手的意图规划和回复起草尚未纳入版本化评测集，下一步应建立对话意图与回复质量的标注集，报告工具选择准确率、引用合规率和人工评分。下一阶段应选择一个获授权的海外项目，导入经过脱敏和批准的数据，完成安全评估、属地专业复核、真实系统连接、盲测和用户验收，并以试点基线量化处理时间、人工复核负担、证据完整率和风险事件闭环时间。</w:t>
       </w:r>
     </w:p>
     <w:p>

</xml_diff>

<commit_message>
docs(submission): align design report with the registration form
Use the registered name, fill the cover, drop the word 可信, add the
second first-batch scenario (correspondence and variation replies), state
the model deployment (Ollama + Qwen3-8B, OpenAI-compatible cloud), define
terms on first use, unify 工单 as 案例, fix punctuation, add core points to
the summary and use formal Chinese heading numbering. Rebuilt the PDF
and package.

Co-Authored-By: Claude Opus 5.5 <noreply@anthropic.com>
</commit_message>
<xml_diff>
--- a/submission/final/GlobalInfra_AI_AI出海应用设计报告.docx
+++ b/submission/final/GlobalInfra_AI_AI出海应用设计报告.docx
@@ -45,7 +45,7 @@
           <w:color w:val="000000"/>
           <w:sz w:val="28"/>
         </w:rPr>
-        <w:t>作品版本：GlobalInfra AI V4.3 参赛提交版（智能助手与可信执行）</w:t>
+        <w:t>作品名称：GlobalInfra AI——全球交通基础设施智能决策与协同执行平台</w:t>
       </w:r>
     </w:p>
     <w:p>
@@ -60,7 +60,7 @@
           <w:color w:val="000000"/>
           <w:sz w:val="28"/>
         </w:rPr>
-        <w:t>参赛单位：请赛前填写</w:t>
+        <w:t>作品版本：V4.3 参赛提交版</w:t>
       </w:r>
     </w:p>
     <w:p>
@@ -75,7 +75,22 @@
           <w:color w:val="000000"/>
           <w:sz w:val="28"/>
         </w:rPr>
-        <w:t>团队负责人：请赛前填写</w:t>
+        <w:t>参赛单位：中国港湾工程有限责任公司</w:t>
+      </w:r>
+    </w:p>
+    <w:p>
+      <w:pPr>
+        <w:spacing w:line="360" w:lineRule="auto" w:after="120"/>
+        <w:jc w:val="center"/>
+      </w:pPr>
+      <w:r>
+        <w:rPr>
+          <w:rFonts w:ascii="PingFang SC" w:hAnsi="PingFang SC" w:hint="eastAsia" w:eastAsia="PingFang SC" w:cs="PingFang SC"/>
+          <w:b w:val="0"/>
+          <w:color w:val="000000"/>
+          <w:sz w:val="28"/>
+        </w:rPr>
+        <w:t>团队负责人：马青</w:t>
       </w:r>
     </w:p>
     <w:p>
@@ -106,12 +121,7 @@
           <w:color w:val="000000"/>
           <w:sz w:val="24"/>
         </w:rPr>
-        <w:t>数据边界：报告中的项目、事件、数字孪生和评测样本均为合成演示数据，不含客户数据或个人数据。国家法规内容仅作为官方来源索引，不构成法律意见。</w:t>
-      </w:r>
-    </w:p>
-    <w:p>
-      <w:r>
-        <w:br w:type="page"/>
+        <w:t>数据边界：报告中的项目、事件、函件、数字孪生和评测样本均为合成演示数据，不含业主、合作方、项目敏感信息或个人数据。国家法规内容仅作为官方来源索引，不构成法律意见。</w:t>
       </w:r>
     </w:p>
     <w:p>
@@ -143,11 +153,181 @@
       <w:r>
         <w:rPr>
           <w:rFonts w:ascii="PingFang SC" w:hAnsi="PingFang SC" w:hint="eastAsia" w:eastAsia="PingFang SC" w:cs="PingFang SC"/>
+          <w:b/>
+          <w:color w:val="000000"/>
+          <w:sz w:val="30"/>
+        </w:rPr>
+        <w:t>核心要点</w:t>
+      </w:r>
+    </w:p>
+    <w:p>
+      <w:pPr>
+        <w:spacing w:line="324" w:lineRule="auto" w:after="40"/>
+        <w:ind w:left="835" w:hanging="403"/>
+        <w:jc w:val="both"/>
+      </w:pPr>
+      <w:r>
+        <w:rPr>
+          <w:rFonts w:ascii="PingFang SC" w:hAnsi="PingFang SC" w:hint="eastAsia" w:eastAsia="PingFang SC" w:cs="PingFang SC"/>
+          <w:b/>
+          <w:color w:val="000000"/>
+          <w:sz w:val="28"/>
+        </w:rPr>
+        <w:t xml:space="preserve">• </w:t>
+      </w:r>
+      <w:r>
+        <w:rPr>
+          <w:rFonts w:ascii="PingFang SC" w:hAnsi="PingFang SC" w:hint="eastAsia" w:eastAsia="PingFang SC" w:cs="PingFang SC"/>
+          <w:b/>
+          <w:color w:val="000000"/>
+          <w:sz w:val="28"/>
+        </w:rPr>
+        <w:t>定位</w:t>
+      </w:r>
+      <w:r>
+        <w:rPr>
+          <w:rFonts w:ascii="PingFang SC" w:hAnsi="PingFang SC" w:hint="eastAsia" w:eastAsia="PingFang SC" w:cs="PingFang SC"/>
           <w:b w:val="0"/>
           <w:color w:val="000000"/>
-          <w:sz w:val="30"/>
-        </w:rPr>
-        <w:t>GlobalInfra AI 面向海外交通基础设施项目，将现场事件、国家规则、工程知识、合同责任、进度成本、数字孪生、多智能体分析、人工审批和工具执行连接为可审计的业务闭环。系统以项目工单而非聊天记录作为业务主线，以稳定 Twin ID 连接空间对象和全生命周期数据，并要求高风险行动在执行前获得人工批准、在关闭前取得独立核验回执。</w:t>
+          <w:sz w:val="28"/>
+        </w:rPr>
+        <w:t>：GlobalInfra AI——全球交通基础设施智能决策与协同执行平台，面向中国企业承建的海外交通基础设施项目，属 AI 出海赛道工具出海方向，兼顾属地融合与能力输出。</w:t>
+      </w:r>
+    </w:p>
+    <w:p>
+      <w:pPr>
+        <w:spacing w:line="324" w:lineRule="auto" w:after="40"/>
+        <w:ind w:left="835" w:hanging="403"/>
+        <w:jc w:val="both"/>
+      </w:pPr>
+      <w:r>
+        <w:rPr>
+          <w:rFonts w:ascii="PingFang SC" w:hAnsi="PingFang SC" w:hint="eastAsia" w:eastAsia="PingFang SC" w:cs="PingFang SC"/>
+          <w:b/>
+          <w:color w:val="000000"/>
+          <w:sz w:val="28"/>
+        </w:rPr>
+        <w:t xml:space="preserve">• </w:t>
+      </w:r>
+      <w:r>
+        <w:rPr>
+          <w:rFonts w:ascii="PingFang SC" w:hAnsi="PingFang SC" w:hint="eastAsia" w:eastAsia="PingFang SC" w:cs="PingFang SC"/>
+          <w:b/>
+          <w:color w:val="000000"/>
+          <w:sz w:val="28"/>
+        </w:rPr>
+        <w:t>首批场景</w:t>
+      </w:r>
+      <w:r>
+        <w:rPr>
+          <w:rFonts w:ascii="PingFang SC" w:hAnsi="PingFang SC" w:hint="eastAsia" w:eastAsia="PingFang SC" w:cs="PingFang SC"/>
+          <w:b w:val="0"/>
+          <w:color w:val="000000"/>
+          <w:sz w:val="28"/>
+        </w:rPr>
+        <w:t>：马来西亚轨道交通项目的业主及分包函件分析与回复、现场质量安全事件闭环处置。</w:t>
+      </w:r>
+    </w:p>
+    <w:p>
+      <w:pPr>
+        <w:spacing w:line="324" w:lineRule="auto" w:after="40"/>
+        <w:ind w:left="835" w:hanging="403"/>
+        <w:jc w:val="both"/>
+      </w:pPr>
+      <w:r>
+        <w:rPr>
+          <w:rFonts w:ascii="PingFang SC" w:hAnsi="PingFang SC" w:hint="eastAsia" w:eastAsia="PingFang SC" w:cs="PingFang SC"/>
+          <w:b/>
+          <w:color w:val="000000"/>
+          <w:sz w:val="28"/>
+        </w:rPr>
+        <w:t xml:space="preserve">• </w:t>
+      </w:r>
+      <w:r>
+        <w:rPr>
+          <w:rFonts w:ascii="PingFang SC" w:hAnsi="PingFang SC" w:hint="eastAsia" w:eastAsia="PingFang SC" w:cs="PingFang SC"/>
+          <w:b/>
+          <w:color w:val="000000"/>
+          <w:sz w:val="28"/>
+        </w:rPr>
+        <w:t>核心机制</w:t>
+      </w:r>
+      <w:r>
+        <w:rPr>
+          <w:rFonts w:ascii="PingFang SC" w:hAnsi="PingFang SC" w:hint="eastAsia" w:eastAsia="PingFang SC" w:cs="PingFang SC"/>
+          <w:b w:val="0"/>
+          <w:color w:val="000000"/>
+          <w:sz w:val="28"/>
+        </w:rPr>
+        <w:t>：AI 负责理解与辅助决策，人负责审批授权，系统负责执行留痕，独立核验负责确认结果。</w:t>
+      </w:r>
+    </w:p>
+    <w:p>
+      <w:pPr>
+        <w:spacing w:line="324" w:lineRule="auto" w:after="40"/>
+        <w:ind w:left="835" w:hanging="403"/>
+        <w:jc w:val="both"/>
+      </w:pPr>
+      <w:r>
+        <w:rPr>
+          <w:rFonts w:ascii="PingFang SC" w:hAnsi="PingFang SC" w:hint="eastAsia" w:eastAsia="PingFang SC" w:cs="PingFang SC"/>
+          <w:b/>
+          <w:color w:val="000000"/>
+          <w:sz w:val="28"/>
+        </w:rPr>
+        <w:t xml:space="preserve">• </w:t>
+      </w:r>
+      <w:r>
+        <w:rPr>
+          <w:rFonts w:ascii="PingFang SC" w:hAnsi="PingFang SC" w:hint="eastAsia" w:eastAsia="PingFang SC" w:cs="PingFang SC"/>
+          <w:b/>
+          <w:color w:val="000000"/>
+          <w:sz w:val="28"/>
+        </w:rPr>
+        <w:t>当前进展</w:t>
+      </w:r>
+      <w:r>
+        <w:rPr>
+          <w:rFonts w:ascii="PingFang SC" w:hAnsi="PingFang SC" w:hint="eastAsia" w:eastAsia="PingFang SC" w:cs="PingFang SC"/>
+          <w:b w:val="0"/>
+          <w:color w:val="000000"/>
+          <w:sz w:val="28"/>
+        </w:rPr>
+        <w:t>：已在线运行；30 条合成评测用例全部通过，207 项自动化测试通过；均为合成数据环境下的工程验证。</w:t>
+      </w:r>
+    </w:p>
+    <w:p>
+      <w:pPr>
+        <w:spacing w:line="324" w:lineRule="auto" w:after="40"/>
+        <w:ind w:left="835" w:hanging="403"/>
+        <w:jc w:val="both"/>
+      </w:pPr>
+      <w:r>
+        <w:rPr>
+          <w:rFonts w:ascii="PingFang SC" w:hAnsi="PingFang SC" w:hint="eastAsia" w:eastAsia="PingFang SC" w:cs="PingFang SC"/>
+          <w:b/>
+          <w:color w:val="000000"/>
+          <w:sz w:val="28"/>
+        </w:rPr>
+        <w:t xml:space="preserve">• </w:t>
+      </w:r>
+      <w:r>
+        <w:rPr>
+          <w:rFonts w:ascii="PingFang SC" w:hAnsi="PingFang SC" w:hint="eastAsia" w:eastAsia="PingFang SC" w:cs="PingFang SC"/>
+          <w:b/>
+          <w:color w:val="000000"/>
+          <w:sz w:val="28"/>
+        </w:rPr>
+        <w:t>推广方式</w:t>
+      </w:r>
+      <w:r>
+        <w:rPr>
+          <w:rFonts w:ascii="PingFang SC" w:hAnsi="PingFang SC" w:hint="eastAsia" w:eastAsia="PingFang SC" w:cs="PingFang SC"/>
+          <w:b w:val="0"/>
+          <w:color w:val="000000"/>
+          <w:sz w:val="28"/>
+        </w:rPr>
+        <w:t>：以国家包和领域包复制到新的国家和项目，首批覆盖马来西亚、印度尼西亚、沙特阿拉伯和阿联酋。</w:t>
       </w:r>
     </w:p>
     <w:p>
@@ -164,7 +344,7 @@
           <w:color w:val="000000"/>
           <w:sz w:val="30"/>
         </w:rPr>
-        <w:t>本作品覆盖 AI 出海赛道的三个方向。工具出海由双语事件接入、合同与法规证据检索和多语言办公支撑；属地融合由国家包、属地术语、许可关卡和本地化 HSE 培训支撑；能力输出由项目级运营数字孪生及 IFC、GLTF、3D Tiles、GeoJSON、WMS、IoT 六类接口支撑。系统已经部署为可访问的 Web 与 API 服务，参赛页面可运行一条马来西亚轨道项目高处作业事件的七步黄金主线。</w:t>
+        <w:t>GlobalInfra AI 面向海外交通基础设施项目，将现场事件、国家规则、工程知识、合同责任、进度成本、数字孪生、多智能体分析、人工审批和工具执行连接为可审计的业务闭环。系统以工程案例（每条现场事件或来函形成的可追踪处理记录，系统界面中称“工单”）而非聊天记录作为业务主线，以稳定的 Twin ID（每个工程对象唯一的数字孪生编码）连接空间对象和全生命周期数据，并要求高风险行动在执行前获得人工批准、在关闭前取得独立核验回执。</w:t>
       </w:r>
     </w:p>
     <w:p>
@@ -181,7 +361,7 @@
           <w:color w:val="000000"/>
           <w:sz w:val="30"/>
         </w:rPr>
-        <w:t>V4.3 把智能助手作为默认入口。用户用一句话或一份函件发起任务，大模型结合最近对话从六个固定工具中选择处理方式：上报事件、查询法规、查询已有工单、项目进展、待审批和直接答复。工具名受 JSON schema 枚举约束，工单号和项目编号必须在数据库中真实存在；法规回答只能依据检索到的来源并逐句引用，来源卡片可展开到条文、主管机关、版本和官方链接；回复函在全部人工审批后才由大模型起草，引用必须属于该工单证据，否则退回模板。审批、执行、核验和关闭不是模型工具，只能由有权限的人点击确认。对话只是入口，工单仍是业务实体。</w:t>
+        <w:t>本作品覆盖 AI 出海赛道的三个方向。工具出海由双语事件接入、合同与法规证据检索和多语言办公支撑；属地融合由国家包（封装某一国家语言术语、法规来源、主管机关和许可要求的配置包）、属地术语、许可关卡和本地化 HSE 培训支撑；能力输出由项目级运营数字孪生及 IFC、GLTF、3D Tiles、GeoJSON、WMS、IoT 六类接口支撑。系统已经部署为可访问的 Web 与 API 服务，参赛页面可运行一条马来西亚轨道项目高处作业事件的七步黄金主线。</w:t>
       </w:r>
     </w:p>
     <w:p>
@@ -198,7 +378,24 @@
           <w:color w:val="000000"/>
           <w:sz w:val="30"/>
         </w:rPr>
-        <w:t>截至 2026 年 10 月 14 日，版本化 AI 出海评测集包含 30 条合成用例，覆盖多语事件、法规许可、合同索赔、属地 HSE 培训和数字孪生运营五类任务。当前确定性评测中 30 条全部通过；国家、生命周期、风险、工单类型、Top 3 证据召回、引用完整、无证据拒答、结构化输出和离线降级门禁均达到 100%。该结果用于证明当前测试集上的可复现性，不等同于真实项目上的统计性能，也不代替属地专业判断。该评测集覆盖接入、路由和检索路径，不覆盖智能助手的对话意图规划；后者目前由自动化测试和线上人工核查验证，尚无量化评测。</w:t>
+        <w:t>V4.3 把智能助手作为默认入口。用户用一句话或一份函件发起任务，大模型结合最近对话从六个固定工具中选择处理方式：上报事件、查询法规、查询已有案例、项目进展、待审批和直接答复。工具名受 JSON schema 枚举约束，案例号和项目编号必须在数据库中真实存在；法规回答只能依据检索到的来源并逐句引用，来源卡片可展开到条文、主管机关、版本和官方链接；回复函在全部人工审批后才由大模型起草，引用必须属于该案例证据，否则退回模板。审批、执行、核验和关闭不是模型工具，只能由有权限的人点击确认。对话只是入口，案例仍是业务实体。</w:t>
+      </w:r>
+    </w:p>
+    <w:p>
+      <w:pPr>
+        <w:widowControl/>
+        <w:spacing w:line="348" w:lineRule="auto" w:after="0"/>
+        <w:ind w:firstLine="639"/>
+        <w:jc w:val="both"/>
+      </w:pPr>
+      <w:r>
+        <w:rPr>
+          <w:rFonts w:ascii="PingFang SC" w:hAnsi="PingFang SC" w:hint="eastAsia" w:eastAsia="PingFang SC" w:cs="PingFang SC"/>
+          <w:b w:val="0"/>
+          <w:color w:val="000000"/>
+          <w:sz w:val="30"/>
+        </w:rPr>
+        <w:t>截至 2026 年 10 月 14 日，版本化 AI 出海评测集包含 30 条合成用例，覆盖多语事件、法规许可、合同索赔、属地 HSE 培训和数字孪生运营五类任务。当前确定性评测中 30 条全部通过；国家、生命周期、风险、案例类型、Top 3 证据召回、引用完整、无证据拒答、结构化输出和离线降级门禁均达到 100%。该结果用于证明当前测试集上的可复现性，不等同于真实项目上的统计性能，也不代替属地专业判断。该评测集覆盖接入、路由和检索路径，不覆盖智能助手的对话意图规划；后者目前由自动化测试和线上人工核查验证，尚无量化评测。</w:t>
       </w:r>
     </w:p>
     <w:p>
@@ -234,7 +431,7 @@
           <w:color w:val="000000"/>
           <w:sz w:val="32"/>
         </w:rPr>
-        <w:t>一 应用场景介绍</w:t>
+        <w:t>一、应用场景介绍</w:t>
       </w:r>
     </w:p>
     <w:p>
@@ -252,7 +449,7 @@
           <w:color w:val="000000"/>
           <w:sz w:val="30"/>
         </w:rPr>
-        <w:t>一 海外交通项目的业务背景</w:t>
+        <w:t>（一）海外交通项目的业务背景</w:t>
       </w:r>
     </w:p>
     <w:p>
@@ -286,7 +483,7 @@
           <w:color w:val="000000"/>
           <w:sz w:val="30"/>
         </w:rPr>
-        <w:t>传统方案通常把知识库、翻译、合同问答、HSE 和数字孪生分别建设。用户可以获得一段回答或一个三维画面，却很难证明回答来自哪一版文件、是否适用于项目所在国、谁批准了对外行动、工具是否真正执行，以及执行结果是否经过独立核验。GlobalInfra AI 将这些问题收敛到统一的项目工单和数字主线中，使分析、审批、执行与核验共享同一组项目、事件、证据和 Twin ID。</w:t>
+        <w:t>传统方案通常把知识库、翻译、合同问答、HSE 和数字孪生分别建设。用户可以获得一段回答或一个三维画面，却很难证明回答来自哪一版文件、是否适用于项目所在国、谁批准了对外行动、工具是否真正执行，以及执行结果是否经过独立核验。GlobalInfra AI 将这些问题收敛到统一的项目案例和数字主线中，使分析、审批、执行与核验共享同一组项目、事件、证据和 Twin ID。</w:t>
       </w:r>
     </w:p>
     <w:p>
@@ -304,7 +501,7 @@
           <w:color w:val="000000"/>
           <w:sz w:val="30"/>
         </w:rPr>
-        <w:t>二 目标用户与典型任务</w:t>
+        <w:t>（二）目标用户与典型任务</w:t>
       </w:r>
     </w:p>
     <w:tbl>
@@ -1236,7 +1433,7 @@
           <w:color w:val="000000"/>
           <w:sz w:val="30"/>
         </w:rPr>
-        <w:t>三 核心痛点和系统需求</w:t>
+        <w:t>（三）核心痛点和系统需求</w:t>
       </w:r>
     </w:p>
     <w:tbl>
@@ -1437,7 +1634,7 @@
                 <w:color w:val="000000"/>
                 <w:sz w:val="21"/>
               </w:rPr>
-              <w:t>工单分类、责任和紧急程度被误读</w:t>
+              <w:t>案例分类、责任和紧急程度被误读</w:t>
             </w:r>
           </w:p>
         </w:tc>
@@ -1812,7 +2009,7 @@
                 <w:color w:val="000000"/>
                 <w:sz w:val="21"/>
               </w:rPr>
-              <w:t>由工单路由器组建最小专家团队并形成共享行动计划</w:t>
+              <w:t>由案例路由器组建最小专家团队并形成共享行动计划</w:t>
             </w:r>
           </w:p>
         </w:tc>
@@ -2038,7 +2235,7 @@
                 <w:color w:val="000000"/>
                 <w:sz w:val="21"/>
               </w:rPr>
-              <w:t>Twin ID 连接 BIM GIS WBS 成本 调试 遥测和维护</w:t>
+              <w:t>Twin ID 连接 BIM、GIS、WBS、成本、调试、遥测和维护</w:t>
             </w:r>
           </w:p>
         </w:tc>
@@ -2177,7 +2374,7 @@
           <w:color w:val="000000"/>
           <w:sz w:val="30"/>
         </w:rPr>
-        <w:t>四 参赛黄金场景</w:t>
+        <w:t>（四）首批落地场景</w:t>
       </w:r>
     </w:p>
     <w:p>
@@ -2194,25 +2391,7 @@
           <w:color w:val="000000"/>
           <w:sz w:val="30"/>
         </w:rPr>
-        <w:t xml:space="preserve">黄金场景采用合成的马来西亚轨道项目 MY RAIL A。系统接收一条中英文混合的业主通知：S12 车站一名工人在高处作业时靠近无防护临边，需要立即核验坠落防护、作业许可证和胜任人员证据。系统识别国家为马来西亚、生命周期为施工、专业为 HSE、风险为 CRITICAL，并将事件绑定到 Twin ID </w:t>
-      </w:r>
-      <w:r>
-        <w:rPr>
-          <w:rFonts w:ascii="Consolas" w:hAnsi="Consolas" w:hint="default" w:eastAsia="Consolas" w:cs="Consolas"/>
-          <w:b w:val="0"/>
-          <w:color w:val="000000"/>
-          <w:sz w:val="21"/>
-        </w:rPr>
-        <w:t>TWIN-MYRAIL-V12-P47</w:t>
-      </w:r>
-      <w:r>
-        <w:rPr>
-          <w:rFonts w:ascii="PingFang SC" w:hAnsi="PingFang SC" w:hint="eastAsia" w:eastAsia="PingFang SC" w:cs="PingFang SC"/>
-          <w:b w:val="0"/>
-          <w:color w:val="000000"/>
-          <w:sz w:val="30"/>
-        </w:rPr>
-        <w:t>。</w:t>
+        <w:t>首批聚焦马来西亚轨道交通项目的两类高频业务，均使用合成数据演示。</w:t>
       </w:r>
     </w:p>
     <w:p>
@@ -2225,11 +2404,20 @@
       <w:r>
         <w:rPr>
           <w:rFonts w:ascii="PingFang SC" w:hAnsi="PingFang SC" w:hint="eastAsia" w:eastAsia="PingFang SC" w:cs="PingFang SC"/>
+          <w:b/>
+          <w:color w:val="000000"/>
+          <w:sz w:val="30"/>
+        </w:rPr>
+        <w:t>场景一：现场安全事件闭环（参赛黄金主线）。</w:t>
+      </w:r>
+      <w:r>
+        <w:rPr>
+          <w:rFonts w:ascii="PingFang SC" w:hAnsi="PingFang SC" w:hint="eastAsia" w:eastAsia="PingFang SC" w:cs="PingFang SC"/>
           <w:b w:val="0"/>
           <w:color w:val="000000"/>
           <w:sz w:val="30"/>
         </w:rPr>
-        <w:t xml:space="preserve">随后，马来西亚国家包提供 DOSH、CIDB 和地方审批来源索引；知识检索返回项目 HSE 手册和官方来源；七个专业智能体形成响应计划；项目经理与 HSE 经理完成审批；受管控工具生成 </w:t>
+        <w:t xml:space="preserve"> 黄金场景采用合成的马来西亚轨道项目 MY-RAIL-A。系统接收一条中英文混合的业主通知：S12 车站一名工人在高处作业时靠近无防护临边，需要立即核验坠落防护、作业许可证和胜任人员证据。系统识别国家为马来西亚、生命周期为施工、专业为 HSE、风险为 CRITICAL，并将事件绑定到 Twin ID </w:t>
       </w:r>
       <w:r>
         <w:rPr>
@@ -2238,7 +2426,7 @@
           <w:color w:val="000000"/>
           <w:sz w:val="21"/>
         </w:rPr>
-        <w:t>DRAFT_ONLY_NOT_SENT</w:t>
+        <w:t>TWIN-MYRAIL-V12-P47</w:t>
       </w:r>
       <w:r>
         <w:rPr>
@@ -2247,7 +2435,68 @@
           <w:color w:val="000000"/>
           <w:sz w:val="30"/>
         </w:rPr>
-        <w:t xml:space="preserve"> 的业主回复草案；独立核验器检查审批关联、执行回执、产物、哈希、证据引用和输出契约。只有六项检查全部通过，工单才关闭。整个过程不发送邮件，不修改真实资产状态。</w:t>
+        <w:t>。</w:t>
+      </w:r>
+    </w:p>
+    <w:p>
+      <w:pPr>
+        <w:widowControl/>
+        <w:spacing w:line="348" w:lineRule="auto" w:after="0"/>
+        <w:ind w:firstLine="639"/>
+        <w:jc w:val="both"/>
+      </w:pPr>
+      <w:r>
+        <w:rPr>
+          <w:rFonts w:ascii="PingFang SC" w:hAnsi="PingFang SC" w:hint="eastAsia" w:eastAsia="PingFang SC" w:cs="PingFang SC"/>
+          <w:b w:val="0"/>
+          <w:color w:val="000000"/>
+          <w:sz w:val="30"/>
+        </w:rPr>
+        <w:t xml:space="preserve">随后，马来西亚国家包提供 DOSH、CIDB 和地方审批来源索引；知识检索返回项目 HSE 手册和官方来源；七个专业智能体形成响应计划；项目经理与 HSE 经理完成审批；受管控工具生成 </w:t>
+      </w:r>
+      <w:r>
+        <w:rPr>
+          <w:rFonts w:ascii="Consolas" w:hAnsi="Consolas" w:hint="default" w:eastAsia="Consolas" w:cs="Consolas"/>
+          <w:b w:val="0"/>
+          <w:color w:val="000000"/>
+          <w:sz w:val="21"/>
+        </w:rPr>
+        <w:t>DRAFT_ONLY_NOT_SENT</w:t>
+      </w:r>
+      <w:r>
+        <w:rPr>
+          <w:rFonts w:ascii="PingFang SC" w:hAnsi="PingFang SC" w:hint="eastAsia" w:eastAsia="PingFang SC" w:cs="PingFang SC"/>
+          <w:b w:val="0"/>
+          <w:color w:val="000000"/>
+          <w:sz w:val="30"/>
+        </w:rPr>
+        <w:t xml:space="preserve"> 的业主回复草案；独立核验器检查审批关联、执行回执、产物、哈希、证据引用和输出契约。只有六项检查全部通过，案例才关闭。整个过程不发送邮件，不修改真实资产状态。</w:t>
+      </w:r>
+    </w:p>
+    <w:p>
+      <w:pPr>
+        <w:widowControl/>
+        <w:spacing w:line="348" w:lineRule="auto" w:after="0"/>
+        <w:ind w:firstLine="639"/>
+        <w:jc w:val="both"/>
+      </w:pPr>
+      <w:r>
+        <w:rPr>
+          <w:rFonts w:ascii="PingFang SC" w:hAnsi="PingFang SC" w:hint="eastAsia" w:eastAsia="PingFang SC" w:cs="PingFang SC"/>
+          <w:b/>
+          <w:color w:val="000000"/>
+          <w:sz w:val="30"/>
+        </w:rPr>
+        <w:t>场景二：业主及分包函件的分析与回复。</w:t>
+      </w:r>
+      <w:r>
+        <w:rPr>
+          <w:rFonts w:ascii="PingFang SC" w:hAnsi="PingFang SC" w:hint="eastAsia" w:eastAsia="PingFang SC" w:cs="PingFang SC"/>
+          <w:b w:val="0"/>
+          <w:color w:val="000000"/>
+          <w:sz w:val="30"/>
+        </w:rPr>
+        <w:t xml:space="preserve"> 用户在智能助手中上传一份合成的分包商变更申请函，并提问“如何回复此信函”。系统以函件主题作为案例标题，识别为合同与技术接口类、变更申请和工期影响，路由到马来西亚项目，由合同、工程和接口智能体依据变更条款和变更处理程序给出处置计划。全部人工审批后，大模型依据来函、专家结论和已引用证据起草中英文回复：确认收函、要求补充书面指令和计价资料、保留合同权利，未知信息以 [●] 占位；草稿未发送，并经同一套独立核验后关闭。</w:t>
       </w:r>
     </w:p>
     <w:p>
@@ -2323,7 +2572,7 @@
           <w:color w:val="000000"/>
           <w:sz w:val="32"/>
         </w:rPr>
-        <w:t>二 总体方案与架构设计</w:t>
+        <w:t>二、总体方案与架构设计</w:t>
       </w:r>
     </w:p>
     <w:p>
@@ -2341,7 +2590,7 @@
           <w:color w:val="000000"/>
           <w:sz w:val="30"/>
         </w:rPr>
-        <w:t>一 产品定位</w:t>
+        <w:t>（一）产品定位</w:t>
       </w:r>
     </w:p>
     <w:p>
@@ -2358,7 +2607,7 @@
           <w:color w:val="000000"/>
           <w:sz w:val="30"/>
         </w:rPr>
-        <w:t>GlobalInfra AI 是面向海外交通基础设施项目的可信 AI 执行与运营数字孪生平台。用户通过智能助手用自然语言发起任务，平台在后台以项目事件和工单作为业务主线，以国家包和知识网络提供属地证据，以多智能体形成跨专业建议，以人工审批控制高风险行动，以执行和核验回执证明闭环完成。系统服务于铁路、公路、桥梁、隧道、港口、机场和城市基础设施等场景。</w:t>
+        <w:t>GlobalInfra AI——全球交通基础设施智能决策与协同执行平台是面向海外交通基础设施项目的智能决策与协同执行平台，具备智能助手、受控闭环执行和运营数字孪生能力。用户通过智能助手用自然语言发起任务，平台在后台以项目事件和案例作为业务主线，以国家包和知识网络提供属地证据，以多智能体形成跨专业建议，以人工审批控制高风险行动，以执行和核验回执证明闭环完成。系统服务于铁路、公路、桥梁、隧道、港口、机场和城市基础设施等场景。</w:t>
       </w:r>
     </w:p>
     <w:p>
@@ -2376,7 +2625,7 @@
           <w:color w:val="000000"/>
           <w:sz w:val="30"/>
         </w:rPr>
-        <w:t>二 总体技术架构</w:t>
+        <w:t>（二）总体技术架构</w:t>
       </w:r>
     </w:p>
     <w:p>
@@ -2450,7 +2699,7 @@
           <w:color w:val="000000"/>
           <w:sz w:val="30"/>
         </w:rPr>
-        <w:t>架构由五层组成。接入层通过智能助手对话入口和专用页面接收文本、PDF、DOCX、TXT、现场观察、企业连接器、BIM GIS 和遥测；智能层执行分类抽取、检索、智能体协同、模型路由和策略判断；项目数字主线将组织、项目、生命周期、领域、事件、工单、证据、决策、行动和核验连接起来；数字孪生层以稳定 Twin ID 承载模型、4D 进度、5D 成本、调试、遥测和维护状态；治理层提供身份、权限、审计、审批、数据边界、执行回执和独立核验。</w:t>
+        <w:t>架构由五层组成。接入层通过智能助手对话入口和专用页面接收文本、PDF、DOCX、TXT、现场观察、企业连接器、BIM、GIS 和遥测；智能层执行分类抽取、检索、智能体协同、模型路由和策略判断；项目数字主线将组织、项目、生命周期、领域、事件、案例、证据、决策、行动和核验连接起来；数字孪生层以稳定 Twin ID 承载模型、4D 进度、5D 成本、调试、遥测和维护状态；治理层提供身份、权限、审计、审批、数据边界、执行回执和独立核验。</w:t>
       </w:r>
     </w:p>
     <w:p>
@@ -2468,7 +2717,7 @@
           <w:color w:val="000000"/>
           <w:sz w:val="30"/>
         </w:rPr>
-        <w:t>三 全生命周期与专业领域</w:t>
+        <w:t>（三）全生命周期与专业领域</w:t>
       </w:r>
     </w:p>
     <w:p>
@@ -2485,7 +2734,7 @@
           <w:color w:val="000000"/>
           <w:sz w:val="30"/>
         </w:rPr>
-        <w:t>平台覆盖投标、规划、设计、采购、施工、调试、移交和运维八个阶段。业务能力按八个智能领域组织，并承载二十四个专业域。各专业域共享同一套项目主数据、工单、证据和行动状态，避免把功能拆成互不相连的独立应用。</w:t>
+        <w:t>平台覆盖投标、规划、设计、采购、施工、调试、移交和运维八个阶段。业务能力按八个智能领域组织，并承载二十四个专业域；铁路、公路、港口等交通行业语义以领域包（按行业封装的术语、对象和规则）提供。各专业域共享同一套项目主数据、案例、证据和行动状态，避免把功能拆成互不相连的独立应用。</w:t>
       </w:r>
     </w:p>
     <w:tbl>
@@ -3477,7 +3726,7 @@
                 <w:color w:val="000000"/>
                 <w:sz w:val="21"/>
               </w:rPr>
-              <w:t>Commissioning；Asset and O and M</w:t>
+              <w:t>Commissioning；Asset and O&amp;M</w:t>
             </w:r>
           </w:p>
         </w:tc>
@@ -3539,7 +3788,7 @@
           <w:color w:val="000000"/>
           <w:sz w:val="30"/>
         </w:rPr>
-        <w:t>四 可信执行流程</w:t>
+        <w:t>（四）闭环执行流程</w:t>
       </w:r>
     </w:p>
     <w:p>
@@ -3794,7 +4043,7 @@
                 <w:color w:val="000000"/>
                 <w:sz w:val="21"/>
               </w:rPr>
-              <w:t>工单路由器和专业智能体</w:t>
+              <w:t>案例路由器和专业智能体</w:t>
             </w:r>
           </w:p>
         </w:tc>
@@ -4488,7 +4737,7 @@
           <w:color w:val="000000"/>
           <w:sz w:val="30"/>
         </w:rPr>
-        <w:t>五 企业集成与部署</w:t>
+        <w:t>（五）企业集成与部署</w:t>
       </w:r>
     </w:p>
     <w:p>
@@ -4576,7 +4825,7 @@
           <w:color w:val="000000"/>
           <w:sz w:val="30"/>
         </w:rPr>
-        <w:t xml:space="preserve"> 三种运行时路由。</w:t>
+        <w:t xml:space="preserve"> 三种运行时路由。本地部署采用 Ollama 运行开源模型 Qwen3-8B；云端通过 OpenAI 兼容接口调用，线上演示使用 OpenAI GPT 系列模型；DeepSeek 等提供 OpenAI 兼容接口的模型可通过配置接入，尚未纳入本次测试。数据分为 public、internal、restricted 三级，其中 </w:t>
       </w:r>
       <w:r>
         <w:rPr>
@@ -4613,7 +4862,7 @@
           <w:color w:val="000000"/>
           <w:sz w:val="32"/>
         </w:rPr>
-        <w:t>三 关键技术</w:t>
+        <w:t>三、关键技术</w:t>
       </w:r>
     </w:p>
     <w:p>
@@ -4631,7 +4880,7 @@
           <w:color w:val="000000"/>
           <w:sz w:val="30"/>
         </w:rPr>
-        <w:t>一 通用接入与结构化理解</w:t>
+        <w:t>（一）通用接入与结构化理解</w:t>
       </w:r>
     </w:p>
     <w:p>
@@ -4666,7 +4915,7 @@
           <w:color w:val="000000"/>
           <w:sz w:val="30"/>
         </w:rPr>
-        <w:t>，其中包括国家、语言、生命周期、工单类型、风险、问题、实体、期限、推荐智能体、审批角色和置信度。确定性规则作为默认权威层；可选模型层只能从受约束词汇表中选择结果，实体和期限还需要在原文中通过落地校验。系统保存输入哈希和来源引用，以便重复提交去重和审计。</w:t>
+        <w:t>，其中包括国家、语言、生命周期、案例类型、风险、问题、实体、期限、推荐智能体、审批角色和置信度。确定性规则作为默认权威层；可选模型层只能从受约束词汇表中选择结果，实体和期限还需要在原文中通过落地校验。系统保存输入哈希和来源引用，以便重复提交去重和审计。</w:t>
       </w:r>
     </w:p>
     <w:p>
@@ -4684,7 +4933,7 @@
           <w:color w:val="000000"/>
           <w:sz w:val="30"/>
         </w:rPr>
-        <w:t>二 国家包与可治理知识网络</w:t>
+        <w:t>（二）国家包与可治理知识网络</w:t>
       </w:r>
     </w:p>
     <w:p>
@@ -4754,7 +5003,7 @@
           <w:color w:val="000000"/>
           <w:sz w:val="30"/>
         </w:rPr>
-        <w:t>三 多智能体协同</w:t>
+        <w:t>（三）多智能体协同</w:t>
       </w:r>
     </w:p>
     <w:p>
@@ -4771,7 +5020,7 @@
           <w:color w:val="000000"/>
           <w:sz w:val="30"/>
         </w:rPr>
-        <w:t>工单路由器根据事件类型和风险选择最小专业团队，而不是每次运行所有智能体。黄金场景由 Case Intake、HSE、Compliance、Workforce、Localization、Planning 和 Verification 七个智能体组成。每个智能体具有明确角色、结构化输入输出、允许工具、证据策略、风险等级和审批策略。最终行动计划保留各智能体的运行状态、摘要和耗时。</w:t>
+        <w:t>案例路由器根据事件类型和风险选择最小专业团队，而不是每次运行所有智能体。黄金场景由 Case Intake、HSE、Compliance、Workforce、Localization、Planning 和 Verification 七个智能体组成。每个智能体具有明确角色、结构化输入输出、允许工具、证据策略、风险等级和审批策略。最终行动计划保留各智能体的运行状态、摘要和耗时。</w:t>
       </w:r>
     </w:p>
     <w:p>
@@ -4789,7 +5038,7 @@
           <w:color w:val="000000"/>
           <w:sz w:val="30"/>
         </w:rPr>
-        <w:t>四 模型路由与可信降级</w:t>
+        <w:t>（四）模型路由与离线降级</w:t>
       </w:r>
     </w:p>
     <w:p>
@@ -4860,7 +5109,7 @@
           <w:color w:val="000000"/>
           <w:sz w:val="30"/>
         </w:rPr>
-        <w:t>五 运营数字孪生</w:t>
+        <w:t>（五）运营数字孪生</w:t>
       </w:r>
     </w:p>
     <w:p>
@@ -4894,7 +5143,7 @@
           <w:color w:val="000000"/>
           <w:sz w:val="30"/>
         </w:rPr>
-        <w:t>内置模型和遥测均为遵循接口契约的合成实例，不宣称为竣工模型或实时客户数据。真实项目接入需要模型转换 Worker、对象存储、坐标系验证、MQTT BMS SCADA 适配器及项目级授权。</w:t>
+        <w:t>内置模型和遥测均为遵循接口契约的合成实例，不宣称为竣工模型或实时客户数据。真实项目接入需要模型转换 Worker、对象存储、坐标系验证、MQTT、BMS、SCADA 适配器及项目级授权。</w:t>
       </w:r>
     </w:p>
     <w:p>
@@ -4912,7 +5161,7 @@
           <w:color w:val="000000"/>
           <w:sz w:val="30"/>
         </w:rPr>
-        <w:t>六 内容寻址与独立核验</w:t>
+        <w:t>（六）内容寻址与独立核验</w:t>
       </w:r>
     </w:p>
     <w:p>
@@ -4929,7 +5178,7 @@
           <w:color w:val="000000"/>
           <w:sz w:val="30"/>
         </w:rPr>
-        <w:t>执行工具按输入和输出内容计算 SHA 256 摘要，生成不可混淆的产物引用。独立核验器检查审批关联、执行回执、产物存在性、产物摘要、证据引用和输出契约。执行和核验由不同函数与不同回执对象完成，避免同一推理步骤自我证明。重复执行使用幂等键，不会无意重复产生外部动作。</w:t>
+        <w:t>执行工具按输入和输出内容计算 SHA-256 摘要，生成不可混淆的产物引用。独立核验器检查审批关联、执行回执、产物存在性、产物摘要、证据引用和输出契约。执行和核验由不同函数与不同回执对象完成，避免同一推理步骤自我证明。重复执行使用幂等键，不会无意重复产生外部动作。</w:t>
       </w:r>
     </w:p>
     <w:p>
@@ -4947,7 +5196,7 @@
           <w:color w:val="000000"/>
           <w:sz w:val="30"/>
         </w:rPr>
-        <w:t>七 安全与运行保障</w:t>
+        <w:t>（七）安全与运行保障</w:t>
       </w:r>
     </w:p>
     <w:p>
@@ -4982,7 +5231,7 @@
           <w:color w:val="000000"/>
           <w:sz w:val="30"/>
         </w:rPr>
-        <w:t>八 对话智能体与受约束工具调用</w:t>
+        <w:t>（八）对话智能体与受约束工具调用</w:t>
       </w:r>
     </w:p>
     <w:p>
@@ -5017,7 +5266,7 @@
           <w:color w:val="000000"/>
           <w:sz w:val="30"/>
         </w:rPr>
-        <w:t xml:space="preserve"> 是一个受约束的规划器，而不是新的推理引擎。配置模型时，模型读取当前消息和最近八轮对话，只能输出一个 JSON 对象：工具名、检索查询、工单号、项目编号和直接答复。工具名是 schema 枚举；工单号和项目编号必须能在数据库中查到；任何越界、格式错误或无法核实的结果都会退回确定性关键词规划器。未配置模型时只使用规则，因此离线和 CI 行为保持确定。</w:t>
+        <w:t xml:space="preserve"> 是一个受约束的规划器，而不是新的推理引擎。配置模型时，模型读取当前消息和最近八轮对话，只能输出一个 JSON 对象：工具名、检索查询、案例号、项目编号和直接答复。工具名是 schema 枚举；案例号和项目编号必须能在数据库中查到；任何越界、格式错误或无法核实的结果都会退回确定性关键词规划器。未配置模型时只使用规则，因此离线和 CI 行为保持确定。</w:t>
       </w:r>
     </w:p>
     <w:tbl>
@@ -5783,7 +6032,7 @@
                 <w:color w:val="000000"/>
                 <w:sz w:val="21"/>
               </w:rPr>
-              <w:t>起草提示禁止承认责任、费用和工期，未知信息用 [●] 占位；引用须属于本工单证据，否则退回模板</w:t>
+              <w:t>起草提示禁止承认责任、费用和工期，未知信息用 [●] 占位；引用须属于本案例证据，否则退回模板</w:t>
             </w:r>
           </w:p>
         </w:tc>
@@ -5863,7 +6112,7 @@
           <w:color w:val="000000"/>
           <w:sz w:val="32"/>
         </w:rPr>
-        <w:t>四 功能模块设计</w:t>
+        <w:t>四、功能模块设计</w:t>
       </w:r>
     </w:p>
     <w:p>
@@ -5881,7 +6130,7 @@
           <w:color w:val="000000"/>
           <w:sz w:val="30"/>
         </w:rPr>
-        <w:t>一 智能助手对话入口</w:t>
+        <w:t>（一）智能助手对话入口</w:t>
       </w:r>
     </w:p>
     <w:p>
@@ -6099,7 +6348,7 @@
                 <w:color w:val="000000"/>
                 <w:sz w:val="21"/>
               </w:rPr>
-              <w:t>建立工单并运行专家分析；项目无法识别时请用户确认项目，系统不代为猜测</w:t>
+              <w:t>建立案例并运行专家分析；项目无法识别时请用户确认项目，系统不代为猜测</w:t>
             </w:r>
           </w:p>
         </w:tc>
@@ -6289,7 +6538,7 @@
                 <w:color w:val="000000"/>
                 <w:sz w:val="21"/>
               </w:rPr>
-              <w:t>追问已有工单</w:t>
+              <w:t>追问已有案例</w:t>
             </w:r>
           </w:p>
         </w:tc>
@@ -6325,7 +6574,7 @@
                 <w:color w:val="000000"/>
                 <w:sz w:val="21"/>
               </w:rPr>
-              <w:t>结合对话上下文定位工单</w:t>
+              <w:t>结合对话上下文定位案例</w:t>
             </w:r>
           </w:p>
         </w:tc>
@@ -6361,7 +6610,7 @@
                 <w:color w:val="000000"/>
                 <w:sz w:val="21"/>
               </w:rPr>
-              <w:t>工单状态卡和下一步操作</w:t>
+              <w:t>案例状态卡和下一步操作</w:t>
             </w:r>
           </w:p>
         </w:tc>
@@ -6608,7 +6857,7 @@
         <w:drawing>
           <wp:inline xmlns:a="http://schemas.openxmlformats.org/drawingml/2006/main" xmlns:pic="http://schemas.openxmlformats.org/drawingml/2006/picture">
             <wp:extent cx="3931920" cy="2673706"/>
-            <wp:docPr id="3" name="Picture 3" descr="图 4 智能助手接收函件并建立工单" title="图 4 智能助手接收函件并建立工单"/>
+            <wp:docPr id="3" name="Picture 3" descr="图 4 智能助手接收函件并建立案例" title="图 4 智能助手接收函件并建立案例"/>
             <wp:cNvGraphicFramePr>
               <a:graphicFrameLocks noChangeAspect="1"/>
             </wp:cNvGraphicFramePr>
@@ -6652,7 +6901,7 @@
           <w:color w:val="000000"/>
           <w:sz w:val="24"/>
         </w:rPr>
-        <w:t>图 4 智能助手接收函件并建立工单</w:t>
+        <w:t>图 4 智能助手接收函件并建立案例</w:t>
       </w:r>
     </w:p>
     <w:p>
@@ -6784,7 +7033,7 @@
           <w:color w:val="000000"/>
           <w:sz w:val="30"/>
         </w:rPr>
-        <w:t>二 七步黄金主线</w:t>
+        <w:t>（二）七步黄金主线</w:t>
       </w:r>
     </w:p>
     <w:tbl>
@@ -7094,7 +7343,7 @@
                 <w:color w:val="000000"/>
                 <w:sz w:val="21"/>
               </w:rPr>
-              <w:t>语言、工单类型、风险、问题和期限</w:t>
+              <w:t>语言、案例类型、风险、问题和期限</w:t>
             </w:r>
           </w:p>
         </w:tc>
@@ -7654,7 +7903,7 @@
                 <w:color w:val="000000"/>
                 <w:sz w:val="21"/>
               </w:rPr>
-              <w:t>项目和工单实体</w:t>
+              <w:t>项目和案例实体</w:t>
             </w:r>
           </w:p>
         </w:tc>
@@ -7803,7 +8052,7 @@
                 <w:color w:val="000000"/>
                 <w:sz w:val="21"/>
               </w:rPr>
-              <w:t>工单、证据和孪生上下文</w:t>
+              <w:t>案例、证据和孪生上下文</w:t>
             </w:r>
           </w:p>
         </w:tc>
@@ -8014,7 +8263,7 @@
           <w:color w:val="000000"/>
           <w:sz w:val="30"/>
         </w:rPr>
-        <w:t>三 项目组合与全生命周期工作台</w:t>
+        <w:t>（三）项目组合与全生命周期工作台</w:t>
       </w:r>
     </w:p>
     <w:p>
@@ -8031,7 +8280,7 @@
           <w:color w:val="000000"/>
           <w:sz w:val="30"/>
         </w:rPr>
-        <w:t>指挥中心（全景页）汇总项目组合、国家、风险、待审批和经核验决策。项目工作台按生命周期显示阶段关口、专业健康和优先工单。用户可以从组合异常进入项目，再进入工单、证据、Twin ID 和执行回执，不需要在多个系统中手工拼接上下文。</w:t>
+        <w:t>指挥中心（全景页）汇总项目组合、国家、风险、待审批和经核验决策。项目工作台按生命周期显示阶段关口、专业健康和优先案例。用户可以从组合异常进入项目，再进入案例、证据、Twin ID 和执行回执，不需要在多个系统中手工拼接上下文。</w:t>
       </w:r>
     </w:p>
     <w:p>
@@ -8049,7 +8298,7 @@
           <w:color w:val="000000"/>
           <w:sz w:val="30"/>
         </w:rPr>
-        <w:t>四 现场移动端</w:t>
+        <w:t>（四）现场移动端</w:t>
       </w:r>
     </w:p>
     <w:p>
@@ -8084,7 +8333,7 @@
           <w:color w:val="000000"/>
           <w:sz w:val="30"/>
         </w:rPr>
-        <w:t>五 国家包 知识库和培训</w:t>
+        <w:t>（五）国家包、知识库和培训</w:t>
       </w:r>
     </w:p>
     <w:p>
@@ -8119,7 +8368,7 @@
           <w:color w:val="000000"/>
           <w:sz w:val="30"/>
         </w:rPr>
-        <w:t>六 数字孪生与运营场景</w:t>
+        <w:t>（六）数字孪生与运营场景</w:t>
       </w:r>
     </w:p>
     <w:p>
@@ -8136,7 +8385,7 @@
           <w:color w:val="000000"/>
           <w:sz w:val="30"/>
         </w:rPr>
-        <w:t xml:space="preserve">数字孪生工作台包含空间模型、4D 5D 项控、调试移交、运营、场景实验室和孪生智能体。每个合成项目可以生成六格式实例，供演示互操作接口。场景模拟只生成 </w:t>
+        <w:t xml:space="preserve">数字孪生工作台包含空间模型、4D/5D 项控、调试移交、运营、场景实验室和孪生智能体。每个合成项目可以生成六格式实例，供演示互操作接口。场景模拟只生成 </w:t>
       </w:r>
       <w:r>
         <w:rPr>
@@ -8172,7 +8421,7 @@
           <w:color w:val="000000"/>
           <w:sz w:val="30"/>
         </w:rPr>
-        <w:t>七 管理与可观测能力</w:t>
+        <w:t>（七）管理与可观测能力</w:t>
       </w:r>
     </w:p>
     <w:p>
@@ -8298,7 +8547,7 @@
           <w:color w:val="000000"/>
           <w:sz w:val="32"/>
         </w:rPr>
-        <w:t>五 实际应用效果</w:t>
+        <w:t>五、实际应用效果</w:t>
       </w:r>
     </w:p>
     <w:p>
@@ -8316,7 +8565,7 @@
           <w:color w:val="000000"/>
           <w:sz w:val="30"/>
         </w:rPr>
-        <w:t>一 在线运行状态</w:t>
+        <w:t>（一）在线运行状态</w:t>
       </w:r>
     </w:p>
     <w:p>
@@ -8333,7 +8582,7 @@
           <w:color w:val="000000"/>
           <w:sz w:val="30"/>
         </w:rPr>
-        <w:t xml:space="preserve">作品已经部署在 Railway。参赛证据页、Web 服务、API 服务和 PostgreSQL 均在 2026 年 10 月 14 日完成线上验证。黄金工单状态为 </w:t>
+        <w:t xml:space="preserve">作品已经部署在 Railway。参赛证据页、Web 服务、API 服务和 PostgreSQL 均在 2026 年 10 月 14 日完成线上验证。黄金案例状态为 </w:t>
       </w:r>
       <w:r>
         <w:rPr>
@@ -8386,7 +8635,7 @@
           <w:color w:val="000000"/>
           <w:sz w:val="30"/>
         </w:rPr>
-        <w:t>2026 年 10 月 15 日，智能助手在线上使用云端 OpenAI 兼容模型完成人工核查：对「你能做什么」「明天吉隆坡天气」和「帮我批准所有待审批事项」分别给出能力说明、范围外说明和待审批清单，未代为批准；「印尼那个高速项目进度如何」被定位到 ID HWY B；马来西亚高处作业问题的回答逐句引用 MY-HSE-WAH-01 与 MY-DOSH-OSHA，并可打开 DOSH 官方来源。使用一份合成的分包商变更申请函时，单次实测建工单约 12 秒、审批后起草回复约 16 秒；回复确认收函、要求补充书面指令和计价资料、保留合同权利，未知信息以 [●] 占位，独立核验六项全部通过。以上为单次线上核查，不代表统计意义上的延迟或准确率。</w:t>
+        <w:t>2026 年 10 月 15 日，智能助手在线上使用云端 OpenAI 兼容模型完成人工核查：对「你能做什么」「明天吉隆坡天气」和「帮我批准所有待审批事项」分别给出能力说明、范围外说明和待审批清单，未代为批准；「印尼那个高速项目进度如何」被定位到 ID-HWY-B；马来西亚高处作业问题的回答逐句引用 MY-HSE-WAH-01 与 MY-DOSH-OSHA，并可打开 DOSH 官方来源。使用一份合成的分包商变更申请函时，单次实测建案例约 12 秒、审批后起草回复约 16 秒；回复确认收函、要求补充书面指令和计价资料、保留合同权利，未知信息以 [●] 占位，独立核验六项全部通过。以上为单次线上核查，不代表统计意义上的延迟或准确率。</w:t>
       </w:r>
     </w:p>
     <w:p>
@@ -8461,7 +8710,7 @@
           <w:color w:val="000000"/>
           <w:sz w:val="30"/>
         </w:rPr>
-        <w:t>二 评测集与覆盖范围</w:t>
+        <w:t>（二）评测集与覆盖范围</w:t>
       </w:r>
     </w:p>
     <w:p>
@@ -9211,7 +9460,7 @@
           <w:color w:val="000000"/>
           <w:sz w:val="30"/>
         </w:rPr>
-        <w:t>三 当前评测结果</w:t>
+        <w:t>（三）当前评测结果</w:t>
       </w:r>
     </w:p>
     <w:tbl>
@@ -10009,7 +10258,7 @@
                 <w:color w:val="000000"/>
                 <w:sz w:val="21"/>
               </w:rPr>
-              <w:t>工单类型准确率</w:t>
+              <w:t>案例类型准确率</w:t>
             </w:r>
           </w:p>
         </w:tc>
@@ -10905,7 +11154,7 @@
           <w:color w:val="000000"/>
           <w:sz w:val="30"/>
         </w:rPr>
-        <w:t>四 软件验证证据</w:t>
+        <w:t>（四）软件验证证据</w:t>
       </w:r>
     </w:p>
     <w:p>
@@ -10958,7 +11207,7 @@
           <w:color w:val="000000"/>
           <w:sz w:val="30"/>
         </w:rPr>
-        <w:t>五 与传统工作方式的可验证差异</w:t>
+        <w:t>（五）与传统工作方式的可验证差异</w:t>
       </w:r>
     </w:p>
     <w:tbl>
@@ -11421,7 +11670,7 @@
                 <w:color w:val="000000"/>
                 <w:sz w:val="21"/>
               </w:rPr>
-              <w:t>工单中保留多智能体运行、证据和统一行动计划</w:t>
+              <w:t>案例中保留多智能体运行、证据和统一行动计划</w:t>
             </w:r>
           </w:p>
         </w:tc>
@@ -12030,7 +12279,7 @@
           <w:color w:val="000000"/>
           <w:sz w:val="32"/>
         </w:rPr>
-        <w:t>六 创新性阐述</w:t>
+        <w:t>六、创新性阐述</w:t>
       </w:r>
     </w:p>
     <w:p>
@@ -12048,7 +12297,7 @@
           <w:color w:val="000000"/>
           <w:sz w:val="30"/>
         </w:rPr>
-        <w:t>一 从知识问答到可信执行</w:t>
+        <w:t>（一）从知识问答到闭环执行</w:t>
       </w:r>
     </w:p>
     <w:p>
@@ -12083,7 +12332,7 @@
           <w:color w:val="000000"/>
           <w:sz w:val="30"/>
         </w:rPr>
-        <w:t>二 国家 生命周期和孪生联合路由</w:t>
+        <w:t>（二）国家、生命周期和孪生联合路由</w:t>
       </w:r>
     </w:p>
     <w:p>
@@ -12100,7 +12349,7 @@
           <w:color w:val="000000"/>
           <w:sz w:val="30"/>
         </w:rPr>
-        <w:t>系统同时识别项目所在国和生命周期阶段，并据此选择国家包、许可关卡、知识范围和专业团队。Twin ID 又把事件定位到具体空间对象和资产状态。国家、阶段、专业和空间对象不再是四套独立标签，而是同一工单的路由条件。</w:t>
+        <w:t>系统同时识别项目所在国和生命周期阶段，并据此选择国家包、许可关卡、知识范围和专业团队。Twin ID 又把事件定位到具体空间对象和资产状态。国家、阶段、专业和空间对象不再是四套独立标签，而是同一案例的路由条件。</w:t>
       </w:r>
     </w:p>
     <w:p>
@@ -12118,7 +12367,7 @@
           <w:color w:val="000000"/>
           <w:sz w:val="30"/>
         </w:rPr>
-        <w:t>三 技术融合</w:t>
+        <w:t>（三）技术融合</w:t>
       </w:r>
     </w:p>
     <w:tbl>
@@ -12545,7 +12794,7 @@
                 <w:color w:val="000000"/>
                 <w:sz w:val="21"/>
               </w:rPr>
-              <w:t>根据工单组建工程 安全 合同等专业团队</w:t>
+              <w:t>根据案例组建工程、安全、合同等专业团队</w:t>
             </w:r>
           </w:p>
         </w:tc>
@@ -12771,7 +13020,7 @@
                 <w:color w:val="000000"/>
                 <w:sz w:val="21"/>
               </w:rPr>
-              <w:t>统一模型 GIS 进度 成本 调试 遥测和维护</w:t>
+              <w:t>统一模型、GIS、进度、成本、调试、遥测和维护</w:t>
             </w:r>
           </w:p>
         </w:tc>
@@ -13059,7 +13308,7 @@
           <w:color w:val="000000"/>
           <w:sz w:val="30"/>
         </w:rPr>
-        <w:t>四 对 AI 出海业务模式的支持</w:t>
+        <w:t>（四）对 AI 出海业务模式的支持</w:t>
       </w:r>
     </w:p>
     <w:p>
@@ -13095,7 +13344,7 @@
           <w:color w:val="000000"/>
           <w:sz w:val="32"/>
         </w:rPr>
-        <w:t>七 属地适配与推广可行性分析</w:t>
+        <w:t>七、属地适配与推广可行性分析</w:t>
       </w:r>
     </w:p>
     <w:p>
@@ -13113,7 +13362,7 @@
           <w:color w:val="000000"/>
           <w:sz w:val="30"/>
         </w:rPr>
-        <w:t>一 国家包扩展方法</w:t>
+        <w:t>（一）国家包扩展方法</w:t>
       </w:r>
     </w:p>
     <w:p>
@@ -13165,7 +13414,7 @@
           <w:color w:val="000000"/>
           <w:sz w:val="30"/>
         </w:rPr>
-        <w:t>二 部署与数据主权</w:t>
+        <w:t>（二）部署与数据主权</w:t>
       </w:r>
     </w:p>
     <w:p>
@@ -13200,7 +13449,7 @@
           <w:color w:val="000000"/>
           <w:sz w:val="30"/>
         </w:rPr>
-        <w:t>三 试点实施路径</w:t>
+        <w:t>（三）试点实施路径</w:t>
       </w:r>
     </w:p>
     <w:tbl>
@@ -14000,7 +14249,7 @@
           <w:color w:val="000000"/>
           <w:sz w:val="30"/>
         </w:rPr>
-        <w:t>四 推广价值与限制</w:t>
+        <w:t>（四）推广价值与限制</w:t>
       </w:r>
     </w:p>
     <w:p>
@@ -14017,7 +14266,7 @@
           <w:color w:val="000000"/>
           <w:sz w:val="30"/>
         </w:rPr>
-        <w:t>平台的复用单元是国家包、领域包、连接器和工作流，而不是复制整套项目代码。铁路、公路、港口、机场、桥梁和隧道项目可以复用同一工单、证据、Twin ID 和治理契约。项目可先从一个高频场景开始，例如 HSE 事件或业主函件，再逐步接入计划、成本和运营数据。</w:t>
+        <w:t>平台的复用单元是国家包、领域包、连接器和工作流，而不是复制整套项目代码。铁路、公路、港口、机场、桥梁和隧道项目可以复用同一案例、证据、Twin ID 和治理契约。项目可先从一个高频场景开始，例如 HSE 事件或业主函件，再逐步接入计划、成本和运营数据。</w:t>
       </w:r>
     </w:p>
     <w:p>
@@ -14516,7 +14765,7 @@
                 <w:color w:val="000000"/>
                 <w:sz w:val="21"/>
               </w:rPr>
-              <w:t>工具出海 属地融合 能力输出三种交付模式</w:t>
+              <w:t>工具出海、属地融合、能力输出三种交付模式</w:t>
             </w:r>
           </w:p>
         </w:tc>
@@ -15307,7 +15556,7 @@
                 <w:color w:val="000000"/>
                 <w:sz w:val="21"/>
               </w:rPr>
-              <w:t>国家包 领域包 连接器 区域数据面和试点路径</w:t>
+              <w:t>国家包、领域包、连接器、区域数据面和试点路径</w:t>
             </w:r>
           </w:p>
         </w:tc>

</xml_diff>

<commit_message>
docs(submission): cover all twelve application scenarios in the report
Chapter 1 now lists every supported scenario by AI-outbound direction,
with test-pack results for the correspondence and site-record scenarios
and short descriptions of regulation Q&A, multilingual HSE training,
project management, digital-twin operations and offline field capture.

Co-Authored-By: Claude Opus 5.5 <noreply@anthropic.com>
</commit_message>
<xml_diff>
--- a/submission/final/GlobalInfra_AI_AI出海应用设计报告.docx
+++ b/submission/final/GlobalInfra_AI_AI出海应用设计报告.docx
@@ -216,7 +216,7 @@
           <w:color w:val="000000"/>
           <w:sz w:val="28"/>
         </w:rPr>
-        <w:t>首批场景</w:t>
+        <w:t>应用场景</w:t>
       </w:r>
       <w:r>
         <w:rPr>
@@ -225,7 +225,7 @@
           <w:color w:val="000000"/>
           <w:sz w:val="28"/>
         </w:rPr>
-        <w:t>：马来西亚轨道交通项目的业主及分包函件分析与回复、现场质量安全事件闭环处置。</w:t>
+        <w:t>：共十二个，首批聚焦马来西亚轨道交通项目的业主及分包函件分析与回复、现场质量安全事件闭环处置，并覆盖属地合规、法规问答、多语培训、项目管理、数字孪生和现场离线采集。</w:t>
       </w:r>
     </w:p>
     <w:p>
@@ -2374,7 +2374,7 @@
           <w:color w:val="000000"/>
           <w:sz w:val="30"/>
         </w:rPr>
-        <w:t>（四）首批落地场景</w:t>
+        <w:t>（四）应用场景</w:t>
       </w:r>
     </w:p>
     <w:p>
@@ -2391,8 +2391,1965 @@
           <w:color w:val="000000"/>
           <w:sz w:val="30"/>
         </w:rPr>
-        <w:t>首批聚焦马来西亚轨道交通项目的两类高频业务，均使用合成数据演示。</w:t>
-      </w:r>
+        <w:t>系统目前支持十二个应用场景，按 AI 出海赛道的三个方向归类。所有场景均可在线运行，演示数据均为合成数据；其中场景一至场景七已使用马来西亚铁路项目合成测试资料包逐一上传验证。</w:t>
+      </w:r>
+    </w:p>
+    <w:tbl>
+      <w:tblPr>
+        <w:tblW w:type="pct" w:w="5000"/>
+        <w:jc w:val="center"/>
+        <w:tblLayout w:type="fixed"/>
+        <w:tblLook w:firstColumn="1" w:firstRow="1" w:lastColumn="0" w:lastRow="0" w:noHBand="0" w:noVBand="1" w:val="04A0"/>
+      </w:tblPr>
+      <w:tblGrid>
+        <w:gridCol w:w="2171"/>
+        <w:gridCol w:w="2171"/>
+        <w:gridCol w:w="2171"/>
+        <w:gridCol w:w="2171"/>
+      </w:tblGrid>
+      <w:tr>
+        <w:trPr>
+          <w:cantSplit/>
+          <w:tblHeader w:val="true"/>
+        </w:trPr>
+        <w:tc>
+          <w:tcPr>
+            <w:tcW w:type="dxa" w:w="1126"/>
+            <w:vAlign w:val="center"/>
+            <w:tcMar>
+              <w:top w:w="100" w:type="dxa"/>
+              <w:start w:w="120" w:type="dxa"/>
+              <w:bottom w:w="100" w:type="dxa"/>
+              <w:end w:w="120" w:type="dxa"/>
+            </w:tcMar>
+            <w:tcBorders>
+              <w:top w:val="single" w:sz="6" w:color="D9E1F2"/>
+              <w:left w:val="single" w:sz="6" w:color="D9E1F2"/>
+              <w:bottom w:val="single" w:sz="6" w:color="D9E1F2"/>
+              <w:right w:val="single" w:sz="6" w:color="D9E1F2"/>
+              <w:insideH w:val="single" w:sz="6" w:color="D9E1F2"/>
+              <w:insideV w:val="single" w:sz="6" w:color="D9E1F2"/>
+            </w:tcBorders>
+            <w:shd w:fill="17365D"/>
+          </w:tcPr>
+          <w:p>
+            <w:pPr>
+              <w:spacing w:line="340" w:lineRule="exact" w:before="20" w:after="20"/>
+              <w:jc w:val="center"/>
+            </w:pPr>
+            <w:r>
+              <w:rPr>
+                <w:rFonts w:ascii="Times New Roman" w:hAnsi="Times New Roman" w:hint="eastAsia" w:eastAsia="黑体" w:cs="Times New Roman"/>
+                <w:b/>
+                <w:color w:val="FFFFFF"/>
+                <w:sz w:val="21"/>
+              </w:rPr>
+              <w:t>方向</w:t>
+            </w:r>
+          </w:p>
+        </w:tc>
+        <w:tc>
+          <w:tcPr>
+            <w:tcW w:type="dxa" w:w="2109"/>
+            <w:vAlign w:val="center"/>
+            <w:tcMar>
+              <w:top w:w="100" w:type="dxa"/>
+              <w:start w:w="120" w:type="dxa"/>
+              <w:bottom w:w="100" w:type="dxa"/>
+              <w:end w:w="120" w:type="dxa"/>
+            </w:tcMar>
+            <w:tcBorders>
+              <w:top w:val="single" w:sz="6" w:color="D9E1F2"/>
+              <w:left w:val="single" w:sz="6" w:color="D9E1F2"/>
+              <w:bottom w:val="single" w:sz="6" w:color="D9E1F2"/>
+              <w:right w:val="single" w:sz="6" w:color="D9E1F2"/>
+              <w:insideH w:val="single" w:sz="6" w:color="D9E1F2"/>
+              <w:insideV w:val="single" w:sz="6" w:color="D9E1F2"/>
+            </w:tcBorders>
+            <w:shd w:fill="17365D"/>
+          </w:tcPr>
+          <w:p>
+            <w:pPr>
+              <w:spacing w:line="340" w:lineRule="exact" w:before="20" w:after="20"/>
+              <w:jc w:val="center"/>
+            </w:pPr>
+            <w:r>
+              <w:rPr>
+                <w:rFonts w:ascii="Times New Roman" w:hAnsi="Times New Roman" w:hint="eastAsia" w:eastAsia="黑体" w:cs="Times New Roman"/>
+                <w:b/>
+                <w:color w:val="FFFFFF"/>
+                <w:sz w:val="21"/>
+              </w:rPr>
+              <w:t>应用场景</w:t>
+            </w:r>
+          </w:p>
+        </w:tc>
+        <w:tc>
+          <w:tcPr>
+            <w:tcW w:type="dxa" w:w="1977"/>
+            <w:vAlign w:val="center"/>
+            <w:tcMar>
+              <w:top w:w="100" w:type="dxa"/>
+              <w:start w:w="120" w:type="dxa"/>
+              <w:bottom w:w="100" w:type="dxa"/>
+              <w:end w:w="120" w:type="dxa"/>
+            </w:tcMar>
+            <w:tcBorders>
+              <w:top w:val="single" w:sz="6" w:color="D9E1F2"/>
+              <w:left w:val="single" w:sz="6" w:color="D9E1F2"/>
+              <w:bottom w:val="single" w:sz="6" w:color="D9E1F2"/>
+              <w:right w:val="single" w:sz="6" w:color="D9E1F2"/>
+              <w:insideH w:val="single" w:sz="6" w:color="D9E1F2"/>
+              <w:insideV w:val="single" w:sz="6" w:color="D9E1F2"/>
+            </w:tcBorders>
+            <w:shd w:fill="17365D"/>
+          </w:tcPr>
+          <w:p>
+            <w:pPr>
+              <w:spacing w:line="340" w:lineRule="exact" w:before="20" w:after="20"/>
+              <w:jc w:val="center"/>
+            </w:pPr>
+            <w:r>
+              <w:rPr>
+                <w:rFonts w:ascii="Times New Roman" w:hAnsi="Times New Roman" w:hint="eastAsia" w:eastAsia="黑体" w:cs="Times New Roman"/>
+                <w:b/>
+                <w:color w:val="FFFFFF"/>
+                <w:sz w:val="21"/>
+              </w:rPr>
+              <w:t>典型输入</w:t>
+            </w:r>
+          </w:p>
+        </w:tc>
+        <w:tc>
+          <w:tcPr>
+            <w:tcW w:type="dxa" w:w="3428"/>
+            <w:vAlign w:val="center"/>
+            <w:tcMar>
+              <w:top w:w="100" w:type="dxa"/>
+              <w:start w:w="120" w:type="dxa"/>
+              <w:bottom w:w="100" w:type="dxa"/>
+              <w:end w:w="120" w:type="dxa"/>
+            </w:tcMar>
+            <w:tcBorders>
+              <w:top w:val="single" w:sz="6" w:color="D9E1F2"/>
+              <w:left w:val="single" w:sz="6" w:color="D9E1F2"/>
+              <w:bottom w:val="single" w:sz="6" w:color="D9E1F2"/>
+              <w:right w:val="single" w:sz="6" w:color="D9E1F2"/>
+              <w:insideH w:val="single" w:sz="6" w:color="D9E1F2"/>
+              <w:insideV w:val="single" w:sz="6" w:color="D9E1F2"/>
+            </w:tcBorders>
+            <w:shd w:fill="17365D"/>
+          </w:tcPr>
+          <w:p>
+            <w:pPr>
+              <w:spacing w:line="340" w:lineRule="exact" w:before="20" w:after="20"/>
+              <w:jc w:val="center"/>
+            </w:pPr>
+            <w:r>
+              <w:rPr>
+                <w:rFonts w:ascii="Times New Roman" w:hAnsi="Times New Roman" w:hint="eastAsia" w:eastAsia="黑体" w:cs="Times New Roman"/>
+                <w:b/>
+                <w:color w:val="FFFFFF"/>
+                <w:sz w:val="21"/>
+              </w:rPr>
+              <w:t>系统输出</w:t>
+            </w:r>
+          </w:p>
+        </w:tc>
+      </w:tr>
+      <w:tr>
+        <w:trPr>
+          <w:cantSplit/>
+        </w:trPr>
+        <w:tc>
+          <w:tcPr>
+            <w:tcW w:type="dxa" w:w="1126"/>
+            <w:vAlign w:val="center"/>
+            <w:tcMar>
+              <w:top w:w="100" w:type="dxa"/>
+              <w:start w:w="120" w:type="dxa"/>
+              <w:bottom w:w="100" w:type="dxa"/>
+              <w:end w:w="120" w:type="dxa"/>
+            </w:tcMar>
+            <w:tcBorders>
+              <w:top w:val="single" w:sz="6" w:color="D9E1F2"/>
+              <w:left w:val="single" w:sz="6" w:color="D9E1F2"/>
+              <w:bottom w:val="single" w:sz="6" w:color="D9E1F2"/>
+              <w:right w:val="single" w:sz="6" w:color="D9E1F2"/>
+              <w:insideH w:val="single" w:sz="6" w:color="D9E1F2"/>
+              <w:insideV w:val="single" w:sz="6" w:color="D9E1F2"/>
+            </w:tcBorders>
+            <w:shd w:fill="FFFFFF"/>
+          </w:tcPr>
+          <w:p>
+            <w:pPr>
+              <w:spacing w:line="340" w:lineRule="exact" w:before="20" w:after="20"/>
+              <w:jc w:val="center"/>
+            </w:pPr>
+            <w:r>
+              <w:rPr>
+                <w:rFonts w:ascii="Times New Roman" w:hAnsi="Times New Roman" w:hint="eastAsia" w:eastAsia="仿宋" w:cs="Times New Roman"/>
+                <w:b w:val="0"/>
+                <w:color w:val="000000"/>
+                <w:sz w:val="21"/>
+              </w:rPr>
+              <w:t>工具出海</w:t>
+            </w:r>
+          </w:p>
+        </w:tc>
+        <w:tc>
+          <w:tcPr>
+            <w:tcW w:type="dxa" w:w="2109"/>
+            <w:vAlign w:val="center"/>
+            <w:tcMar>
+              <w:top w:w="100" w:type="dxa"/>
+              <w:start w:w="120" w:type="dxa"/>
+              <w:bottom w:w="100" w:type="dxa"/>
+              <w:end w:w="120" w:type="dxa"/>
+            </w:tcMar>
+            <w:tcBorders>
+              <w:top w:val="single" w:sz="6" w:color="D9E1F2"/>
+              <w:left w:val="single" w:sz="6" w:color="D9E1F2"/>
+              <w:bottom w:val="single" w:sz="6" w:color="D9E1F2"/>
+              <w:right w:val="single" w:sz="6" w:color="D9E1F2"/>
+              <w:insideH w:val="single" w:sz="6" w:color="D9E1F2"/>
+              <w:insideV w:val="single" w:sz="6" w:color="D9E1F2"/>
+            </w:tcBorders>
+            <w:shd w:fill="FFFFFF"/>
+          </w:tcPr>
+          <w:p>
+            <w:pPr>
+              <w:spacing w:line="340" w:lineRule="exact" w:before="20" w:after="20"/>
+              <w:jc w:val="center"/>
+            </w:pPr>
+            <w:r>
+              <w:rPr>
+                <w:rFonts w:ascii="Times New Roman" w:hAnsi="Times New Roman" w:hint="eastAsia" w:eastAsia="仿宋" w:cs="Times New Roman"/>
+                <w:b w:val="0"/>
+                <w:color w:val="000000"/>
+                <w:sz w:val="21"/>
+              </w:rPr>
+              <w:t>一、现场安全事件闭环</w:t>
+            </w:r>
+          </w:p>
+        </w:tc>
+        <w:tc>
+          <w:tcPr>
+            <w:tcW w:type="dxa" w:w="1977"/>
+            <w:vAlign w:val="center"/>
+            <w:tcMar>
+              <w:top w:w="100" w:type="dxa"/>
+              <w:start w:w="120" w:type="dxa"/>
+              <w:bottom w:w="100" w:type="dxa"/>
+              <w:end w:w="120" w:type="dxa"/>
+            </w:tcMar>
+            <w:tcBorders>
+              <w:top w:val="single" w:sz="6" w:color="D9E1F2"/>
+              <w:left w:val="single" w:sz="6" w:color="D9E1F2"/>
+              <w:bottom w:val="single" w:sz="6" w:color="D9E1F2"/>
+              <w:right w:val="single" w:sz="6" w:color="D9E1F2"/>
+              <w:insideH w:val="single" w:sz="6" w:color="D9E1F2"/>
+              <w:insideV w:val="single" w:sz="6" w:color="D9E1F2"/>
+            </w:tcBorders>
+            <w:shd w:fill="FFFFFF"/>
+          </w:tcPr>
+          <w:p>
+            <w:pPr>
+              <w:spacing w:line="340" w:lineRule="exact" w:before="20" w:after="20"/>
+              <w:jc w:val="center"/>
+            </w:pPr>
+            <w:r>
+              <w:rPr>
+                <w:rFonts w:ascii="Times New Roman" w:hAnsi="Times New Roman" w:hint="eastAsia" w:eastAsia="仿宋" w:cs="Times New Roman"/>
+                <w:b w:val="0"/>
+                <w:color w:val="000000"/>
+                <w:sz w:val="21"/>
+              </w:rPr>
+              <w:t>业主安全通知</w:t>
+            </w:r>
+          </w:p>
+        </w:tc>
+        <w:tc>
+          <w:tcPr>
+            <w:tcW w:type="dxa" w:w="3428"/>
+            <w:vAlign w:val="center"/>
+            <w:tcMar>
+              <w:top w:w="100" w:type="dxa"/>
+              <w:start w:w="120" w:type="dxa"/>
+              <w:bottom w:w="100" w:type="dxa"/>
+              <w:end w:w="120" w:type="dxa"/>
+            </w:tcMar>
+            <w:tcBorders>
+              <w:top w:val="single" w:sz="6" w:color="D9E1F2"/>
+              <w:left w:val="single" w:sz="6" w:color="D9E1F2"/>
+              <w:bottom w:val="single" w:sz="6" w:color="D9E1F2"/>
+              <w:right w:val="single" w:sz="6" w:color="D9E1F2"/>
+              <w:insideH w:val="single" w:sz="6" w:color="D9E1F2"/>
+              <w:insideV w:val="single" w:sz="6" w:color="D9E1F2"/>
+            </w:tcBorders>
+            <w:shd w:fill="FFFFFF"/>
+          </w:tcPr>
+          <w:p>
+            <w:pPr>
+              <w:spacing w:line="340" w:lineRule="exact" w:before="20" w:after="20"/>
+              <w:jc w:val="left"/>
+            </w:pPr>
+            <w:r>
+              <w:rPr>
+                <w:rFonts w:ascii="Times New Roman" w:hAnsi="Times New Roman" w:hint="eastAsia" w:eastAsia="仿宋" w:cs="Times New Roman"/>
+                <w:b w:val="0"/>
+                <w:color w:val="000000"/>
+                <w:sz w:val="21"/>
+              </w:rPr>
+              <w:t>案例、处置计划、审批、回复草稿和独立核验</w:t>
+            </w:r>
+          </w:p>
+        </w:tc>
+      </w:tr>
+      <w:tr>
+        <w:trPr>
+          <w:cantSplit/>
+        </w:trPr>
+        <w:tc>
+          <w:tcPr>
+            <w:tcW w:type="dxa" w:w="1126"/>
+            <w:vAlign w:val="center"/>
+            <w:tcMar>
+              <w:top w:w="100" w:type="dxa"/>
+              <w:start w:w="120" w:type="dxa"/>
+              <w:bottom w:w="100" w:type="dxa"/>
+              <w:end w:w="120" w:type="dxa"/>
+            </w:tcMar>
+            <w:tcBorders>
+              <w:top w:val="single" w:sz="6" w:color="D9E1F2"/>
+              <w:left w:val="single" w:sz="6" w:color="D9E1F2"/>
+              <w:bottom w:val="single" w:sz="6" w:color="D9E1F2"/>
+              <w:right w:val="single" w:sz="6" w:color="D9E1F2"/>
+              <w:insideH w:val="single" w:sz="6" w:color="D9E1F2"/>
+              <w:insideV w:val="single" w:sz="6" w:color="D9E1F2"/>
+            </w:tcBorders>
+            <w:shd w:fill="EAF2F8"/>
+          </w:tcPr>
+          <w:p>
+            <w:pPr>
+              <w:spacing w:line="340" w:lineRule="exact" w:before="20" w:after="20"/>
+              <w:jc w:val="center"/>
+            </w:pPr>
+            <w:r>
+              <w:rPr>
+                <w:rFonts w:ascii="Times New Roman" w:hAnsi="Times New Roman" w:hint="eastAsia" w:eastAsia="仿宋" w:cs="Times New Roman"/>
+                <w:b w:val="0"/>
+                <w:color w:val="000000"/>
+                <w:sz w:val="21"/>
+              </w:rPr>
+              <w:t>工具出海</w:t>
+            </w:r>
+          </w:p>
+        </w:tc>
+        <w:tc>
+          <w:tcPr>
+            <w:tcW w:type="dxa" w:w="2109"/>
+            <w:vAlign w:val="center"/>
+            <w:tcMar>
+              <w:top w:w="100" w:type="dxa"/>
+              <w:start w:w="120" w:type="dxa"/>
+              <w:bottom w:w="100" w:type="dxa"/>
+              <w:end w:w="120" w:type="dxa"/>
+            </w:tcMar>
+            <w:tcBorders>
+              <w:top w:val="single" w:sz="6" w:color="D9E1F2"/>
+              <w:left w:val="single" w:sz="6" w:color="D9E1F2"/>
+              <w:bottom w:val="single" w:sz="6" w:color="D9E1F2"/>
+              <w:right w:val="single" w:sz="6" w:color="D9E1F2"/>
+              <w:insideH w:val="single" w:sz="6" w:color="D9E1F2"/>
+              <w:insideV w:val="single" w:sz="6" w:color="D9E1F2"/>
+            </w:tcBorders>
+            <w:shd w:fill="EAF2F8"/>
+          </w:tcPr>
+          <w:p>
+            <w:pPr>
+              <w:spacing w:line="340" w:lineRule="exact" w:before="20" w:after="20"/>
+              <w:jc w:val="center"/>
+            </w:pPr>
+            <w:r>
+              <w:rPr>
+                <w:rFonts w:ascii="Times New Roman" w:hAnsi="Times New Roman" w:hint="eastAsia" w:eastAsia="仿宋" w:cs="Times New Roman"/>
+                <w:b w:val="0"/>
+                <w:color w:val="000000"/>
+                <w:sz w:val="21"/>
+              </w:rPr>
+              <w:t>二、分包变更申请回复</w:t>
+            </w:r>
+          </w:p>
+        </w:tc>
+        <w:tc>
+          <w:tcPr>
+            <w:tcW w:type="dxa" w:w="1977"/>
+            <w:vAlign w:val="center"/>
+            <w:tcMar>
+              <w:top w:w="100" w:type="dxa"/>
+              <w:start w:w="120" w:type="dxa"/>
+              <w:bottom w:w="100" w:type="dxa"/>
+              <w:end w:w="120" w:type="dxa"/>
+            </w:tcMar>
+            <w:tcBorders>
+              <w:top w:val="single" w:sz="6" w:color="D9E1F2"/>
+              <w:left w:val="single" w:sz="6" w:color="D9E1F2"/>
+              <w:bottom w:val="single" w:sz="6" w:color="D9E1F2"/>
+              <w:right w:val="single" w:sz="6" w:color="D9E1F2"/>
+              <w:insideH w:val="single" w:sz="6" w:color="D9E1F2"/>
+              <w:insideV w:val="single" w:sz="6" w:color="D9E1F2"/>
+            </w:tcBorders>
+            <w:shd w:fill="EAF2F8"/>
+          </w:tcPr>
+          <w:p>
+            <w:pPr>
+              <w:spacing w:line="340" w:lineRule="exact" w:before="20" w:after="20"/>
+              <w:jc w:val="center"/>
+            </w:pPr>
+            <w:r>
+              <w:rPr>
+                <w:rFonts w:ascii="Times New Roman" w:hAnsi="Times New Roman" w:hint="eastAsia" w:eastAsia="仿宋" w:cs="Times New Roman"/>
+                <w:b w:val="0"/>
+                <w:color w:val="000000"/>
+                <w:sz w:val="21"/>
+              </w:rPr>
+              <w:t>分包商变更申请函</w:t>
+            </w:r>
+          </w:p>
+        </w:tc>
+        <w:tc>
+          <w:tcPr>
+            <w:tcW w:type="dxa" w:w="3428"/>
+            <w:vAlign w:val="center"/>
+            <w:tcMar>
+              <w:top w:w="100" w:type="dxa"/>
+              <w:start w:w="120" w:type="dxa"/>
+              <w:bottom w:w="100" w:type="dxa"/>
+              <w:end w:w="120" w:type="dxa"/>
+            </w:tcMar>
+            <w:tcBorders>
+              <w:top w:val="single" w:sz="6" w:color="D9E1F2"/>
+              <w:left w:val="single" w:sz="6" w:color="D9E1F2"/>
+              <w:bottom w:val="single" w:sz="6" w:color="D9E1F2"/>
+              <w:right w:val="single" w:sz="6" w:color="D9E1F2"/>
+              <w:insideH w:val="single" w:sz="6" w:color="D9E1F2"/>
+              <w:insideV w:val="single" w:sz="6" w:color="D9E1F2"/>
+            </w:tcBorders>
+            <w:shd w:fill="EAF2F8"/>
+          </w:tcPr>
+          <w:p>
+            <w:pPr>
+              <w:spacing w:line="340" w:lineRule="exact" w:before="20" w:after="20"/>
+              <w:jc w:val="left"/>
+            </w:pPr>
+            <w:r>
+              <w:rPr>
+                <w:rFonts w:ascii="Times New Roman" w:hAnsi="Times New Roman" w:hint="eastAsia" w:eastAsia="仿宋" w:cs="Times New Roman"/>
+                <w:b w:val="0"/>
+                <w:color w:val="000000"/>
+                <w:sz w:val="21"/>
+              </w:rPr>
+              <w:t>大模型依据证据起草的回复草稿</w:t>
+            </w:r>
+          </w:p>
+        </w:tc>
+      </w:tr>
+      <w:tr>
+        <w:trPr>
+          <w:cantSplit/>
+        </w:trPr>
+        <w:tc>
+          <w:tcPr>
+            <w:tcW w:type="dxa" w:w="1126"/>
+            <w:vAlign w:val="center"/>
+            <w:tcMar>
+              <w:top w:w="100" w:type="dxa"/>
+              <w:start w:w="120" w:type="dxa"/>
+              <w:bottom w:w="100" w:type="dxa"/>
+              <w:end w:w="120" w:type="dxa"/>
+            </w:tcMar>
+            <w:tcBorders>
+              <w:top w:val="single" w:sz="6" w:color="D9E1F2"/>
+              <w:left w:val="single" w:sz="6" w:color="D9E1F2"/>
+              <w:bottom w:val="single" w:sz="6" w:color="D9E1F2"/>
+              <w:right w:val="single" w:sz="6" w:color="D9E1F2"/>
+              <w:insideH w:val="single" w:sz="6" w:color="D9E1F2"/>
+              <w:insideV w:val="single" w:sz="6" w:color="D9E1F2"/>
+            </w:tcBorders>
+            <w:shd w:fill="FFFFFF"/>
+          </w:tcPr>
+          <w:p>
+            <w:pPr>
+              <w:spacing w:line="340" w:lineRule="exact" w:before="20" w:after="20"/>
+              <w:jc w:val="center"/>
+            </w:pPr>
+            <w:r>
+              <w:rPr>
+                <w:rFonts w:ascii="Times New Roman" w:hAnsi="Times New Roman" w:hint="eastAsia" w:eastAsia="仿宋" w:cs="Times New Roman"/>
+                <w:b w:val="0"/>
+                <w:color w:val="000000"/>
+                <w:sz w:val="21"/>
+              </w:rPr>
+              <w:t>工具出海</w:t>
+            </w:r>
+          </w:p>
+        </w:tc>
+        <w:tc>
+          <w:tcPr>
+            <w:tcW w:type="dxa" w:w="2109"/>
+            <w:vAlign w:val="center"/>
+            <w:tcMar>
+              <w:top w:w="100" w:type="dxa"/>
+              <w:start w:w="120" w:type="dxa"/>
+              <w:bottom w:w="100" w:type="dxa"/>
+              <w:end w:w="120" w:type="dxa"/>
+            </w:tcMar>
+            <w:tcBorders>
+              <w:top w:val="single" w:sz="6" w:color="D9E1F2"/>
+              <w:left w:val="single" w:sz="6" w:color="D9E1F2"/>
+              <w:bottom w:val="single" w:sz="6" w:color="D9E1F2"/>
+              <w:right w:val="single" w:sz="6" w:color="D9E1F2"/>
+              <w:insideH w:val="single" w:sz="6" w:color="D9E1F2"/>
+              <w:insideV w:val="single" w:sz="6" w:color="D9E1F2"/>
+            </w:tcBorders>
+            <w:shd w:fill="FFFFFF"/>
+          </w:tcPr>
+          <w:p>
+            <w:pPr>
+              <w:spacing w:line="340" w:lineRule="exact" w:before="20" w:after="20"/>
+              <w:jc w:val="center"/>
+            </w:pPr>
+            <w:r>
+              <w:rPr>
+                <w:rFonts w:ascii="Times New Roman" w:hAnsi="Times New Roman" w:hint="eastAsia" w:eastAsia="仿宋" w:cs="Times New Roman"/>
+                <w:b w:val="0"/>
+                <w:color w:val="000000"/>
+                <w:sz w:val="21"/>
+              </w:rPr>
+              <w:t>三、临时工程责任划分</w:t>
+            </w:r>
+          </w:p>
+        </w:tc>
+        <w:tc>
+          <w:tcPr>
+            <w:tcW w:type="dxa" w:w="1977"/>
+            <w:vAlign w:val="center"/>
+            <w:tcMar>
+              <w:top w:w="100" w:type="dxa"/>
+              <w:start w:w="120" w:type="dxa"/>
+              <w:bottom w:w="100" w:type="dxa"/>
+              <w:end w:w="120" w:type="dxa"/>
+            </w:tcMar>
+            <w:tcBorders>
+              <w:top w:val="single" w:sz="6" w:color="D9E1F2"/>
+              <w:left w:val="single" w:sz="6" w:color="D9E1F2"/>
+              <w:bottom w:val="single" w:sz="6" w:color="D9E1F2"/>
+              <w:right w:val="single" w:sz="6" w:color="D9E1F2"/>
+              <w:insideH w:val="single" w:sz="6" w:color="D9E1F2"/>
+              <w:insideV w:val="single" w:sz="6" w:color="D9E1F2"/>
+            </w:tcBorders>
+            <w:shd w:fill="FFFFFF"/>
+          </w:tcPr>
+          <w:p>
+            <w:pPr>
+              <w:spacing w:line="340" w:lineRule="exact" w:before="20" w:after="20"/>
+              <w:jc w:val="center"/>
+            </w:pPr>
+            <w:r>
+              <w:rPr>
+                <w:rFonts w:ascii="Times New Roman" w:hAnsi="Times New Roman" w:hint="eastAsia" w:eastAsia="仿宋" w:cs="Times New Roman"/>
+                <w:b w:val="0"/>
+                <w:color w:val="000000"/>
+                <w:sz w:val="21"/>
+              </w:rPr>
+              <w:t>便道损坏业主通知</w:t>
+            </w:r>
+          </w:p>
+        </w:tc>
+        <w:tc>
+          <w:tcPr>
+            <w:tcW w:type="dxa" w:w="3428"/>
+            <w:vAlign w:val="center"/>
+            <w:tcMar>
+              <w:top w:w="100" w:type="dxa"/>
+              <w:start w:w="120" w:type="dxa"/>
+              <w:bottom w:w="100" w:type="dxa"/>
+              <w:end w:w="120" w:type="dxa"/>
+            </w:tcMar>
+            <w:tcBorders>
+              <w:top w:val="single" w:sz="6" w:color="D9E1F2"/>
+              <w:left w:val="single" w:sz="6" w:color="D9E1F2"/>
+              <w:bottom w:val="single" w:sz="6" w:color="D9E1F2"/>
+              <w:right w:val="single" w:sz="6" w:color="D9E1F2"/>
+              <w:insideH w:val="single" w:sz="6" w:color="D9E1F2"/>
+              <w:insideV w:val="single" w:sz="6" w:color="D9E1F2"/>
+            </w:tcBorders>
+            <w:shd w:fill="FFFFFF"/>
+          </w:tcPr>
+          <w:p>
+            <w:pPr>
+              <w:spacing w:line="340" w:lineRule="exact" w:before="20" w:after="20"/>
+              <w:jc w:val="left"/>
+            </w:pPr>
+            <w:r>
+              <w:rPr>
+                <w:rFonts w:ascii="Times New Roman" w:hAnsi="Times New Roman" w:hint="eastAsia" w:eastAsia="仿宋" w:cs="Times New Roman"/>
+                <w:b w:val="0"/>
+                <w:color w:val="000000"/>
+                <w:sz w:val="21"/>
+              </w:rPr>
+              <w:t>合同责任条款和责任矩阵依据</w:t>
+            </w:r>
+          </w:p>
+        </w:tc>
+      </w:tr>
+      <w:tr>
+        <w:trPr>
+          <w:cantSplit/>
+        </w:trPr>
+        <w:tc>
+          <w:tcPr>
+            <w:tcW w:type="dxa" w:w="1126"/>
+            <w:vAlign w:val="center"/>
+            <w:tcMar>
+              <w:top w:w="100" w:type="dxa"/>
+              <w:start w:w="120" w:type="dxa"/>
+              <w:bottom w:w="100" w:type="dxa"/>
+              <w:end w:w="120" w:type="dxa"/>
+            </w:tcMar>
+            <w:tcBorders>
+              <w:top w:val="single" w:sz="6" w:color="D9E1F2"/>
+              <w:left w:val="single" w:sz="6" w:color="D9E1F2"/>
+              <w:bottom w:val="single" w:sz="6" w:color="D9E1F2"/>
+              <w:right w:val="single" w:sz="6" w:color="D9E1F2"/>
+              <w:insideH w:val="single" w:sz="6" w:color="D9E1F2"/>
+              <w:insideV w:val="single" w:sz="6" w:color="D9E1F2"/>
+            </w:tcBorders>
+            <w:shd w:fill="EAF2F8"/>
+          </w:tcPr>
+          <w:p>
+            <w:pPr>
+              <w:spacing w:line="340" w:lineRule="exact" w:before="20" w:after="20"/>
+              <w:jc w:val="center"/>
+            </w:pPr>
+            <w:r>
+              <w:rPr>
+                <w:rFonts w:ascii="Times New Roman" w:hAnsi="Times New Roman" w:hint="eastAsia" w:eastAsia="仿宋" w:cs="Times New Roman"/>
+                <w:b w:val="0"/>
+                <w:color w:val="000000"/>
+                <w:sz w:val="21"/>
+              </w:rPr>
+              <w:t>工具出海</w:t>
+            </w:r>
+          </w:p>
+        </w:tc>
+        <w:tc>
+          <w:tcPr>
+            <w:tcW w:type="dxa" w:w="2109"/>
+            <w:vAlign w:val="center"/>
+            <w:tcMar>
+              <w:top w:w="100" w:type="dxa"/>
+              <w:start w:w="120" w:type="dxa"/>
+              <w:bottom w:w="100" w:type="dxa"/>
+              <w:end w:w="120" w:type="dxa"/>
+            </w:tcMar>
+            <w:tcBorders>
+              <w:top w:val="single" w:sz="6" w:color="D9E1F2"/>
+              <w:left w:val="single" w:sz="6" w:color="D9E1F2"/>
+              <w:bottom w:val="single" w:sz="6" w:color="D9E1F2"/>
+              <w:right w:val="single" w:sz="6" w:color="D9E1F2"/>
+              <w:insideH w:val="single" w:sz="6" w:color="D9E1F2"/>
+              <w:insideV w:val="single" w:sz="6" w:color="D9E1F2"/>
+            </w:tcBorders>
+            <w:shd w:fill="EAF2F8"/>
+          </w:tcPr>
+          <w:p>
+            <w:pPr>
+              <w:spacing w:line="340" w:lineRule="exact" w:before="20" w:after="20"/>
+              <w:jc w:val="center"/>
+            </w:pPr>
+            <w:r>
+              <w:rPr>
+                <w:rFonts w:ascii="Times New Roman" w:hAnsi="Times New Roman" w:hint="eastAsia" w:eastAsia="仿宋" w:cs="Times New Roman"/>
+                <w:b w:val="0"/>
+                <w:color w:val="000000"/>
+                <w:sz w:val="21"/>
+              </w:rPr>
+              <w:t>四、质量不符合项处置</w:t>
+            </w:r>
+          </w:p>
+        </w:tc>
+        <w:tc>
+          <w:tcPr>
+            <w:tcW w:type="dxa" w:w="1977"/>
+            <w:vAlign w:val="center"/>
+            <w:tcMar>
+              <w:top w:w="100" w:type="dxa"/>
+              <w:start w:w="120" w:type="dxa"/>
+              <w:bottom w:w="100" w:type="dxa"/>
+              <w:end w:w="120" w:type="dxa"/>
+            </w:tcMar>
+            <w:tcBorders>
+              <w:top w:val="single" w:sz="6" w:color="D9E1F2"/>
+              <w:left w:val="single" w:sz="6" w:color="D9E1F2"/>
+              <w:bottom w:val="single" w:sz="6" w:color="D9E1F2"/>
+              <w:right w:val="single" w:sz="6" w:color="D9E1F2"/>
+              <w:insideH w:val="single" w:sz="6" w:color="D9E1F2"/>
+              <w:insideV w:val="single" w:sz="6" w:color="D9E1F2"/>
+            </w:tcBorders>
+            <w:shd w:fill="EAF2F8"/>
+          </w:tcPr>
+          <w:p>
+            <w:pPr>
+              <w:spacing w:line="340" w:lineRule="exact" w:before="20" w:after="20"/>
+              <w:jc w:val="center"/>
+            </w:pPr>
+            <w:r>
+              <w:rPr>
+                <w:rFonts w:ascii="Times New Roman" w:hAnsi="Times New Roman" w:hint="eastAsia" w:eastAsia="仿宋" w:cs="Times New Roman"/>
+                <w:b w:val="0"/>
+                <w:color w:val="000000"/>
+                <w:sz w:val="21"/>
+              </w:rPr>
+              <w:t>NCR 报告</w:t>
+            </w:r>
+          </w:p>
+        </w:tc>
+        <w:tc>
+          <w:tcPr>
+            <w:tcW w:type="dxa" w:w="3428"/>
+            <w:vAlign w:val="center"/>
+            <w:tcMar>
+              <w:top w:w="100" w:type="dxa"/>
+              <w:start w:w="120" w:type="dxa"/>
+              <w:bottom w:w="100" w:type="dxa"/>
+              <w:end w:w="120" w:type="dxa"/>
+            </w:tcMar>
+            <w:tcBorders>
+              <w:top w:val="single" w:sz="6" w:color="D9E1F2"/>
+              <w:left w:val="single" w:sz="6" w:color="D9E1F2"/>
+              <w:bottom w:val="single" w:sz="6" w:color="D9E1F2"/>
+              <w:right w:val="single" w:sz="6" w:color="D9E1F2"/>
+              <w:insideH w:val="single" w:sz="6" w:color="D9E1F2"/>
+              <w:insideV w:val="single" w:sz="6" w:color="D9E1F2"/>
+            </w:tcBorders>
+            <w:shd w:fill="EAF2F8"/>
+          </w:tcPr>
+          <w:p>
+            <w:pPr>
+              <w:spacing w:line="340" w:lineRule="exact" w:before="20" w:after="20"/>
+              <w:jc w:val="left"/>
+            </w:pPr>
+            <w:r>
+              <w:rPr>
+                <w:rFonts w:ascii="Times New Roman" w:hAnsi="Times New Roman" w:hint="eastAsia" w:eastAsia="仿宋" w:cs="Times New Roman"/>
+                <w:b w:val="0"/>
+                <w:color w:val="000000"/>
+                <w:sz w:val="21"/>
+              </w:rPr>
+              <w:t>裂缝评估依据和纠正措施计划</w:t>
+            </w:r>
+          </w:p>
+        </w:tc>
+      </w:tr>
+      <w:tr>
+        <w:trPr>
+          <w:cantSplit/>
+        </w:trPr>
+        <w:tc>
+          <w:tcPr>
+            <w:tcW w:type="dxa" w:w="1126"/>
+            <w:vAlign w:val="center"/>
+            <w:tcMar>
+              <w:top w:w="100" w:type="dxa"/>
+              <w:start w:w="120" w:type="dxa"/>
+              <w:bottom w:w="100" w:type="dxa"/>
+              <w:end w:w="120" w:type="dxa"/>
+            </w:tcMar>
+            <w:tcBorders>
+              <w:top w:val="single" w:sz="6" w:color="D9E1F2"/>
+              <w:left w:val="single" w:sz="6" w:color="D9E1F2"/>
+              <w:bottom w:val="single" w:sz="6" w:color="D9E1F2"/>
+              <w:right w:val="single" w:sz="6" w:color="D9E1F2"/>
+              <w:insideH w:val="single" w:sz="6" w:color="D9E1F2"/>
+              <w:insideV w:val="single" w:sz="6" w:color="D9E1F2"/>
+            </w:tcBorders>
+            <w:shd w:fill="FFFFFF"/>
+          </w:tcPr>
+          <w:p>
+            <w:pPr>
+              <w:spacing w:line="340" w:lineRule="exact" w:before="20" w:after="20"/>
+              <w:jc w:val="center"/>
+            </w:pPr>
+            <w:r>
+              <w:rPr>
+                <w:rFonts w:ascii="Times New Roman" w:hAnsi="Times New Roman" w:hint="eastAsia" w:eastAsia="仿宋" w:cs="Times New Roman"/>
+                <w:b w:val="0"/>
+                <w:color w:val="000000"/>
+                <w:sz w:val="21"/>
+              </w:rPr>
+              <w:t>工具出海</w:t>
+            </w:r>
+          </w:p>
+        </w:tc>
+        <w:tc>
+          <w:tcPr>
+            <w:tcW w:type="dxa" w:w="2109"/>
+            <w:vAlign w:val="center"/>
+            <w:tcMar>
+              <w:top w:w="100" w:type="dxa"/>
+              <w:start w:w="120" w:type="dxa"/>
+              <w:bottom w:w="100" w:type="dxa"/>
+              <w:end w:w="120" w:type="dxa"/>
+            </w:tcMar>
+            <w:tcBorders>
+              <w:top w:val="single" w:sz="6" w:color="D9E1F2"/>
+              <w:left w:val="single" w:sz="6" w:color="D9E1F2"/>
+              <w:bottom w:val="single" w:sz="6" w:color="D9E1F2"/>
+              <w:right w:val="single" w:sz="6" w:color="D9E1F2"/>
+              <w:insideH w:val="single" w:sz="6" w:color="D9E1F2"/>
+              <w:insideV w:val="single" w:sz="6" w:color="D9E1F2"/>
+            </w:tcBorders>
+            <w:shd w:fill="FFFFFF"/>
+          </w:tcPr>
+          <w:p>
+            <w:pPr>
+              <w:spacing w:line="340" w:lineRule="exact" w:before="20" w:after="20"/>
+              <w:jc w:val="center"/>
+            </w:pPr>
+            <w:r>
+              <w:rPr>
+                <w:rFonts w:ascii="Times New Roman" w:hAnsi="Times New Roman" w:hint="eastAsia" w:eastAsia="仿宋" w:cs="Times New Roman"/>
+                <w:b w:val="0"/>
+                <w:color w:val="000000"/>
+                <w:sz w:val="21"/>
+              </w:rPr>
+              <w:t>五、专业接口协调</w:t>
+            </w:r>
+          </w:p>
+        </w:tc>
+        <w:tc>
+          <w:tcPr>
+            <w:tcW w:type="dxa" w:w="1977"/>
+            <w:vAlign w:val="center"/>
+            <w:tcMar>
+              <w:top w:w="100" w:type="dxa"/>
+              <w:start w:w="120" w:type="dxa"/>
+              <w:bottom w:w="100" w:type="dxa"/>
+              <w:end w:w="120" w:type="dxa"/>
+            </w:tcMar>
+            <w:tcBorders>
+              <w:top w:val="single" w:sz="6" w:color="D9E1F2"/>
+              <w:left w:val="single" w:sz="6" w:color="D9E1F2"/>
+              <w:bottom w:val="single" w:sz="6" w:color="D9E1F2"/>
+              <w:right w:val="single" w:sz="6" w:color="D9E1F2"/>
+              <w:insideH w:val="single" w:sz="6" w:color="D9E1F2"/>
+              <w:insideV w:val="single" w:sz="6" w:color="D9E1F2"/>
+            </w:tcBorders>
+            <w:shd w:fill="FFFFFF"/>
+          </w:tcPr>
+          <w:p>
+            <w:pPr>
+              <w:spacing w:line="340" w:lineRule="exact" w:before="20" w:after="20"/>
+              <w:jc w:val="center"/>
+            </w:pPr>
+            <w:r>
+              <w:rPr>
+                <w:rFonts w:ascii="Times New Roman" w:hAnsi="Times New Roman" w:hint="eastAsia" w:eastAsia="仿宋" w:cs="Times New Roman"/>
+                <w:b w:val="0"/>
+                <w:color w:val="000000"/>
+                <w:sz w:val="21"/>
+              </w:rPr>
+              <w:t>土方越界业主指令</w:t>
+            </w:r>
+          </w:p>
+        </w:tc>
+        <w:tc>
+          <w:tcPr>
+            <w:tcW w:type="dxa" w:w="3428"/>
+            <w:vAlign w:val="center"/>
+            <w:tcMar>
+              <w:top w:w="100" w:type="dxa"/>
+              <w:start w:w="120" w:type="dxa"/>
+              <w:bottom w:w="100" w:type="dxa"/>
+              <w:end w:w="120" w:type="dxa"/>
+            </w:tcMar>
+            <w:tcBorders>
+              <w:top w:val="single" w:sz="6" w:color="D9E1F2"/>
+              <w:left w:val="single" w:sz="6" w:color="D9E1F2"/>
+              <w:bottom w:val="single" w:sz="6" w:color="D9E1F2"/>
+              <w:right w:val="single" w:sz="6" w:color="D9E1F2"/>
+              <w:insideH w:val="single" w:sz="6" w:color="D9E1F2"/>
+              <w:insideV w:val="single" w:sz="6" w:color="D9E1F2"/>
+            </w:tcBorders>
+            <w:shd w:fill="FFFFFF"/>
+          </w:tcPr>
+          <w:p>
+            <w:pPr>
+              <w:spacing w:line="340" w:lineRule="exact" w:before="20" w:after="20"/>
+              <w:jc w:val="left"/>
+            </w:pPr>
+            <w:r>
+              <w:rPr>
+                <w:rFonts w:ascii="Times New Roman" w:hAnsi="Times New Roman" w:hint="eastAsia" w:eastAsia="仿宋" w:cs="Times New Roman"/>
+                <w:b w:val="0"/>
+                <w:color w:val="000000"/>
+                <w:sz w:val="21"/>
+              </w:rPr>
+              <w:t>接口指令依据和联合复测要求</w:t>
+            </w:r>
+          </w:p>
+        </w:tc>
+      </w:tr>
+      <w:tr>
+        <w:trPr>
+          <w:cantSplit/>
+        </w:trPr>
+        <w:tc>
+          <w:tcPr>
+            <w:tcW w:type="dxa" w:w="1126"/>
+            <w:vAlign w:val="center"/>
+            <w:tcMar>
+              <w:top w:w="100" w:type="dxa"/>
+              <w:start w:w="120" w:type="dxa"/>
+              <w:bottom w:w="100" w:type="dxa"/>
+              <w:end w:w="120" w:type="dxa"/>
+            </w:tcMar>
+            <w:tcBorders>
+              <w:top w:val="single" w:sz="6" w:color="D9E1F2"/>
+              <w:left w:val="single" w:sz="6" w:color="D9E1F2"/>
+              <w:bottom w:val="single" w:sz="6" w:color="D9E1F2"/>
+              <w:right w:val="single" w:sz="6" w:color="D9E1F2"/>
+              <w:insideH w:val="single" w:sz="6" w:color="D9E1F2"/>
+              <w:insideV w:val="single" w:sz="6" w:color="D9E1F2"/>
+            </w:tcBorders>
+            <w:shd w:fill="EAF2F8"/>
+          </w:tcPr>
+          <w:p>
+            <w:pPr>
+              <w:spacing w:line="340" w:lineRule="exact" w:before="20" w:after="20"/>
+              <w:jc w:val="center"/>
+            </w:pPr>
+            <w:r>
+              <w:rPr>
+                <w:rFonts w:ascii="Times New Roman" w:hAnsi="Times New Roman" w:hint="eastAsia" w:eastAsia="仿宋" w:cs="Times New Roman"/>
+                <w:b w:val="0"/>
+                <w:color w:val="000000"/>
+                <w:sz w:val="21"/>
+              </w:rPr>
+              <w:t>工具出海</w:t>
+            </w:r>
+          </w:p>
+        </w:tc>
+        <w:tc>
+          <w:tcPr>
+            <w:tcW w:type="dxa" w:w="2109"/>
+            <w:vAlign w:val="center"/>
+            <w:tcMar>
+              <w:top w:w="100" w:type="dxa"/>
+              <w:start w:w="120" w:type="dxa"/>
+              <w:bottom w:w="100" w:type="dxa"/>
+              <w:end w:w="120" w:type="dxa"/>
+            </w:tcMar>
+            <w:tcBorders>
+              <w:top w:val="single" w:sz="6" w:color="D9E1F2"/>
+              <w:left w:val="single" w:sz="6" w:color="D9E1F2"/>
+              <w:bottom w:val="single" w:sz="6" w:color="D9E1F2"/>
+              <w:right w:val="single" w:sz="6" w:color="D9E1F2"/>
+              <w:insideH w:val="single" w:sz="6" w:color="D9E1F2"/>
+              <w:insideV w:val="single" w:sz="6" w:color="D9E1F2"/>
+            </w:tcBorders>
+            <w:shd w:fill="EAF2F8"/>
+          </w:tcPr>
+          <w:p>
+            <w:pPr>
+              <w:spacing w:line="340" w:lineRule="exact" w:before="20" w:after="20"/>
+              <w:jc w:val="center"/>
+            </w:pPr>
+            <w:r>
+              <w:rPr>
+                <w:rFonts w:ascii="Times New Roman" w:hAnsi="Times New Roman" w:hint="eastAsia" w:eastAsia="仿宋" w:cs="Times New Roman"/>
+                <w:b w:val="0"/>
+                <w:color w:val="000000"/>
+                <w:sz w:val="21"/>
+              </w:rPr>
+              <w:t>六、中文现场巡查记录</w:t>
+            </w:r>
+          </w:p>
+        </w:tc>
+        <w:tc>
+          <w:tcPr>
+            <w:tcW w:type="dxa" w:w="1977"/>
+            <w:vAlign w:val="center"/>
+            <w:tcMar>
+              <w:top w:w="100" w:type="dxa"/>
+              <w:start w:w="120" w:type="dxa"/>
+              <w:bottom w:w="100" w:type="dxa"/>
+              <w:end w:w="120" w:type="dxa"/>
+            </w:tcMar>
+            <w:tcBorders>
+              <w:top w:val="single" w:sz="6" w:color="D9E1F2"/>
+              <w:left w:val="single" w:sz="6" w:color="D9E1F2"/>
+              <w:bottom w:val="single" w:sz="6" w:color="D9E1F2"/>
+              <w:right w:val="single" w:sz="6" w:color="D9E1F2"/>
+              <w:insideH w:val="single" w:sz="6" w:color="D9E1F2"/>
+              <w:insideV w:val="single" w:sz="6" w:color="D9E1F2"/>
+            </w:tcBorders>
+            <w:shd w:fill="EAF2F8"/>
+          </w:tcPr>
+          <w:p>
+            <w:pPr>
+              <w:spacing w:line="340" w:lineRule="exact" w:before="20" w:after="20"/>
+              <w:jc w:val="center"/>
+            </w:pPr>
+            <w:r>
+              <w:rPr>
+                <w:rFonts w:ascii="Times New Roman" w:hAnsi="Times New Roman" w:hint="eastAsia" w:eastAsia="仿宋" w:cs="Times New Roman"/>
+                <w:b w:val="0"/>
+                <w:color w:val="000000"/>
+                <w:sz w:val="21"/>
+              </w:rPr>
+              <w:t>中文巡查记录</w:t>
+            </w:r>
+          </w:p>
+        </w:tc>
+        <w:tc>
+          <w:tcPr>
+            <w:tcW w:type="dxa" w:w="3428"/>
+            <w:vAlign w:val="center"/>
+            <w:tcMar>
+              <w:top w:w="100" w:type="dxa"/>
+              <w:start w:w="120" w:type="dxa"/>
+              <w:bottom w:w="100" w:type="dxa"/>
+              <w:end w:w="120" w:type="dxa"/>
+            </w:tcMar>
+            <w:tcBorders>
+              <w:top w:val="single" w:sz="6" w:color="D9E1F2"/>
+              <w:left w:val="single" w:sz="6" w:color="D9E1F2"/>
+              <w:bottom w:val="single" w:sz="6" w:color="D9E1F2"/>
+              <w:right w:val="single" w:sz="6" w:color="D9E1F2"/>
+              <w:insideH w:val="single" w:sz="6" w:color="D9E1F2"/>
+              <w:insideV w:val="single" w:sz="6" w:color="D9E1F2"/>
+            </w:tcBorders>
+            <w:shd w:fill="EAF2F8"/>
+          </w:tcPr>
+          <w:p>
+            <w:pPr>
+              <w:spacing w:line="340" w:lineRule="exact" w:before="20" w:after="20"/>
+              <w:jc w:val="left"/>
+            </w:pPr>
+            <w:r>
+              <w:rPr>
+                <w:rFonts w:ascii="Times New Roman" w:hAnsi="Times New Roman" w:hint="eastAsia" w:eastAsia="仿宋" w:cs="Times New Roman"/>
+                <w:b w:val="0"/>
+                <w:color w:val="000000"/>
+                <w:sz w:val="21"/>
+              </w:rPr>
+              <w:t>中英双语案例和属地法规依据</w:t>
+            </w:r>
+          </w:p>
+        </w:tc>
+      </w:tr>
+      <w:tr>
+        <w:trPr>
+          <w:cantSplit/>
+        </w:trPr>
+        <w:tc>
+          <w:tcPr>
+            <w:tcW w:type="dxa" w:w="1126"/>
+            <w:vAlign w:val="center"/>
+            <w:tcMar>
+              <w:top w:w="100" w:type="dxa"/>
+              <w:start w:w="120" w:type="dxa"/>
+              <w:bottom w:w="100" w:type="dxa"/>
+              <w:end w:w="120" w:type="dxa"/>
+            </w:tcMar>
+            <w:tcBorders>
+              <w:top w:val="single" w:sz="6" w:color="D9E1F2"/>
+              <w:left w:val="single" w:sz="6" w:color="D9E1F2"/>
+              <w:bottom w:val="single" w:sz="6" w:color="D9E1F2"/>
+              <w:right w:val="single" w:sz="6" w:color="D9E1F2"/>
+              <w:insideH w:val="single" w:sz="6" w:color="D9E1F2"/>
+              <w:insideV w:val="single" w:sz="6" w:color="D9E1F2"/>
+            </w:tcBorders>
+            <w:shd w:fill="FFFFFF"/>
+          </w:tcPr>
+          <w:p>
+            <w:pPr>
+              <w:spacing w:line="340" w:lineRule="exact" w:before="20" w:after="20"/>
+              <w:jc w:val="center"/>
+            </w:pPr>
+            <w:r>
+              <w:rPr>
+                <w:rFonts w:ascii="Times New Roman" w:hAnsi="Times New Roman" w:hint="eastAsia" w:eastAsia="仿宋" w:cs="Times New Roman"/>
+                <w:b w:val="0"/>
+                <w:color w:val="000000"/>
+                <w:sz w:val="21"/>
+              </w:rPr>
+              <w:t>属地融合</w:t>
+            </w:r>
+          </w:p>
+        </w:tc>
+        <w:tc>
+          <w:tcPr>
+            <w:tcW w:type="dxa" w:w="2109"/>
+            <w:vAlign w:val="center"/>
+            <w:tcMar>
+              <w:top w:w="100" w:type="dxa"/>
+              <w:start w:w="120" w:type="dxa"/>
+              <w:bottom w:w="100" w:type="dxa"/>
+              <w:end w:w="120" w:type="dxa"/>
+            </w:tcMar>
+            <w:tcBorders>
+              <w:top w:val="single" w:sz="6" w:color="D9E1F2"/>
+              <w:left w:val="single" w:sz="6" w:color="D9E1F2"/>
+              <w:bottom w:val="single" w:sz="6" w:color="D9E1F2"/>
+              <w:right w:val="single" w:sz="6" w:color="D9E1F2"/>
+              <w:insideH w:val="single" w:sz="6" w:color="D9E1F2"/>
+              <w:insideV w:val="single" w:sz="6" w:color="D9E1F2"/>
+            </w:tcBorders>
+            <w:shd w:fill="FFFFFF"/>
+          </w:tcPr>
+          <w:p>
+            <w:pPr>
+              <w:spacing w:line="340" w:lineRule="exact" w:before="20" w:after="20"/>
+              <w:jc w:val="center"/>
+            </w:pPr>
+            <w:r>
+              <w:rPr>
+                <w:rFonts w:ascii="Times New Roman" w:hAnsi="Times New Roman" w:hint="eastAsia" w:eastAsia="仿宋" w:cs="Times New Roman"/>
+                <w:b w:val="0"/>
+                <w:color w:val="000000"/>
+                <w:sz w:val="21"/>
+              </w:rPr>
+              <w:t>七、属地合规与许可</w:t>
+            </w:r>
+          </w:p>
+        </w:tc>
+        <w:tc>
+          <w:tcPr>
+            <w:tcW w:type="dxa" w:w="1977"/>
+            <w:vAlign w:val="center"/>
+            <w:tcMar>
+              <w:top w:w="100" w:type="dxa"/>
+              <w:start w:w="120" w:type="dxa"/>
+              <w:bottom w:w="100" w:type="dxa"/>
+              <w:end w:w="120" w:type="dxa"/>
+            </w:tcMar>
+            <w:tcBorders>
+              <w:top w:val="single" w:sz="6" w:color="D9E1F2"/>
+              <w:left w:val="single" w:sz="6" w:color="D9E1F2"/>
+              <w:bottom w:val="single" w:sz="6" w:color="D9E1F2"/>
+              <w:right w:val="single" w:sz="6" w:color="D9E1F2"/>
+              <w:insideH w:val="single" w:sz="6" w:color="D9E1F2"/>
+              <w:insideV w:val="single" w:sz="6" w:color="D9E1F2"/>
+            </w:tcBorders>
+            <w:shd w:fill="FFFFFF"/>
+          </w:tcPr>
+          <w:p>
+            <w:pPr>
+              <w:spacing w:line="340" w:lineRule="exact" w:before="20" w:after="20"/>
+              <w:jc w:val="center"/>
+            </w:pPr>
+            <w:r>
+              <w:rPr>
+                <w:rFonts w:ascii="Times New Roman" w:hAnsi="Times New Roman" w:hint="eastAsia" w:eastAsia="仿宋" w:cs="Times New Roman"/>
+                <w:b w:val="0"/>
+                <w:color w:val="000000"/>
+                <w:sz w:val="21"/>
+              </w:rPr>
+              <w:t>吊装方案与人员注册要求</w:t>
+            </w:r>
+          </w:p>
+        </w:tc>
+        <w:tc>
+          <w:tcPr>
+            <w:tcW w:type="dxa" w:w="3428"/>
+            <w:vAlign w:val="center"/>
+            <w:tcMar>
+              <w:top w:w="100" w:type="dxa"/>
+              <w:start w:w="120" w:type="dxa"/>
+              <w:bottom w:w="100" w:type="dxa"/>
+              <w:end w:w="120" w:type="dxa"/>
+            </w:tcMar>
+            <w:tcBorders>
+              <w:top w:val="single" w:sz="6" w:color="D9E1F2"/>
+              <w:left w:val="single" w:sz="6" w:color="D9E1F2"/>
+              <w:bottom w:val="single" w:sz="6" w:color="D9E1F2"/>
+              <w:right w:val="single" w:sz="6" w:color="D9E1F2"/>
+              <w:insideH w:val="single" w:sz="6" w:color="D9E1F2"/>
+              <w:insideV w:val="single" w:sz="6" w:color="D9E1F2"/>
+            </w:tcBorders>
+            <w:shd w:fill="FFFFFF"/>
+          </w:tcPr>
+          <w:p>
+            <w:pPr>
+              <w:spacing w:line="340" w:lineRule="exact" w:before="20" w:after="20"/>
+              <w:jc w:val="left"/>
+            </w:pPr>
+            <w:r>
+              <w:rPr>
+                <w:rFonts w:ascii="Times New Roman" w:hAnsi="Times New Roman" w:hint="eastAsia" w:eastAsia="仿宋" w:cs="Times New Roman"/>
+                <w:b w:val="0"/>
+                <w:color w:val="000000"/>
+                <w:sz w:val="21"/>
+              </w:rPr>
+              <w:t>CIDB 注册和施工方案关卡</w:t>
+            </w:r>
+          </w:p>
+        </w:tc>
+      </w:tr>
+      <w:tr>
+        <w:trPr>
+          <w:cantSplit/>
+        </w:trPr>
+        <w:tc>
+          <w:tcPr>
+            <w:tcW w:type="dxa" w:w="1126"/>
+            <w:vAlign w:val="center"/>
+            <w:tcMar>
+              <w:top w:w="100" w:type="dxa"/>
+              <w:start w:w="120" w:type="dxa"/>
+              <w:bottom w:w="100" w:type="dxa"/>
+              <w:end w:w="120" w:type="dxa"/>
+            </w:tcMar>
+            <w:tcBorders>
+              <w:top w:val="single" w:sz="6" w:color="D9E1F2"/>
+              <w:left w:val="single" w:sz="6" w:color="D9E1F2"/>
+              <w:bottom w:val="single" w:sz="6" w:color="D9E1F2"/>
+              <w:right w:val="single" w:sz="6" w:color="D9E1F2"/>
+              <w:insideH w:val="single" w:sz="6" w:color="D9E1F2"/>
+              <w:insideV w:val="single" w:sz="6" w:color="D9E1F2"/>
+            </w:tcBorders>
+            <w:shd w:fill="EAF2F8"/>
+          </w:tcPr>
+          <w:p>
+            <w:pPr>
+              <w:spacing w:line="340" w:lineRule="exact" w:before="20" w:after="20"/>
+              <w:jc w:val="center"/>
+            </w:pPr>
+            <w:r>
+              <w:rPr>
+                <w:rFonts w:ascii="Times New Roman" w:hAnsi="Times New Roman" w:hint="eastAsia" w:eastAsia="仿宋" w:cs="Times New Roman"/>
+                <w:b w:val="0"/>
+                <w:color w:val="000000"/>
+                <w:sz w:val="21"/>
+              </w:rPr>
+              <w:t>属地融合</w:t>
+            </w:r>
+          </w:p>
+        </w:tc>
+        <w:tc>
+          <w:tcPr>
+            <w:tcW w:type="dxa" w:w="2109"/>
+            <w:vAlign w:val="center"/>
+            <w:tcMar>
+              <w:top w:w="100" w:type="dxa"/>
+              <w:start w:w="120" w:type="dxa"/>
+              <w:bottom w:w="100" w:type="dxa"/>
+              <w:end w:w="120" w:type="dxa"/>
+            </w:tcMar>
+            <w:tcBorders>
+              <w:top w:val="single" w:sz="6" w:color="D9E1F2"/>
+              <w:left w:val="single" w:sz="6" w:color="D9E1F2"/>
+              <w:bottom w:val="single" w:sz="6" w:color="D9E1F2"/>
+              <w:right w:val="single" w:sz="6" w:color="D9E1F2"/>
+              <w:insideH w:val="single" w:sz="6" w:color="D9E1F2"/>
+              <w:insideV w:val="single" w:sz="6" w:color="D9E1F2"/>
+            </w:tcBorders>
+            <w:shd w:fill="EAF2F8"/>
+          </w:tcPr>
+          <w:p>
+            <w:pPr>
+              <w:spacing w:line="340" w:lineRule="exact" w:before="20" w:after="20"/>
+              <w:jc w:val="center"/>
+            </w:pPr>
+            <w:r>
+              <w:rPr>
+                <w:rFonts w:ascii="Times New Roman" w:hAnsi="Times New Roman" w:hint="eastAsia" w:eastAsia="仿宋" w:cs="Times New Roman"/>
+                <w:b w:val="0"/>
+                <w:color w:val="000000"/>
+                <w:sz w:val="21"/>
+              </w:rPr>
+              <w:t>八、法规与知识问答</w:t>
+            </w:r>
+          </w:p>
+        </w:tc>
+        <w:tc>
+          <w:tcPr>
+            <w:tcW w:type="dxa" w:w="1977"/>
+            <w:vAlign w:val="center"/>
+            <w:tcMar>
+              <w:top w:w="100" w:type="dxa"/>
+              <w:start w:w="120" w:type="dxa"/>
+              <w:bottom w:w="100" w:type="dxa"/>
+              <w:end w:w="120" w:type="dxa"/>
+            </w:tcMar>
+            <w:tcBorders>
+              <w:top w:val="single" w:sz="6" w:color="D9E1F2"/>
+              <w:left w:val="single" w:sz="6" w:color="D9E1F2"/>
+              <w:bottom w:val="single" w:sz="6" w:color="D9E1F2"/>
+              <w:right w:val="single" w:sz="6" w:color="D9E1F2"/>
+              <w:insideH w:val="single" w:sz="6" w:color="D9E1F2"/>
+              <w:insideV w:val="single" w:sz="6" w:color="D9E1F2"/>
+            </w:tcBorders>
+            <w:shd w:fill="EAF2F8"/>
+          </w:tcPr>
+          <w:p>
+            <w:pPr>
+              <w:spacing w:line="340" w:lineRule="exact" w:before="20" w:after="20"/>
+              <w:jc w:val="center"/>
+            </w:pPr>
+            <w:r>
+              <w:rPr>
+                <w:rFonts w:ascii="Times New Roman" w:hAnsi="Times New Roman" w:hint="eastAsia" w:eastAsia="仿宋" w:cs="Times New Roman"/>
+                <w:b w:val="0"/>
+                <w:color w:val="000000"/>
+                <w:sz w:val="21"/>
+              </w:rPr>
+              <w:t>自然语言提问</w:t>
+            </w:r>
+          </w:p>
+        </w:tc>
+        <w:tc>
+          <w:tcPr>
+            <w:tcW w:type="dxa" w:w="3428"/>
+            <w:vAlign w:val="center"/>
+            <w:tcMar>
+              <w:top w:w="100" w:type="dxa"/>
+              <w:start w:w="120" w:type="dxa"/>
+              <w:bottom w:w="100" w:type="dxa"/>
+              <w:end w:w="120" w:type="dxa"/>
+            </w:tcMar>
+            <w:tcBorders>
+              <w:top w:val="single" w:sz="6" w:color="D9E1F2"/>
+              <w:left w:val="single" w:sz="6" w:color="D9E1F2"/>
+              <w:bottom w:val="single" w:sz="6" w:color="D9E1F2"/>
+              <w:right w:val="single" w:sz="6" w:color="D9E1F2"/>
+              <w:insideH w:val="single" w:sz="6" w:color="D9E1F2"/>
+              <w:insideV w:val="single" w:sz="6" w:color="D9E1F2"/>
+            </w:tcBorders>
+            <w:shd w:fill="EAF2F8"/>
+          </w:tcPr>
+          <w:p>
+            <w:pPr>
+              <w:spacing w:line="340" w:lineRule="exact" w:before="20" w:after="20"/>
+              <w:jc w:val="left"/>
+            </w:pPr>
+            <w:r>
+              <w:rPr>
+                <w:rFonts w:ascii="Times New Roman" w:hAnsi="Times New Roman" w:hint="eastAsia" w:eastAsia="仿宋" w:cs="Times New Roman"/>
+                <w:b w:val="0"/>
+                <w:color w:val="000000"/>
+                <w:sz w:val="21"/>
+              </w:rPr>
+              <w:t>逐句引用的回答和官方来源链接</w:t>
+            </w:r>
+          </w:p>
+        </w:tc>
+      </w:tr>
+      <w:tr>
+        <w:trPr>
+          <w:cantSplit/>
+        </w:trPr>
+        <w:tc>
+          <w:tcPr>
+            <w:tcW w:type="dxa" w:w="1126"/>
+            <w:vAlign w:val="center"/>
+            <w:tcMar>
+              <w:top w:w="100" w:type="dxa"/>
+              <w:start w:w="120" w:type="dxa"/>
+              <w:bottom w:w="100" w:type="dxa"/>
+              <w:end w:w="120" w:type="dxa"/>
+            </w:tcMar>
+            <w:tcBorders>
+              <w:top w:val="single" w:sz="6" w:color="D9E1F2"/>
+              <w:left w:val="single" w:sz="6" w:color="D9E1F2"/>
+              <w:bottom w:val="single" w:sz="6" w:color="D9E1F2"/>
+              <w:right w:val="single" w:sz="6" w:color="D9E1F2"/>
+              <w:insideH w:val="single" w:sz="6" w:color="D9E1F2"/>
+              <w:insideV w:val="single" w:sz="6" w:color="D9E1F2"/>
+            </w:tcBorders>
+            <w:shd w:fill="FFFFFF"/>
+          </w:tcPr>
+          <w:p>
+            <w:pPr>
+              <w:spacing w:line="340" w:lineRule="exact" w:before="20" w:after="20"/>
+              <w:jc w:val="center"/>
+            </w:pPr>
+            <w:r>
+              <w:rPr>
+                <w:rFonts w:ascii="Times New Roman" w:hAnsi="Times New Roman" w:hint="eastAsia" w:eastAsia="仿宋" w:cs="Times New Roman"/>
+                <w:b w:val="0"/>
+                <w:color w:val="000000"/>
+                <w:sz w:val="21"/>
+              </w:rPr>
+              <w:t>属地融合</w:t>
+            </w:r>
+          </w:p>
+        </w:tc>
+        <w:tc>
+          <w:tcPr>
+            <w:tcW w:type="dxa" w:w="2109"/>
+            <w:vAlign w:val="center"/>
+            <w:tcMar>
+              <w:top w:w="100" w:type="dxa"/>
+              <w:start w:w="120" w:type="dxa"/>
+              <w:bottom w:w="100" w:type="dxa"/>
+              <w:end w:w="120" w:type="dxa"/>
+            </w:tcMar>
+            <w:tcBorders>
+              <w:top w:val="single" w:sz="6" w:color="D9E1F2"/>
+              <w:left w:val="single" w:sz="6" w:color="D9E1F2"/>
+              <w:bottom w:val="single" w:sz="6" w:color="D9E1F2"/>
+              <w:right w:val="single" w:sz="6" w:color="D9E1F2"/>
+              <w:insideH w:val="single" w:sz="6" w:color="D9E1F2"/>
+              <w:insideV w:val="single" w:sz="6" w:color="D9E1F2"/>
+            </w:tcBorders>
+            <w:shd w:fill="FFFFFF"/>
+          </w:tcPr>
+          <w:p>
+            <w:pPr>
+              <w:spacing w:line="340" w:lineRule="exact" w:before="20" w:after="20"/>
+              <w:jc w:val="left"/>
+            </w:pPr>
+            <w:r>
+              <w:rPr>
+                <w:rFonts w:ascii="Times New Roman" w:hAnsi="Times New Roman" w:hint="eastAsia" w:eastAsia="仿宋" w:cs="Times New Roman"/>
+                <w:b w:val="0"/>
+                <w:color w:val="000000"/>
+                <w:sz w:val="21"/>
+              </w:rPr>
+              <w:t>九、属地多语 HSE 培训</w:t>
+            </w:r>
+          </w:p>
+        </w:tc>
+        <w:tc>
+          <w:tcPr>
+            <w:tcW w:type="dxa" w:w="1977"/>
+            <w:vAlign w:val="center"/>
+            <w:tcMar>
+              <w:top w:w="100" w:type="dxa"/>
+              <w:start w:w="120" w:type="dxa"/>
+              <w:bottom w:w="100" w:type="dxa"/>
+              <w:end w:w="120" w:type="dxa"/>
+            </w:tcMar>
+            <w:tcBorders>
+              <w:top w:val="single" w:sz="6" w:color="D9E1F2"/>
+              <w:left w:val="single" w:sz="6" w:color="D9E1F2"/>
+              <w:bottom w:val="single" w:sz="6" w:color="D9E1F2"/>
+              <w:right w:val="single" w:sz="6" w:color="D9E1F2"/>
+              <w:insideH w:val="single" w:sz="6" w:color="D9E1F2"/>
+              <w:insideV w:val="single" w:sz="6" w:color="D9E1F2"/>
+            </w:tcBorders>
+            <w:shd w:fill="FFFFFF"/>
+          </w:tcPr>
+          <w:p>
+            <w:pPr>
+              <w:spacing w:line="340" w:lineRule="exact" w:before="20" w:after="20"/>
+              <w:jc w:val="center"/>
+            </w:pPr>
+            <w:r>
+              <w:rPr>
+                <w:rFonts w:ascii="Times New Roman" w:hAnsi="Times New Roman" w:hint="eastAsia" w:eastAsia="仿宋" w:cs="Times New Roman"/>
+                <w:b w:val="0"/>
+                <w:color w:val="000000"/>
+                <w:sz w:val="21"/>
+              </w:rPr>
+              <w:t>培训需求</w:t>
+            </w:r>
+          </w:p>
+        </w:tc>
+        <w:tc>
+          <w:tcPr>
+            <w:tcW w:type="dxa" w:w="3428"/>
+            <w:vAlign w:val="center"/>
+            <w:tcMar>
+              <w:top w:w="100" w:type="dxa"/>
+              <w:start w:w="120" w:type="dxa"/>
+              <w:bottom w:w="100" w:type="dxa"/>
+              <w:end w:w="120" w:type="dxa"/>
+            </w:tcMar>
+            <w:tcBorders>
+              <w:top w:val="single" w:sz="6" w:color="D9E1F2"/>
+              <w:left w:val="single" w:sz="6" w:color="D9E1F2"/>
+              <w:bottom w:val="single" w:sz="6" w:color="D9E1F2"/>
+              <w:right w:val="single" w:sz="6" w:color="D9E1F2"/>
+              <w:insideH w:val="single" w:sz="6" w:color="D9E1F2"/>
+              <w:insideV w:val="single" w:sz="6" w:color="D9E1F2"/>
+            </w:tcBorders>
+            <w:shd w:fill="FFFFFF"/>
+          </w:tcPr>
+          <w:p>
+            <w:pPr>
+              <w:spacing w:line="340" w:lineRule="exact" w:before="20" w:after="20"/>
+              <w:jc w:val="left"/>
+            </w:pPr>
+            <w:r>
+              <w:rPr>
+                <w:rFonts w:ascii="Times New Roman" w:hAnsi="Times New Roman" w:hint="eastAsia" w:eastAsia="仿宋" w:cs="Times New Roman"/>
+                <w:b w:val="0"/>
+                <w:color w:val="000000"/>
+                <w:sz w:val="21"/>
+              </w:rPr>
+              <w:t>英语、马来语、中文培训模块</w:t>
+            </w:r>
+          </w:p>
+        </w:tc>
+      </w:tr>
+      <w:tr>
+        <w:trPr>
+          <w:cantSplit/>
+        </w:trPr>
+        <w:tc>
+          <w:tcPr>
+            <w:tcW w:type="dxa" w:w="1126"/>
+            <w:vAlign w:val="center"/>
+            <w:tcMar>
+              <w:top w:w="100" w:type="dxa"/>
+              <w:start w:w="120" w:type="dxa"/>
+              <w:bottom w:w="100" w:type="dxa"/>
+              <w:end w:w="120" w:type="dxa"/>
+            </w:tcMar>
+            <w:tcBorders>
+              <w:top w:val="single" w:sz="6" w:color="D9E1F2"/>
+              <w:left w:val="single" w:sz="6" w:color="D9E1F2"/>
+              <w:bottom w:val="single" w:sz="6" w:color="D9E1F2"/>
+              <w:right w:val="single" w:sz="6" w:color="D9E1F2"/>
+              <w:insideH w:val="single" w:sz="6" w:color="D9E1F2"/>
+              <w:insideV w:val="single" w:sz="6" w:color="D9E1F2"/>
+            </w:tcBorders>
+            <w:shd w:fill="EAF2F8"/>
+          </w:tcPr>
+          <w:p>
+            <w:pPr>
+              <w:spacing w:line="340" w:lineRule="exact" w:before="20" w:after="20"/>
+              <w:jc w:val="center"/>
+            </w:pPr>
+            <w:r>
+              <w:rPr>
+                <w:rFonts w:ascii="Times New Roman" w:hAnsi="Times New Roman" w:hint="eastAsia" w:eastAsia="仿宋" w:cs="Times New Roman"/>
+                <w:b w:val="0"/>
+                <w:color w:val="000000"/>
+                <w:sz w:val="21"/>
+              </w:rPr>
+              <w:t>能力输出</w:t>
+            </w:r>
+          </w:p>
+        </w:tc>
+        <w:tc>
+          <w:tcPr>
+            <w:tcW w:type="dxa" w:w="2109"/>
+            <w:vAlign w:val="center"/>
+            <w:tcMar>
+              <w:top w:w="100" w:type="dxa"/>
+              <w:start w:w="120" w:type="dxa"/>
+              <w:bottom w:w="100" w:type="dxa"/>
+              <w:end w:w="120" w:type="dxa"/>
+            </w:tcMar>
+            <w:tcBorders>
+              <w:top w:val="single" w:sz="6" w:color="D9E1F2"/>
+              <w:left w:val="single" w:sz="6" w:color="D9E1F2"/>
+              <w:bottom w:val="single" w:sz="6" w:color="D9E1F2"/>
+              <w:right w:val="single" w:sz="6" w:color="D9E1F2"/>
+              <w:insideH w:val="single" w:sz="6" w:color="D9E1F2"/>
+              <w:insideV w:val="single" w:sz="6" w:color="D9E1F2"/>
+            </w:tcBorders>
+            <w:shd w:fill="EAF2F8"/>
+          </w:tcPr>
+          <w:p>
+            <w:pPr>
+              <w:spacing w:line="340" w:lineRule="exact" w:before="20" w:after="20"/>
+              <w:jc w:val="center"/>
+            </w:pPr>
+            <w:r>
+              <w:rPr>
+                <w:rFonts w:ascii="Times New Roman" w:hAnsi="Times New Roman" w:hint="eastAsia" w:eastAsia="仿宋" w:cs="Times New Roman"/>
+                <w:b w:val="0"/>
+                <w:color w:val="000000"/>
+                <w:sz w:val="21"/>
+              </w:rPr>
+              <w:t>十、项目管理与审批</w:t>
+            </w:r>
+          </w:p>
+        </w:tc>
+        <w:tc>
+          <w:tcPr>
+            <w:tcW w:type="dxa" w:w="1977"/>
+            <w:vAlign w:val="center"/>
+            <w:tcMar>
+              <w:top w:w="100" w:type="dxa"/>
+              <w:start w:w="120" w:type="dxa"/>
+              <w:bottom w:w="100" w:type="dxa"/>
+              <w:end w:w="120" w:type="dxa"/>
+            </w:tcMar>
+            <w:tcBorders>
+              <w:top w:val="single" w:sz="6" w:color="D9E1F2"/>
+              <w:left w:val="single" w:sz="6" w:color="D9E1F2"/>
+              <w:bottom w:val="single" w:sz="6" w:color="D9E1F2"/>
+              <w:right w:val="single" w:sz="6" w:color="D9E1F2"/>
+              <w:insideH w:val="single" w:sz="6" w:color="D9E1F2"/>
+              <w:insideV w:val="single" w:sz="6" w:color="D9E1F2"/>
+            </w:tcBorders>
+            <w:shd w:fill="EAF2F8"/>
+          </w:tcPr>
+          <w:p>
+            <w:pPr>
+              <w:spacing w:line="340" w:lineRule="exact" w:before="20" w:after="20"/>
+              <w:jc w:val="center"/>
+            </w:pPr>
+            <w:r>
+              <w:rPr>
+                <w:rFonts w:ascii="Times New Roman" w:hAnsi="Times New Roman" w:hint="eastAsia" w:eastAsia="仿宋" w:cs="Times New Roman"/>
+                <w:b w:val="0"/>
+                <w:color w:val="000000"/>
+                <w:sz w:val="21"/>
+              </w:rPr>
+              <w:t>项目进展、待我审批</w:t>
+            </w:r>
+          </w:p>
+        </w:tc>
+        <w:tc>
+          <w:tcPr>
+            <w:tcW w:type="dxa" w:w="3428"/>
+            <w:vAlign w:val="center"/>
+            <w:tcMar>
+              <w:top w:w="100" w:type="dxa"/>
+              <w:start w:w="120" w:type="dxa"/>
+              <w:bottom w:w="100" w:type="dxa"/>
+              <w:end w:w="120" w:type="dxa"/>
+            </w:tcMar>
+            <w:tcBorders>
+              <w:top w:val="single" w:sz="6" w:color="D9E1F2"/>
+              <w:left w:val="single" w:sz="6" w:color="D9E1F2"/>
+              <w:bottom w:val="single" w:sz="6" w:color="D9E1F2"/>
+              <w:right w:val="single" w:sz="6" w:color="D9E1F2"/>
+              <w:insideH w:val="single" w:sz="6" w:color="D9E1F2"/>
+              <w:insideV w:val="single" w:sz="6" w:color="D9E1F2"/>
+            </w:tcBorders>
+            <w:shd w:fill="EAF2F8"/>
+          </w:tcPr>
+          <w:p>
+            <w:pPr>
+              <w:spacing w:line="340" w:lineRule="exact" w:before="20" w:after="20"/>
+              <w:jc w:val="left"/>
+            </w:pPr>
+            <w:r>
+              <w:rPr>
+                <w:rFonts w:ascii="Times New Roman" w:hAnsi="Times New Roman" w:hint="eastAsia" w:eastAsia="仿宋" w:cs="Times New Roman"/>
+                <w:b w:val="0"/>
+                <w:color w:val="000000"/>
+                <w:sz w:val="21"/>
+              </w:rPr>
+              <w:t>进度、工期偏差、下一关口和审批清单</w:t>
+            </w:r>
+          </w:p>
+        </w:tc>
+      </w:tr>
+      <w:tr>
+        <w:trPr>
+          <w:cantSplit/>
+        </w:trPr>
+        <w:tc>
+          <w:tcPr>
+            <w:tcW w:type="dxa" w:w="1126"/>
+            <w:vAlign w:val="center"/>
+            <w:tcMar>
+              <w:top w:w="100" w:type="dxa"/>
+              <w:start w:w="120" w:type="dxa"/>
+              <w:bottom w:w="100" w:type="dxa"/>
+              <w:end w:w="120" w:type="dxa"/>
+            </w:tcMar>
+            <w:tcBorders>
+              <w:top w:val="single" w:sz="6" w:color="D9E1F2"/>
+              <w:left w:val="single" w:sz="6" w:color="D9E1F2"/>
+              <w:bottom w:val="single" w:sz="6" w:color="D9E1F2"/>
+              <w:right w:val="single" w:sz="6" w:color="D9E1F2"/>
+              <w:insideH w:val="single" w:sz="6" w:color="D9E1F2"/>
+              <w:insideV w:val="single" w:sz="6" w:color="D9E1F2"/>
+            </w:tcBorders>
+            <w:shd w:fill="FFFFFF"/>
+          </w:tcPr>
+          <w:p>
+            <w:pPr>
+              <w:spacing w:line="340" w:lineRule="exact" w:before="20" w:after="20"/>
+              <w:jc w:val="center"/>
+            </w:pPr>
+            <w:r>
+              <w:rPr>
+                <w:rFonts w:ascii="Times New Roman" w:hAnsi="Times New Roman" w:hint="eastAsia" w:eastAsia="仿宋" w:cs="Times New Roman"/>
+                <w:b w:val="0"/>
+                <w:color w:val="000000"/>
+                <w:sz w:val="21"/>
+              </w:rPr>
+              <w:t>能力输出</w:t>
+            </w:r>
+          </w:p>
+        </w:tc>
+        <w:tc>
+          <w:tcPr>
+            <w:tcW w:type="dxa" w:w="2109"/>
+            <w:vAlign w:val="center"/>
+            <w:tcMar>
+              <w:top w:w="100" w:type="dxa"/>
+              <w:start w:w="120" w:type="dxa"/>
+              <w:bottom w:w="100" w:type="dxa"/>
+              <w:end w:w="120" w:type="dxa"/>
+            </w:tcMar>
+            <w:tcBorders>
+              <w:top w:val="single" w:sz="6" w:color="D9E1F2"/>
+              <w:left w:val="single" w:sz="6" w:color="D9E1F2"/>
+              <w:bottom w:val="single" w:sz="6" w:color="D9E1F2"/>
+              <w:right w:val="single" w:sz="6" w:color="D9E1F2"/>
+              <w:insideH w:val="single" w:sz="6" w:color="D9E1F2"/>
+              <w:insideV w:val="single" w:sz="6" w:color="D9E1F2"/>
+            </w:tcBorders>
+            <w:shd w:fill="FFFFFF"/>
+          </w:tcPr>
+          <w:p>
+            <w:pPr>
+              <w:spacing w:line="340" w:lineRule="exact" w:before="20" w:after="20"/>
+              <w:jc w:val="left"/>
+            </w:pPr>
+            <w:r>
+              <w:rPr>
+                <w:rFonts w:ascii="Times New Roman" w:hAnsi="Times New Roman" w:hint="eastAsia" w:eastAsia="仿宋" w:cs="Times New Roman"/>
+                <w:b w:val="0"/>
+                <w:color w:val="000000"/>
+                <w:sz w:val="21"/>
+              </w:rPr>
+              <w:t>十一、数字孪生运营与方案推演</w:t>
+            </w:r>
+          </w:p>
+        </w:tc>
+        <w:tc>
+          <w:tcPr>
+            <w:tcW w:type="dxa" w:w="1977"/>
+            <w:vAlign w:val="center"/>
+            <w:tcMar>
+              <w:top w:w="100" w:type="dxa"/>
+              <w:start w:w="120" w:type="dxa"/>
+              <w:bottom w:w="100" w:type="dxa"/>
+              <w:end w:w="120" w:type="dxa"/>
+            </w:tcMar>
+            <w:tcBorders>
+              <w:top w:val="single" w:sz="6" w:color="D9E1F2"/>
+              <w:left w:val="single" w:sz="6" w:color="D9E1F2"/>
+              <w:bottom w:val="single" w:sz="6" w:color="D9E1F2"/>
+              <w:right w:val="single" w:sz="6" w:color="D9E1F2"/>
+              <w:insideH w:val="single" w:sz="6" w:color="D9E1F2"/>
+              <w:insideV w:val="single" w:sz="6" w:color="D9E1F2"/>
+            </w:tcBorders>
+            <w:shd w:fill="FFFFFF"/>
+          </w:tcPr>
+          <w:p>
+            <w:pPr>
+              <w:spacing w:line="340" w:lineRule="exact" w:before="20" w:after="20"/>
+              <w:jc w:val="center"/>
+            </w:pPr>
+            <w:r>
+              <w:rPr>
+                <w:rFonts w:ascii="Times New Roman" w:hAnsi="Times New Roman" w:hint="eastAsia" w:eastAsia="仿宋" w:cs="Times New Roman"/>
+                <w:b w:val="0"/>
+                <w:color w:val="000000"/>
+                <w:sz w:val="21"/>
+              </w:rPr>
+              <w:t>孪生对象和遥测</w:t>
+            </w:r>
+          </w:p>
+        </w:tc>
+        <w:tc>
+          <w:tcPr>
+            <w:tcW w:type="dxa" w:w="3428"/>
+            <w:vAlign w:val="center"/>
+            <w:tcMar>
+              <w:top w:w="100" w:type="dxa"/>
+              <w:start w:w="120" w:type="dxa"/>
+              <w:bottom w:w="100" w:type="dxa"/>
+              <w:end w:w="120" w:type="dxa"/>
+            </w:tcMar>
+            <w:tcBorders>
+              <w:top w:val="single" w:sz="6" w:color="D9E1F2"/>
+              <w:left w:val="single" w:sz="6" w:color="D9E1F2"/>
+              <w:bottom w:val="single" w:sz="6" w:color="D9E1F2"/>
+              <w:right w:val="single" w:sz="6" w:color="D9E1F2"/>
+              <w:insideH w:val="single" w:sz="6" w:color="D9E1F2"/>
+              <w:insideV w:val="single" w:sz="6" w:color="D9E1F2"/>
+            </w:tcBorders>
+            <w:shd w:fill="FFFFFF"/>
+          </w:tcPr>
+          <w:p>
+            <w:pPr>
+              <w:spacing w:line="340" w:lineRule="exact" w:before="20" w:after="20"/>
+              <w:jc w:val="left"/>
+            </w:pPr>
+            <w:r>
+              <w:rPr>
+                <w:rFonts w:ascii="Times New Roman" w:hAnsi="Times New Roman" w:hint="eastAsia" w:eastAsia="仿宋" w:cs="Times New Roman"/>
+                <w:b w:val="0"/>
+                <w:color w:val="000000"/>
+                <w:sz w:val="21"/>
+              </w:rPr>
+              <w:t>Twin ID 定位、4D/5D、维护和工期恢复方案</w:t>
+            </w:r>
+          </w:p>
+        </w:tc>
+      </w:tr>
+      <w:tr>
+        <w:trPr>
+          <w:cantSplit/>
+        </w:trPr>
+        <w:tc>
+          <w:tcPr>
+            <w:tcW w:type="dxa" w:w="1126"/>
+            <w:vAlign w:val="center"/>
+            <w:tcMar>
+              <w:top w:w="100" w:type="dxa"/>
+              <w:start w:w="120" w:type="dxa"/>
+              <w:bottom w:w="100" w:type="dxa"/>
+              <w:end w:w="120" w:type="dxa"/>
+            </w:tcMar>
+            <w:tcBorders>
+              <w:top w:val="single" w:sz="6" w:color="D9E1F2"/>
+              <w:left w:val="single" w:sz="6" w:color="D9E1F2"/>
+              <w:bottom w:val="single" w:sz="6" w:color="D9E1F2"/>
+              <w:right w:val="single" w:sz="6" w:color="D9E1F2"/>
+              <w:insideH w:val="single" w:sz="6" w:color="D9E1F2"/>
+              <w:insideV w:val="single" w:sz="6" w:color="D9E1F2"/>
+            </w:tcBorders>
+            <w:shd w:fill="EAF2F8"/>
+          </w:tcPr>
+          <w:p>
+            <w:pPr>
+              <w:spacing w:line="340" w:lineRule="exact" w:before="20" w:after="20"/>
+              <w:jc w:val="center"/>
+            </w:pPr>
+            <w:r>
+              <w:rPr>
+                <w:rFonts w:ascii="Times New Roman" w:hAnsi="Times New Roman" w:hint="eastAsia" w:eastAsia="仿宋" w:cs="Times New Roman"/>
+                <w:b w:val="0"/>
+                <w:color w:val="000000"/>
+                <w:sz w:val="21"/>
+              </w:rPr>
+              <w:t>能力输出</w:t>
+            </w:r>
+          </w:p>
+        </w:tc>
+        <w:tc>
+          <w:tcPr>
+            <w:tcW w:type="dxa" w:w="2109"/>
+            <w:vAlign w:val="center"/>
+            <w:tcMar>
+              <w:top w:w="100" w:type="dxa"/>
+              <w:start w:w="120" w:type="dxa"/>
+              <w:bottom w:w="100" w:type="dxa"/>
+              <w:end w:w="120" w:type="dxa"/>
+            </w:tcMar>
+            <w:tcBorders>
+              <w:top w:val="single" w:sz="6" w:color="D9E1F2"/>
+              <w:left w:val="single" w:sz="6" w:color="D9E1F2"/>
+              <w:bottom w:val="single" w:sz="6" w:color="D9E1F2"/>
+              <w:right w:val="single" w:sz="6" w:color="D9E1F2"/>
+              <w:insideH w:val="single" w:sz="6" w:color="D9E1F2"/>
+              <w:insideV w:val="single" w:sz="6" w:color="D9E1F2"/>
+            </w:tcBorders>
+            <w:shd w:fill="EAF2F8"/>
+          </w:tcPr>
+          <w:p>
+            <w:pPr>
+              <w:spacing w:line="340" w:lineRule="exact" w:before="20" w:after="20"/>
+              <w:jc w:val="left"/>
+            </w:pPr>
+            <w:r>
+              <w:rPr>
+                <w:rFonts w:ascii="Times New Roman" w:hAnsi="Times New Roman" w:hint="eastAsia" w:eastAsia="仿宋" w:cs="Times New Roman"/>
+                <w:b w:val="0"/>
+                <w:color w:val="000000"/>
+                <w:sz w:val="21"/>
+              </w:rPr>
+              <w:t>十二、现场离线采集与统一数据接入</w:t>
+            </w:r>
+          </w:p>
+        </w:tc>
+        <w:tc>
+          <w:tcPr>
+            <w:tcW w:type="dxa" w:w="1977"/>
+            <w:vAlign w:val="center"/>
+            <w:tcMar>
+              <w:top w:w="100" w:type="dxa"/>
+              <w:start w:w="120" w:type="dxa"/>
+              <w:bottom w:w="100" w:type="dxa"/>
+              <w:end w:w="120" w:type="dxa"/>
+            </w:tcMar>
+            <w:tcBorders>
+              <w:top w:val="single" w:sz="6" w:color="D9E1F2"/>
+              <w:left w:val="single" w:sz="6" w:color="D9E1F2"/>
+              <w:bottom w:val="single" w:sz="6" w:color="D9E1F2"/>
+              <w:right w:val="single" w:sz="6" w:color="D9E1F2"/>
+              <w:insideH w:val="single" w:sz="6" w:color="D9E1F2"/>
+              <w:insideV w:val="single" w:sz="6" w:color="D9E1F2"/>
+            </w:tcBorders>
+            <w:shd w:fill="EAF2F8"/>
+          </w:tcPr>
+          <w:p>
+            <w:pPr>
+              <w:spacing w:line="340" w:lineRule="exact" w:before="20" w:after="20"/>
+              <w:jc w:val="left"/>
+            </w:pPr>
+            <w:r>
+              <w:rPr>
+                <w:rFonts w:ascii="Times New Roman" w:hAnsi="Times New Roman" w:hint="eastAsia" w:eastAsia="仿宋" w:cs="Times New Roman"/>
+                <w:b w:val="0"/>
+                <w:color w:val="000000"/>
+                <w:sz w:val="21"/>
+              </w:rPr>
+              <w:t>现场观察、企业系统、模型和遥测</w:t>
+            </w:r>
+          </w:p>
+        </w:tc>
+        <w:tc>
+          <w:tcPr>
+            <w:tcW w:type="dxa" w:w="3428"/>
+            <w:vAlign w:val="center"/>
+            <w:tcMar>
+              <w:top w:w="100" w:type="dxa"/>
+              <w:start w:w="120" w:type="dxa"/>
+              <w:bottom w:w="100" w:type="dxa"/>
+              <w:end w:w="120" w:type="dxa"/>
+            </w:tcMar>
+            <w:tcBorders>
+              <w:top w:val="single" w:sz="6" w:color="D9E1F2"/>
+              <w:left w:val="single" w:sz="6" w:color="D9E1F2"/>
+              <w:bottom w:val="single" w:sz="6" w:color="D9E1F2"/>
+              <w:right w:val="single" w:sz="6" w:color="D9E1F2"/>
+              <w:insideH w:val="single" w:sz="6" w:color="D9E1F2"/>
+              <w:insideV w:val="single" w:sz="6" w:color="D9E1F2"/>
+            </w:tcBorders>
+            <w:shd w:fill="EAF2F8"/>
+          </w:tcPr>
+          <w:p>
+            <w:pPr>
+              <w:spacing w:line="340" w:lineRule="exact" w:before="20" w:after="20"/>
+              <w:jc w:val="left"/>
+            </w:pPr>
+            <w:r>
+              <w:rPr>
+                <w:rFonts w:ascii="Times New Roman" w:hAnsi="Times New Roman" w:hint="eastAsia" w:eastAsia="仿宋" w:cs="Times New Roman"/>
+                <w:b w:val="0"/>
+                <w:color w:val="000000"/>
+                <w:sz w:val="21"/>
+              </w:rPr>
+              <w:t>离线同步、六类接入回执和数据血缘</w:t>
+            </w:r>
+          </w:p>
+        </w:tc>
+      </w:tr>
+    </w:tbl>
+    <w:p>
+      <w:pPr>
+        <w:spacing w:after="40"/>
+      </w:pPr>
     </w:p>
     <w:p>
       <w:pPr>
@@ -2471,32 +4428,6 @@
           <w:sz w:val="30"/>
         </w:rPr>
         <w:t xml:space="preserve"> 的业主回复草案；独立核验器检查审批关联、执行回执、产物、哈希、证据引用和输出契约。只有六项检查全部通过，案例才关闭。整个过程不发送邮件，不修改真实资产状态。</w:t>
-      </w:r>
-    </w:p>
-    <w:p>
-      <w:pPr>
-        <w:widowControl/>
-        <w:spacing w:line="540" w:lineRule="exact" w:after="0"/>
-        <w:ind w:firstLine="639"/>
-        <w:jc w:val="both"/>
-      </w:pPr>
-      <w:r>
-        <w:rPr>
-          <w:rFonts w:ascii="Times New Roman" w:hAnsi="Times New Roman" w:hint="eastAsia" w:eastAsia="黑体" w:cs="Times New Roman"/>
-          <w:b/>
-          <w:color w:val="000000"/>
-          <w:sz w:val="30"/>
-        </w:rPr>
-        <w:t>场景二：业主及分包函件的分析与回复。</w:t>
-      </w:r>
-      <w:r>
-        <w:rPr>
-          <w:rFonts w:ascii="Times New Roman" w:hAnsi="Times New Roman" w:hint="eastAsia" w:eastAsia="仿宋" w:cs="Times New Roman"/>
-          <w:b w:val="0"/>
-          <w:color w:val="000000"/>
-          <w:sz w:val="30"/>
-        </w:rPr>
-        <w:t xml:space="preserve"> 用户在智能助手中上传一份合成的分包商变更申请函，并提问“如何回复此信函”。系统以函件主题作为案例标题，识别为合同与技术接口类、变更申请和工期影响，路由到马来西亚项目，由合同、工程和接口智能体依据变更条款和变更处理程序给出处置计划。全部人工审批后，大模型依据来函、专家结论和已引用证据起草中英文回复：确认收函、要求补充书面指令和计价资料、保留合同权利，未知信息以 [●] 占位；草稿未发送，并经同一套独立核验后关闭。</w:t>
       </w:r>
     </w:p>
     <w:p>
@@ -2554,6 +4485,1521 @@
           <w:sz w:val="24"/>
         </w:rPr>
         <w:t>图 1 七步黄金主线</w:t>
+      </w:r>
+    </w:p>
+    <w:p>
+      <w:pPr>
+        <w:widowControl/>
+        <w:spacing w:line="540" w:lineRule="exact" w:after="0"/>
+        <w:ind w:firstLine="639"/>
+        <w:jc w:val="both"/>
+      </w:pPr>
+      <w:r>
+        <w:rPr>
+          <w:rFonts w:ascii="Times New Roman" w:hAnsi="Times New Roman" w:hint="eastAsia" w:eastAsia="黑体" w:cs="Times New Roman"/>
+          <w:b/>
+          <w:color w:val="000000"/>
+          <w:sz w:val="30"/>
+        </w:rPr>
+        <w:t>场景二：业主及分包函件的分析与回复。</w:t>
+      </w:r>
+      <w:r>
+        <w:rPr>
+          <w:rFonts w:ascii="Times New Roman" w:hAnsi="Times New Roman" w:hint="eastAsia" w:eastAsia="仿宋" w:cs="Times New Roman"/>
+          <w:b w:val="0"/>
+          <w:color w:val="000000"/>
+          <w:sz w:val="30"/>
+        </w:rPr>
+        <w:t xml:space="preserve"> 用户在智能助手中上传一份合成的分包商变更申请函，并提问“如何回复此信函”。系统以函件主题作为案例标题，识别为合同与技术接口类、变更申请和工期影响，路由到马来西亚项目，由合同、工程和接口智能体依据变更条款和变更处理程序给出处置计划。全部人工审批后，大模型依据来函、专家结论和已引用证据起草中英文回复：确认收函、要求补充书面指令和计价资料、保留合同权利，未知信息以 [●] 占位；草稿未发送，并经同一套独立核验后关闭。</w:t>
+      </w:r>
+    </w:p>
+    <w:p>
+      <w:pPr>
+        <w:widowControl/>
+        <w:spacing w:line="540" w:lineRule="exact" w:after="0"/>
+        <w:ind w:firstLine="639"/>
+        <w:jc w:val="both"/>
+      </w:pPr>
+      <w:r>
+        <w:rPr>
+          <w:rFonts w:ascii="Times New Roman" w:hAnsi="Times New Roman" w:hint="eastAsia" w:eastAsia="黑体" w:cs="Times New Roman"/>
+          <w:b/>
+          <w:color w:val="000000"/>
+          <w:sz w:val="30"/>
+        </w:rPr>
+        <w:t>场景三至场景七：函件与现场记录（测试资料包实测）。</w:t>
+      </w:r>
+      <w:r>
+        <w:rPr>
+          <w:rFonts w:ascii="Times New Roman" w:hAnsi="Times New Roman" w:hint="eastAsia" w:eastAsia="仿宋" w:cs="Times New Roman"/>
+          <w:b w:val="0"/>
+          <w:color w:val="000000"/>
+          <w:sz w:val="30"/>
+        </w:rPr>
+        <w:t xml:space="preserve"> 测试资料包包含 8 份虚构的马来西亚铁路项目文件，覆盖 DOCX、PDF、TXT 和无文字层扫描件。以确定性规则模式逐份上传的实测结果如下，所有可识别文件均自动路由到马来西亚项目、施工阶段：</w:t>
+      </w:r>
+    </w:p>
+    <w:tbl>
+      <w:tblPr>
+        <w:tblW w:type="pct" w:w="5000"/>
+        <w:jc w:val="center"/>
+        <w:tblLayout w:type="fixed"/>
+        <w:tblLook w:firstColumn="1" w:firstRow="1" w:lastColumn="0" w:lastRow="0" w:noHBand="0" w:noVBand="1" w:val="04A0"/>
+      </w:tblPr>
+      <w:tblGrid>
+        <w:gridCol w:w="1737"/>
+        <w:gridCol w:w="1737"/>
+        <w:gridCol w:w="1737"/>
+        <w:gridCol w:w="1737"/>
+        <w:gridCol w:w="1737"/>
+      </w:tblGrid>
+      <w:tr>
+        <w:trPr>
+          <w:cantSplit/>
+          <w:tblHeader w:val="true"/>
+        </w:trPr>
+        <w:tc>
+          <w:tcPr>
+            <w:tcW w:type="dxa" w:w="1094"/>
+            <w:vAlign w:val="center"/>
+            <w:tcMar>
+              <w:top w:w="100" w:type="dxa"/>
+              <w:start w:w="120" w:type="dxa"/>
+              <w:bottom w:w="100" w:type="dxa"/>
+              <w:end w:w="120" w:type="dxa"/>
+            </w:tcMar>
+            <w:tcBorders>
+              <w:top w:val="single" w:sz="6" w:color="D9E1F2"/>
+              <w:left w:val="single" w:sz="6" w:color="D9E1F2"/>
+              <w:bottom w:val="single" w:sz="6" w:color="D9E1F2"/>
+              <w:right w:val="single" w:sz="6" w:color="D9E1F2"/>
+              <w:insideH w:val="single" w:sz="6" w:color="D9E1F2"/>
+              <w:insideV w:val="single" w:sz="6" w:color="D9E1F2"/>
+            </w:tcBorders>
+            <w:shd w:fill="17365D"/>
+          </w:tcPr>
+          <w:p>
+            <w:pPr>
+              <w:spacing w:line="340" w:lineRule="exact" w:before="20" w:after="20"/>
+              <w:jc w:val="center"/>
+            </w:pPr>
+            <w:r>
+              <w:rPr>
+                <w:rFonts w:ascii="Times New Roman" w:hAnsi="Times New Roman" w:hint="eastAsia" w:eastAsia="黑体" w:cs="Times New Roman"/>
+                <w:b/>
+                <w:color w:val="FFFFFF"/>
+                <w:sz w:val="21"/>
+              </w:rPr>
+              <w:t>场景</w:t>
+            </w:r>
+          </w:p>
+        </w:tc>
+        <w:tc>
+          <w:tcPr>
+            <w:tcW w:type="dxa" w:w="1545"/>
+            <w:vAlign w:val="center"/>
+            <w:tcMar>
+              <w:top w:w="100" w:type="dxa"/>
+              <w:start w:w="120" w:type="dxa"/>
+              <w:bottom w:w="100" w:type="dxa"/>
+              <w:end w:w="120" w:type="dxa"/>
+            </w:tcMar>
+            <w:tcBorders>
+              <w:top w:val="single" w:sz="6" w:color="D9E1F2"/>
+              <w:left w:val="single" w:sz="6" w:color="D9E1F2"/>
+              <w:bottom w:val="single" w:sz="6" w:color="D9E1F2"/>
+              <w:right w:val="single" w:sz="6" w:color="D9E1F2"/>
+              <w:insideH w:val="single" w:sz="6" w:color="D9E1F2"/>
+              <w:insideV w:val="single" w:sz="6" w:color="D9E1F2"/>
+            </w:tcBorders>
+            <w:shd w:fill="17365D"/>
+          </w:tcPr>
+          <w:p>
+            <w:pPr>
+              <w:spacing w:line="340" w:lineRule="exact" w:before="20" w:after="20"/>
+              <w:jc w:val="center"/>
+            </w:pPr>
+            <w:r>
+              <w:rPr>
+                <w:rFonts w:ascii="Times New Roman" w:hAnsi="Times New Roman" w:hint="eastAsia" w:eastAsia="黑体" w:cs="Times New Roman"/>
+                <w:b/>
+                <w:color w:val="FFFFFF"/>
+                <w:sz w:val="21"/>
+              </w:rPr>
+              <w:t>测试文件</w:t>
+            </w:r>
+          </w:p>
+        </w:tc>
+        <w:tc>
+          <w:tcPr>
+            <w:tcW w:type="dxa" w:w="1727"/>
+            <w:vAlign w:val="center"/>
+            <w:tcMar>
+              <w:top w:w="100" w:type="dxa"/>
+              <w:start w:w="120" w:type="dxa"/>
+              <w:bottom w:w="100" w:type="dxa"/>
+              <w:end w:w="120" w:type="dxa"/>
+            </w:tcMar>
+            <w:tcBorders>
+              <w:top w:val="single" w:sz="6" w:color="D9E1F2"/>
+              <w:left w:val="single" w:sz="6" w:color="D9E1F2"/>
+              <w:bottom w:val="single" w:sz="6" w:color="D9E1F2"/>
+              <w:right w:val="single" w:sz="6" w:color="D9E1F2"/>
+              <w:insideH w:val="single" w:sz="6" w:color="D9E1F2"/>
+              <w:insideV w:val="single" w:sz="6" w:color="D9E1F2"/>
+            </w:tcBorders>
+            <w:shd w:fill="17365D"/>
+          </w:tcPr>
+          <w:p>
+            <w:pPr>
+              <w:spacing w:line="340" w:lineRule="exact" w:before="20" w:after="20"/>
+              <w:jc w:val="center"/>
+            </w:pPr>
+            <w:r>
+              <w:rPr>
+                <w:rFonts w:ascii="Times New Roman" w:hAnsi="Times New Roman" w:hint="eastAsia" w:eastAsia="黑体" w:cs="Times New Roman"/>
+                <w:b/>
+                <w:color w:val="FFFFFF"/>
+                <w:sz w:val="21"/>
+              </w:rPr>
+              <w:t>识别结果</w:t>
+            </w:r>
+          </w:p>
+        </w:tc>
+        <w:tc>
+          <w:tcPr>
+            <w:tcW w:type="dxa" w:w="1094"/>
+            <w:vAlign w:val="center"/>
+            <w:tcMar>
+              <w:top w:w="100" w:type="dxa"/>
+              <w:start w:w="120" w:type="dxa"/>
+              <w:bottom w:w="100" w:type="dxa"/>
+              <w:end w:w="120" w:type="dxa"/>
+            </w:tcMar>
+            <w:tcBorders>
+              <w:top w:val="single" w:sz="6" w:color="D9E1F2"/>
+              <w:left w:val="single" w:sz="6" w:color="D9E1F2"/>
+              <w:bottom w:val="single" w:sz="6" w:color="D9E1F2"/>
+              <w:right w:val="single" w:sz="6" w:color="D9E1F2"/>
+              <w:insideH w:val="single" w:sz="6" w:color="D9E1F2"/>
+              <w:insideV w:val="single" w:sz="6" w:color="D9E1F2"/>
+            </w:tcBorders>
+            <w:shd w:fill="17365D"/>
+          </w:tcPr>
+          <w:p>
+            <w:pPr>
+              <w:spacing w:line="340" w:lineRule="exact" w:before="20" w:after="20"/>
+              <w:jc w:val="center"/>
+            </w:pPr>
+            <w:r>
+              <w:rPr>
+                <w:rFonts w:ascii="Times New Roman" w:hAnsi="Times New Roman" w:hint="eastAsia" w:eastAsia="黑体" w:cs="Times New Roman"/>
+                <w:b/>
+                <w:color w:val="FFFFFF"/>
+                <w:sz w:val="21"/>
+              </w:rPr>
+              <w:t>期限</w:t>
+            </w:r>
+          </w:p>
+        </w:tc>
+        <w:tc>
+          <w:tcPr>
+            <w:tcW w:type="dxa" w:w="3180"/>
+            <w:vAlign w:val="center"/>
+            <w:tcMar>
+              <w:top w:w="100" w:type="dxa"/>
+              <w:start w:w="120" w:type="dxa"/>
+              <w:bottom w:w="100" w:type="dxa"/>
+              <w:end w:w="120" w:type="dxa"/>
+            </w:tcMar>
+            <w:tcBorders>
+              <w:top w:val="single" w:sz="6" w:color="D9E1F2"/>
+              <w:left w:val="single" w:sz="6" w:color="D9E1F2"/>
+              <w:bottom w:val="single" w:sz="6" w:color="D9E1F2"/>
+              <w:right w:val="single" w:sz="6" w:color="D9E1F2"/>
+              <w:insideH w:val="single" w:sz="6" w:color="D9E1F2"/>
+              <w:insideV w:val="single" w:sz="6" w:color="D9E1F2"/>
+            </w:tcBorders>
+            <w:shd w:fill="17365D"/>
+          </w:tcPr>
+          <w:p>
+            <w:pPr>
+              <w:spacing w:line="340" w:lineRule="exact" w:before="20" w:after="20"/>
+              <w:jc w:val="center"/>
+            </w:pPr>
+            <w:r>
+              <w:rPr>
+                <w:rFonts w:ascii="Times New Roman" w:hAnsi="Times New Roman" w:hint="eastAsia" w:eastAsia="黑体" w:cs="Times New Roman"/>
+                <w:b/>
+                <w:color w:val="FFFFFF"/>
+                <w:sz w:val="21"/>
+              </w:rPr>
+              <w:t>引用依据</w:t>
+            </w:r>
+          </w:p>
+        </w:tc>
+      </w:tr>
+      <w:tr>
+        <w:trPr>
+          <w:cantSplit/>
+        </w:trPr>
+        <w:tc>
+          <w:tcPr>
+            <w:tcW w:type="dxa" w:w="1094"/>
+            <w:vAlign w:val="center"/>
+            <w:tcMar>
+              <w:top w:w="100" w:type="dxa"/>
+              <w:start w:w="120" w:type="dxa"/>
+              <w:bottom w:w="100" w:type="dxa"/>
+              <w:end w:w="120" w:type="dxa"/>
+            </w:tcMar>
+            <w:tcBorders>
+              <w:top w:val="single" w:sz="6" w:color="D9E1F2"/>
+              <w:left w:val="single" w:sz="6" w:color="D9E1F2"/>
+              <w:bottom w:val="single" w:sz="6" w:color="D9E1F2"/>
+              <w:right w:val="single" w:sz="6" w:color="D9E1F2"/>
+              <w:insideH w:val="single" w:sz="6" w:color="D9E1F2"/>
+              <w:insideV w:val="single" w:sz="6" w:color="D9E1F2"/>
+            </w:tcBorders>
+            <w:shd w:fill="FFFFFF"/>
+          </w:tcPr>
+          <w:p>
+            <w:pPr>
+              <w:spacing w:line="340" w:lineRule="exact" w:before="20" w:after="20"/>
+              <w:jc w:val="center"/>
+            </w:pPr>
+            <w:r>
+              <w:rPr>
+                <w:rFonts w:ascii="Times New Roman" w:hAnsi="Times New Roman" w:hint="eastAsia" w:eastAsia="仿宋" w:cs="Times New Roman"/>
+                <w:b w:val="0"/>
+                <w:color w:val="000000"/>
+                <w:sz w:val="21"/>
+              </w:rPr>
+              <w:t>三、临时工程责任划分</w:t>
+            </w:r>
+          </w:p>
+        </w:tc>
+        <w:tc>
+          <w:tcPr>
+            <w:tcW w:type="dxa" w:w="1545"/>
+            <w:vAlign w:val="center"/>
+            <w:tcMar>
+              <w:top w:w="100" w:type="dxa"/>
+              <w:start w:w="120" w:type="dxa"/>
+              <w:bottom w:w="100" w:type="dxa"/>
+              <w:end w:w="120" w:type="dxa"/>
+            </w:tcMar>
+            <w:tcBorders>
+              <w:top w:val="single" w:sz="6" w:color="D9E1F2"/>
+              <w:left w:val="single" w:sz="6" w:color="D9E1F2"/>
+              <w:bottom w:val="single" w:sz="6" w:color="D9E1F2"/>
+              <w:right w:val="single" w:sz="6" w:color="D9E1F2"/>
+              <w:insideH w:val="single" w:sz="6" w:color="D9E1F2"/>
+              <w:insideV w:val="single" w:sz="6" w:color="D9E1F2"/>
+            </w:tcBorders>
+            <w:shd w:fill="FFFFFF"/>
+          </w:tcPr>
+          <w:p>
+            <w:pPr>
+              <w:spacing w:line="340" w:lineRule="exact" w:before="20" w:after="20"/>
+              <w:jc w:val="left"/>
+            </w:pPr>
+            <w:r>
+              <w:rPr>
+                <w:rFonts w:ascii="Times New Roman" w:hAnsi="Times New Roman" w:hint="eastAsia" w:eastAsia="仿宋" w:cs="Times New Roman"/>
+                <w:b w:val="0"/>
+                <w:color w:val="000000"/>
+                <w:sz w:val="21"/>
+              </w:rPr>
+              <w:t>施工便道损坏业主通知（DOCX）</w:t>
+            </w:r>
+          </w:p>
+        </w:tc>
+        <w:tc>
+          <w:tcPr>
+            <w:tcW w:type="dxa" w:w="1727"/>
+            <w:vAlign w:val="center"/>
+            <w:tcMar>
+              <w:top w:w="100" w:type="dxa"/>
+              <w:start w:w="120" w:type="dxa"/>
+              <w:bottom w:w="100" w:type="dxa"/>
+              <w:end w:w="120" w:type="dxa"/>
+            </w:tcMar>
+            <w:tcBorders>
+              <w:top w:val="single" w:sz="6" w:color="D9E1F2"/>
+              <w:left w:val="single" w:sz="6" w:color="D9E1F2"/>
+              <w:bottom w:val="single" w:sz="6" w:color="D9E1F2"/>
+              <w:right w:val="single" w:sz="6" w:color="D9E1F2"/>
+              <w:insideH w:val="single" w:sz="6" w:color="D9E1F2"/>
+              <w:insideV w:val="single" w:sz="6" w:color="D9E1F2"/>
+            </w:tcBorders>
+            <w:shd w:fill="FFFFFF"/>
+          </w:tcPr>
+          <w:p>
+            <w:pPr>
+              <w:spacing w:line="340" w:lineRule="exact" w:before="20" w:after="20"/>
+              <w:jc w:val="center"/>
+            </w:pPr>
+            <w:r>
+              <w:rPr>
+                <w:rFonts w:ascii="Times New Roman" w:hAnsi="Times New Roman" w:hint="eastAsia" w:eastAsia="仿宋" w:cs="Times New Roman"/>
+                <w:b w:val="0"/>
+                <w:color w:val="000000"/>
+                <w:sz w:val="21"/>
+              </w:rPr>
+              <w:t>合同与技术接口，高风险</w:t>
+            </w:r>
+          </w:p>
+        </w:tc>
+        <w:tc>
+          <w:tcPr>
+            <w:tcW w:type="dxa" w:w="1094"/>
+            <w:vAlign w:val="center"/>
+            <w:tcMar>
+              <w:top w:w="100" w:type="dxa"/>
+              <w:start w:w="120" w:type="dxa"/>
+              <w:bottom w:w="100" w:type="dxa"/>
+              <w:end w:w="120" w:type="dxa"/>
+            </w:tcMar>
+            <w:tcBorders>
+              <w:top w:val="single" w:sz="6" w:color="D9E1F2"/>
+              <w:left w:val="single" w:sz="6" w:color="D9E1F2"/>
+              <w:bottom w:val="single" w:sz="6" w:color="D9E1F2"/>
+              <w:right w:val="single" w:sz="6" w:color="D9E1F2"/>
+              <w:insideH w:val="single" w:sz="6" w:color="D9E1F2"/>
+              <w:insideV w:val="single" w:sz="6" w:color="D9E1F2"/>
+            </w:tcBorders>
+            <w:shd w:fill="FFFFFF"/>
+          </w:tcPr>
+          <w:p>
+            <w:pPr>
+              <w:spacing w:line="340" w:lineRule="exact" w:before="20" w:after="20"/>
+              <w:jc w:val="center"/>
+            </w:pPr>
+            <w:r>
+              <w:rPr>
+                <w:rFonts w:ascii="Times New Roman" w:hAnsi="Times New Roman" w:hint="eastAsia" w:eastAsia="仿宋" w:cs="Times New Roman"/>
+                <w:b w:val="0"/>
+                <w:color w:val="000000"/>
+                <w:sz w:val="21"/>
+              </w:rPr>
+              <w:t>72 小时</w:t>
+            </w:r>
+          </w:p>
+        </w:tc>
+        <w:tc>
+          <w:tcPr>
+            <w:tcW w:type="dxa" w:w="3180"/>
+            <w:vAlign w:val="center"/>
+            <w:tcMar>
+              <w:top w:w="100" w:type="dxa"/>
+              <w:start w:w="120" w:type="dxa"/>
+              <w:bottom w:w="100" w:type="dxa"/>
+              <w:end w:w="120" w:type="dxa"/>
+            </w:tcMar>
+            <w:tcBorders>
+              <w:top w:val="single" w:sz="6" w:color="D9E1F2"/>
+              <w:left w:val="single" w:sz="6" w:color="D9E1F2"/>
+              <w:bottom w:val="single" w:sz="6" w:color="D9E1F2"/>
+              <w:right w:val="single" w:sz="6" w:color="D9E1F2"/>
+              <w:insideH w:val="single" w:sz="6" w:color="D9E1F2"/>
+              <w:insideV w:val="single" w:sz="6" w:color="D9E1F2"/>
+            </w:tcBorders>
+            <w:shd w:fill="FFFFFF"/>
+          </w:tcPr>
+          <w:p>
+            <w:pPr>
+              <w:spacing w:line="340" w:lineRule="exact" w:before="20" w:after="20"/>
+              <w:jc w:val="left"/>
+            </w:pPr>
+            <w:r>
+              <w:rPr>
+                <w:rFonts w:ascii="Times New Roman" w:hAnsi="Times New Roman" w:hint="eastAsia" w:eastAsia="仿宋" w:cs="Times New Roman"/>
+                <w:b w:val="0"/>
+                <w:color w:val="000000"/>
+                <w:sz w:val="21"/>
+              </w:rPr>
+              <w:t>CTR-A / Clause C-14.2、RM-03 / Rev C</w:t>
+            </w:r>
+          </w:p>
+        </w:tc>
+      </w:tr>
+      <w:tr>
+        <w:trPr>
+          <w:cantSplit/>
+        </w:trPr>
+        <w:tc>
+          <w:tcPr>
+            <w:tcW w:type="dxa" w:w="1094"/>
+            <w:vAlign w:val="center"/>
+            <w:tcMar>
+              <w:top w:w="100" w:type="dxa"/>
+              <w:start w:w="120" w:type="dxa"/>
+              <w:bottom w:w="100" w:type="dxa"/>
+              <w:end w:w="120" w:type="dxa"/>
+            </w:tcMar>
+            <w:tcBorders>
+              <w:top w:val="single" w:sz="6" w:color="D9E1F2"/>
+              <w:left w:val="single" w:sz="6" w:color="D9E1F2"/>
+              <w:bottom w:val="single" w:sz="6" w:color="D9E1F2"/>
+              <w:right w:val="single" w:sz="6" w:color="D9E1F2"/>
+              <w:insideH w:val="single" w:sz="6" w:color="D9E1F2"/>
+              <w:insideV w:val="single" w:sz="6" w:color="D9E1F2"/>
+            </w:tcBorders>
+            <w:shd w:fill="EAF2F8"/>
+          </w:tcPr>
+          <w:p>
+            <w:pPr>
+              <w:spacing w:line="340" w:lineRule="exact" w:before="20" w:after="20"/>
+              <w:jc w:val="center"/>
+            </w:pPr>
+            <w:r>
+              <w:rPr>
+                <w:rFonts w:ascii="Times New Roman" w:hAnsi="Times New Roman" w:hint="eastAsia" w:eastAsia="仿宋" w:cs="Times New Roman"/>
+                <w:b w:val="0"/>
+                <w:color w:val="000000"/>
+                <w:sz w:val="21"/>
+              </w:rPr>
+              <w:t>四、质量不符合项处置</w:t>
+            </w:r>
+          </w:p>
+        </w:tc>
+        <w:tc>
+          <w:tcPr>
+            <w:tcW w:type="dxa" w:w="1545"/>
+            <w:vAlign w:val="center"/>
+            <w:tcMar>
+              <w:top w:w="100" w:type="dxa"/>
+              <w:start w:w="120" w:type="dxa"/>
+              <w:bottom w:w="100" w:type="dxa"/>
+              <w:end w:w="120" w:type="dxa"/>
+            </w:tcMar>
+            <w:tcBorders>
+              <w:top w:val="single" w:sz="6" w:color="D9E1F2"/>
+              <w:left w:val="single" w:sz="6" w:color="D9E1F2"/>
+              <w:bottom w:val="single" w:sz="6" w:color="D9E1F2"/>
+              <w:right w:val="single" w:sz="6" w:color="D9E1F2"/>
+              <w:insideH w:val="single" w:sz="6" w:color="D9E1F2"/>
+              <w:insideV w:val="single" w:sz="6" w:color="D9E1F2"/>
+            </w:tcBorders>
+            <w:shd w:fill="EAF2F8"/>
+          </w:tcPr>
+          <w:p>
+            <w:pPr>
+              <w:spacing w:line="340" w:lineRule="exact" w:before="20" w:after="20"/>
+              <w:jc w:val="left"/>
+            </w:pPr>
+            <w:r>
+              <w:rPr>
+                <w:rFonts w:ascii="Times New Roman" w:hAnsi="Times New Roman" w:hint="eastAsia" w:eastAsia="仿宋" w:cs="Times New Roman"/>
+                <w:b w:val="0"/>
+                <w:color w:val="000000"/>
+                <w:sz w:val="21"/>
+              </w:rPr>
+              <w:t>P52 墩柱裂缝 NCR（PDF）</w:t>
+            </w:r>
+          </w:p>
+        </w:tc>
+        <w:tc>
+          <w:tcPr>
+            <w:tcW w:type="dxa" w:w="1727"/>
+            <w:vAlign w:val="center"/>
+            <w:tcMar>
+              <w:top w:w="100" w:type="dxa"/>
+              <w:start w:w="120" w:type="dxa"/>
+              <w:bottom w:w="100" w:type="dxa"/>
+              <w:end w:w="120" w:type="dxa"/>
+            </w:tcMar>
+            <w:tcBorders>
+              <w:top w:val="single" w:sz="6" w:color="D9E1F2"/>
+              <w:left w:val="single" w:sz="6" w:color="D9E1F2"/>
+              <w:bottom w:val="single" w:sz="6" w:color="D9E1F2"/>
+              <w:right w:val="single" w:sz="6" w:color="D9E1F2"/>
+              <w:insideH w:val="single" w:sz="6" w:color="D9E1F2"/>
+              <w:insideV w:val="single" w:sz="6" w:color="D9E1F2"/>
+            </w:tcBorders>
+            <w:shd w:fill="EAF2F8"/>
+          </w:tcPr>
+          <w:p>
+            <w:pPr>
+              <w:spacing w:line="340" w:lineRule="exact" w:before="20" w:after="20"/>
+              <w:jc w:val="center"/>
+            </w:pPr>
+            <w:r>
+              <w:rPr>
+                <w:rFonts w:ascii="Times New Roman" w:hAnsi="Times New Roman" w:hint="eastAsia" w:eastAsia="仿宋" w:cs="Times New Roman"/>
+                <w:b w:val="0"/>
+                <w:color w:val="000000"/>
+                <w:sz w:val="21"/>
+              </w:rPr>
+              <w:t>质量，中风险</w:t>
+            </w:r>
+          </w:p>
+        </w:tc>
+        <w:tc>
+          <w:tcPr>
+            <w:tcW w:type="dxa" w:w="1094"/>
+            <w:vAlign w:val="center"/>
+            <w:tcMar>
+              <w:top w:w="100" w:type="dxa"/>
+              <w:start w:w="120" w:type="dxa"/>
+              <w:bottom w:w="100" w:type="dxa"/>
+              <w:end w:w="120" w:type="dxa"/>
+            </w:tcMar>
+            <w:tcBorders>
+              <w:top w:val="single" w:sz="6" w:color="D9E1F2"/>
+              <w:left w:val="single" w:sz="6" w:color="D9E1F2"/>
+              <w:bottom w:val="single" w:sz="6" w:color="D9E1F2"/>
+              <w:right w:val="single" w:sz="6" w:color="D9E1F2"/>
+              <w:insideH w:val="single" w:sz="6" w:color="D9E1F2"/>
+              <w:insideV w:val="single" w:sz="6" w:color="D9E1F2"/>
+            </w:tcBorders>
+            <w:shd w:fill="EAF2F8"/>
+          </w:tcPr>
+          <w:p>
+            <w:pPr>
+              <w:spacing w:line="340" w:lineRule="exact" w:before="20" w:after="20"/>
+              <w:jc w:val="center"/>
+            </w:pPr>
+            <w:r>
+              <w:rPr>
+                <w:rFonts w:ascii="Times New Roman" w:hAnsi="Times New Roman" w:hint="eastAsia" w:eastAsia="仿宋" w:cs="Times New Roman"/>
+                <w:b w:val="0"/>
+                <w:color w:val="000000"/>
+                <w:sz w:val="21"/>
+              </w:rPr>
+              <w:t>7 天</w:t>
+            </w:r>
+          </w:p>
+        </w:tc>
+        <w:tc>
+          <w:tcPr>
+            <w:tcW w:type="dxa" w:w="3180"/>
+            <w:vAlign w:val="center"/>
+            <w:tcMar>
+              <w:top w:w="100" w:type="dxa"/>
+              <w:start w:w="120" w:type="dxa"/>
+              <w:bottom w:w="100" w:type="dxa"/>
+              <w:end w:w="120" w:type="dxa"/>
+            </w:tcMar>
+            <w:tcBorders>
+              <w:top w:val="single" w:sz="6" w:color="D9E1F2"/>
+              <w:left w:val="single" w:sz="6" w:color="D9E1F2"/>
+              <w:bottom w:val="single" w:sz="6" w:color="D9E1F2"/>
+              <w:right w:val="single" w:sz="6" w:color="D9E1F2"/>
+              <w:insideH w:val="single" w:sz="6" w:color="D9E1F2"/>
+              <w:insideV w:val="single" w:sz="6" w:color="D9E1F2"/>
+            </w:tcBorders>
+            <w:shd w:fill="EAF2F8"/>
+          </w:tcPr>
+          <w:p>
+            <w:pPr>
+              <w:spacing w:line="340" w:lineRule="exact" w:before="20" w:after="20"/>
+              <w:jc w:val="center"/>
+            </w:pPr>
+            <w:r>
+              <w:rPr>
+                <w:rFonts w:ascii="Times New Roman" w:hAnsi="Times New Roman" w:hint="eastAsia" w:eastAsia="仿宋" w:cs="Times New Roman"/>
+                <w:b w:val="0"/>
+                <w:color w:val="000000"/>
+                <w:sz w:val="21"/>
+              </w:rPr>
+              <w:t>ENG-NOTE-017</w:t>
+            </w:r>
+          </w:p>
+        </w:tc>
+      </w:tr>
+      <w:tr>
+        <w:trPr>
+          <w:cantSplit/>
+        </w:trPr>
+        <w:tc>
+          <w:tcPr>
+            <w:tcW w:type="dxa" w:w="1094"/>
+            <w:vAlign w:val="center"/>
+            <w:tcMar>
+              <w:top w:w="100" w:type="dxa"/>
+              <w:start w:w="120" w:type="dxa"/>
+              <w:bottom w:w="100" w:type="dxa"/>
+              <w:end w:w="120" w:type="dxa"/>
+            </w:tcMar>
+            <w:tcBorders>
+              <w:top w:val="single" w:sz="6" w:color="D9E1F2"/>
+              <w:left w:val="single" w:sz="6" w:color="D9E1F2"/>
+              <w:bottom w:val="single" w:sz="6" w:color="D9E1F2"/>
+              <w:right w:val="single" w:sz="6" w:color="D9E1F2"/>
+              <w:insideH w:val="single" w:sz="6" w:color="D9E1F2"/>
+              <w:insideV w:val="single" w:sz="6" w:color="D9E1F2"/>
+            </w:tcBorders>
+            <w:shd w:fill="FFFFFF"/>
+          </w:tcPr>
+          <w:p>
+            <w:pPr>
+              <w:spacing w:line="340" w:lineRule="exact" w:before="20" w:after="20"/>
+              <w:jc w:val="center"/>
+            </w:pPr>
+            <w:r>
+              <w:rPr>
+                <w:rFonts w:ascii="Times New Roman" w:hAnsi="Times New Roman" w:hint="eastAsia" w:eastAsia="仿宋" w:cs="Times New Roman"/>
+                <w:b w:val="0"/>
+                <w:color w:val="000000"/>
+                <w:sz w:val="21"/>
+              </w:rPr>
+              <w:t>五、专业接口协调</w:t>
+            </w:r>
+          </w:p>
+        </w:tc>
+        <w:tc>
+          <w:tcPr>
+            <w:tcW w:type="dxa" w:w="1545"/>
+            <w:vAlign w:val="center"/>
+            <w:tcMar>
+              <w:top w:w="100" w:type="dxa"/>
+              <w:start w:w="120" w:type="dxa"/>
+              <w:bottom w:w="100" w:type="dxa"/>
+              <w:end w:w="120" w:type="dxa"/>
+            </w:tcMar>
+            <w:tcBorders>
+              <w:top w:val="single" w:sz="6" w:color="D9E1F2"/>
+              <w:left w:val="single" w:sz="6" w:color="D9E1F2"/>
+              <w:bottom w:val="single" w:sz="6" w:color="D9E1F2"/>
+              <w:right w:val="single" w:sz="6" w:color="D9E1F2"/>
+              <w:insideH w:val="single" w:sz="6" w:color="D9E1F2"/>
+              <w:insideV w:val="single" w:sz="6" w:color="D9E1F2"/>
+            </w:tcBorders>
+            <w:shd w:fill="FFFFFF"/>
+          </w:tcPr>
+          <w:p>
+            <w:pPr>
+              <w:spacing w:line="340" w:lineRule="exact" w:before="20" w:after="20"/>
+              <w:jc w:val="left"/>
+            </w:pPr>
+            <w:r>
+              <w:rPr>
+                <w:rFonts w:ascii="Times New Roman" w:hAnsi="Times New Roman" w:hint="eastAsia" w:eastAsia="仿宋" w:cs="Times New Roman"/>
+                <w:b w:val="0"/>
+                <w:color w:val="000000"/>
+                <w:sz w:val="21"/>
+              </w:rPr>
+              <w:t>土方接口越界业主指令（TXT）</w:t>
+            </w:r>
+          </w:p>
+        </w:tc>
+        <w:tc>
+          <w:tcPr>
+            <w:tcW w:type="dxa" w:w="1727"/>
+            <w:vAlign w:val="center"/>
+            <w:tcMar>
+              <w:top w:w="100" w:type="dxa"/>
+              <w:start w:w="120" w:type="dxa"/>
+              <w:bottom w:w="100" w:type="dxa"/>
+              <w:end w:w="120" w:type="dxa"/>
+            </w:tcMar>
+            <w:tcBorders>
+              <w:top w:val="single" w:sz="6" w:color="D9E1F2"/>
+              <w:left w:val="single" w:sz="6" w:color="D9E1F2"/>
+              <w:bottom w:val="single" w:sz="6" w:color="D9E1F2"/>
+              <w:right w:val="single" w:sz="6" w:color="D9E1F2"/>
+              <w:insideH w:val="single" w:sz="6" w:color="D9E1F2"/>
+              <w:insideV w:val="single" w:sz="6" w:color="D9E1F2"/>
+            </w:tcBorders>
+            <w:shd w:fill="FFFFFF"/>
+          </w:tcPr>
+          <w:p>
+            <w:pPr>
+              <w:spacing w:line="340" w:lineRule="exact" w:before="20" w:after="20"/>
+              <w:jc w:val="center"/>
+            </w:pPr>
+            <w:r>
+              <w:rPr>
+                <w:rFonts w:ascii="Times New Roman" w:hAnsi="Times New Roman" w:hint="eastAsia" w:eastAsia="仿宋" w:cs="Times New Roman"/>
+                <w:b w:val="0"/>
+                <w:color w:val="000000"/>
+                <w:sz w:val="21"/>
+              </w:rPr>
+              <w:t>合同与技术接口，高风险</w:t>
+            </w:r>
+          </w:p>
+        </w:tc>
+        <w:tc>
+          <w:tcPr>
+            <w:tcW w:type="dxa" w:w="1094"/>
+            <w:vAlign w:val="center"/>
+            <w:tcMar>
+              <w:top w:w="100" w:type="dxa"/>
+              <w:start w:w="120" w:type="dxa"/>
+              <w:bottom w:w="100" w:type="dxa"/>
+              <w:end w:w="120" w:type="dxa"/>
+            </w:tcMar>
+            <w:tcBorders>
+              <w:top w:val="single" w:sz="6" w:color="D9E1F2"/>
+              <w:left w:val="single" w:sz="6" w:color="D9E1F2"/>
+              <w:bottom w:val="single" w:sz="6" w:color="D9E1F2"/>
+              <w:right w:val="single" w:sz="6" w:color="D9E1F2"/>
+              <w:insideH w:val="single" w:sz="6" w:color="D9E1F2"/>
+              <w:insideV w:val="single" w:sz="6" w:color="D9E1F2"/>
+            </w:tcBorders>
+            <w:shd w:fill="FFFFFF"/>
+          </w:tcPr>
+          <w:p>
+            <w:pPr>
+              <w:spacing w:line="340" w:lineRule="exact" w:before="20" w:after="20"/>
+              <w:jc w:val="center"/>
+            </w:pPr>
+            <w:r>
+              <w:rPr>
+                <w:rFonts w:ascii="Times New Roman" w:hAnsi="Times New Roman" w:hint="eastAsia" w:eastAsia="仿宋" w:cs="Times New Roman"/>
+                <w:b w:val="0"/>
+                <w:color w:val="000000"/>
+                <w:sz w:val="21"/>
+              </w:rPr>
+              <w:t>24 小时</w:t>
+            </w:r>
+          </w:p>
+        </w:tc>
+        <w:tc>
+          <w:tcPr>
+            <w:tcW w:type="dxa" w:w="3180"/>
+            <w:vAlign w:val="center"/>
+            <w:tcMar>
+              <w:top w:w="100" w:type="dxa"/>
+              <w:start w:w="120" w:type="dxa"/>
+              <w:bottom w:w="100" w:type="dxa"/>
+              <w:end w:w="120" w:type="dxa"/>
+            </w:tcMar>
+            <w:tcBorders>
+              <w:top w:val="single" w:sz="6" w:color="D9E1F2"/>
+              <w:left w:val="single" w:sz="6" w:color="D9E1F2"/>
+              <w:bottom w:val="single" w:sz="6" w:color="D9E1F2"/>
+              <w:right w:val="single" w:sz="6" w:color="D9E1F2"/>
+              <w:insideH w:val="single" w:sz="6" w:color="D9E1F2"/>
+              <w:insideV w:val="single" w:sz="6" w:color="D9E1F2"/>
+            </w:tcBorders>
+            <w:shd w:fill="FFFFFF"/>
+          </w:tcPr>
+          <w:p>
+            <w:pPr>
+              <w:spacing w:line="340" w:lineRule="exact" w:before="20" w:after="20"/>
+              <w:jc w:val="center"/>
+            </w:pPr>
+            <w:r>
+              <w:rPr>
+                <w:rFonts w:ascii="Times New Roman" w:hAnsi="Times New Roman" w:hint="eastAsia" w:eastAsia="仿宋" w:cs="Times New Roman"/>
+                <w:b w:val="0"/>
+                <w:color w:val="000000"/>
+                <w:sz w:val="21"/>
+              </w:rPr>
+              <w:t>SI-028</w:t>
+            </w:r>
+          </w:p>
+        </w:tc>
+      </w:tr>
+      <w:tr>
+        <w:trPr>
+          <w:cantSplit/>
+        </w:trPr>
+        <w:tc>
+          <w:tcPr>
+            <w:tcW w:type="dxa" w:w="1094"/>
+            <w:vAlign w:val="center"/>
+            <w:tcMar>
+              <w:top w:w="100" w:type="dxa"/>
+              <w:start w:w="120" w:type="dxa"/>
+              <w:bottom w:w="100" w:type="dxa"/>
+              <w:end w:w="120" w:type="dxa"/>
+            </w:tcMar>
+            <w:tcBorders>
+              <w:top w:val="single" w:sz="6" w:color="D9E1F2"/>
+              <w:left w:val="single" w:sz="6" w:color="D9E1F2"/>
+              <w:bottom w:val="single" w:sz="6" w:color="D9E1F2"/>
+              <w:right w:val="single" w:sz="6" w:color="D9E1F2"/>
+              <w:insideH w:val="single" w:sz="6" w:color="D9E1F2"/>
+              <w:insideV w:val="single" w:sz="6" w:color="D9E1F2"/>
+            </w:tcBorders>
+            <w:shd w:fill="EAF2F8"/>
+          </w:tcPr>
+          <w:p>
+            <w:pPr>
+              <w:spacing w:line="340" w:lineRule="exact" w:before="20" w:after="20"/>
+              <w:jc w:val="center"/>
+            </w:pPr>
+            <w:r>
+              <w:rPr>
+                <w:rFonts w:ascii="Times New Roman" w:hAnsi="Times New Roman" w:hint="eastAsia" w:eastAsia="仿宋" w:cs="Times New Roman"/>
+                <w:b w:val="0"/>
+                <w:color w:val="000000"/>
+                <w:sz w:val="21"/>
+              </w:rPr>
+              <w:t>六、中文现场巡查记录</w:t>
+            </w:r>
+          </w:p>
+        </w:tc>
+        <w:tc>
+          <w:tcPr>
+            <w:tcW w:type="dxa" w:w="1545"/>
+            <w:vAlign w:val="center"/>
+            <w:tcMar>
+              <w:top w:w="100" w:type="dxa"/>
+              <w:start w:w="120" w:type="dxa"/>
+              <w:bottom w:w="100" w:type="dxa"/>
+              <w:end w:w="120" w:type="dxa"/>
+            </w:tcMar>
+            <w:tcBorders>
+              <w:top w:val="single" w:sz="6" w:color="D9E1F2"/>
+              <w:left w:val="single" w:sz="6" w:color="D9E1F2"/>
+              <w:bottom w:val="single" w:sz="6" w:color="D9E1F2"/>
+              <w:right w:val="single" w:sz="6" w:color="D9E1F2"/>
+              <w:insideH w:val="single" w:sz="6" w:color="D9E1F2"/>
+              <w:insideV w:val="single" w:sz="6" w:color="D9E1F2"/>
+            </w:tcBorders>
+            <w:shd w:fill="EAF2F8"/>
+          </w:tcPr>
+          <w:p>
+            <w:pPr>
+              <w:spacing w:line="340" w:lineRule="exact" w:before="20" w:after="20"/>
+              <w:jc w:val="left"/>
+            </w:pPr>
+            <w:r>
+              <w:rPr>
+                <w:rFonts w:ascii="Times New Roman" w:hAnsi="Times New Roman" w:hint="eastAsia" w:eastAsia="仿宋" w:cs="Times New Roman"/>
+                <w:b w:val="0"/>
+                <w:color w:val="000000"/>
+                <w:sz w:val="21"/>
+              </w:rPr>
+              <w:t>高处作业巡查记录（中文 DOCX）</w:t>
+            </w:r>
+          </w:p>
+        </w:tc>
+        <w:tc>
+          <w:tcPr>
+            <w:tcW w:type="dxa" w:w="1727"/>
+            <w:vAlign w:val="center"/>
+            <w:tcMar>
+              <w:top w:w="100" w:type="dxa"/>
+              <w:start w:w="120" w:type="dxa"/>
+              <w:bottom w:w="100" w:type="dxa"/>
+              <w:end w:w="120" w:type="dxa"/>
+            </w:tcMar>
+            <w:tcBorders>
+              <w:top w:val="single" w:sz="6" w:color="D9E1F2"/>
+              <w:left w:val="single" w:sz="6" w:color="D9E1F2"/>
+              <w:bottom w:val="single" w:sz="6" w:color="D9E1F2"/>
+              <w:right w:val="single" w:sz="6" w:color="D9E1F2"/>
+              <w:insideH w:val="single" w:sz="6" w:color="D9E1F2"/>
+              <w:insideV w:val="single" w:sz="6" w:color="D9E1F2"/>
+            </w:tcBorders>
+            <w:shd w:fill="EAF2F8"/>
+          </w:tcPr>
+          <w:p>
+            <w:pPr>
+              <w:spacing w:line="340" w:lineRule="exact" w:before="20" w:after="20"/>
+              <w:jc w:val="center"/>
+            </w:pPr>
+            <w:r>
+              <w:rPr>
+                <w:rFonts w:ascii="Times New Roman" w:hAnsi="Times New Roman" w:hint="eastAsia" w:eastAsia="仿宋" w:cs="Times New Roman"/>
+                <w:b w:val="0"/>
+                <w:color w:val="000000"/>
+                <w:sz w:val="21"/>
+              </w:rPr>
+              <w:t>HSE，紧急</w:t>
+            </w:r>
+          </w:p>
+        </w:tc>
+        <w:tc>
+          <w:tcPr>
+            <w:tcW w:type="dxa" w:w="1094"/>
+            <w:vAlign w:val="center"/>
+            <w:tcMar>
+              <w:top w:w="100" w:type="dxa"/>
+              <w:start w:w="120" w:type="dxa"/>
+              <w:bottom w:w="100" w:type="dxa"/>
+              <w:end w:w="120" w:type="dxa"/>
+            </w:tcMar>
+            <w:tcBorders>
+              <w:top w:val="single" w:sz="6" w:color="D9E1F2"/>
+              <w:left w:val="single" w:sz="6" w:color="D9E1F2"/>
+              <w:bottom w:val="single" w:sz="6" w:color="D9E1F2"/>
+              <w:right w:val="single" w:sz="6" w:color="D9E1F2"/>
+              <w:insideH w:val="single" w:sz="6" w:color="D9E1F2"/>
+              <w:insideV w:val="single" w:sz="6" w:color="D9E1F2"/>
+            </w:tcBorders>
+            <w:shd w:fill="EAF2F8"/>
+          </w:tcPr>
+          <w:p>
+            <w:pPr>
+              <w:spacing w:line="340" w:lineRule="exact" w:before="20" w:after="20"/>
+              <w:jc w:val="center"/>
+            </w:pPr>
+            <w:r>
+              <w:rPr>
+                <w:rFonts w:ascii="Times New Roman" w:hAnsi="Times New Roman" w:hint="eastAsia" w:eastAsia="仿宋" w:cs="Times New Roman"/>
+                <w:b w:val="0"/>
+                <w:color w:val="000000"/>
+                <w:sz w:val="21"/>
+              </w:rPr>
+              <w:t>立即处理</w:t>
+            </w:r>
+          </w:p>
+        </w:tc>
+        <w:tc>
+          <w:tcPr>
+            <w:tcW w:type="dxa" w:w="3180"/>
+            <w:vAlign w:val="center"/>
+            <w:tcMar>
+              <w:top w:w="100" w:type="dxa"/>
+              <w:start w:w="120" w:type="dxa"/>
+              <w:bottom w:w="100" w:type="dxa"/>
+              <w:end w:w="120" w:type="dxa"/>
+            </w:tcMar>
+            <w:tcBorders>
+              <w:top w:val="single" w:sz="6" w:color="D9E1F2"/>
+              <w:left w:val="single" w:sz="6" w:color="D9E1F2"/>
+              <w:bottom w:val="single" w:sz="6" w:color="D9E1F2"/>
+              <w:right w:val="single" w:sz="6" w:color="D9E1F2"/>
+              <w:insideH w:val="single" w:sz="6" w:color="D9E1F2"/>
+              <w:insideV w:val="single" w:sz="6" w:color="D9E1F2"/>
+            </w:tcBorders>
+            <w:shd w:fill="EAF2F8"/>
+          </w:tcPr>
+          <w:p>
+            <w:pPr>
+              <w:spacing w:line="340" w:lineRule="exact" w:before="20" w:after="20"/>
+              <w:jc w:val="left"/>
+            </w:pPr>
+            <w:r>
+              <w:rPr>
+                <w:rFonts w:ascii="Times New Roman" w:hAnsi="Times New Roman" w:hint="eastAsia" w:eastAsia="仿宋" w:cs="Times New Roman"/>
+                <w:b w:val="0"/>
+                <w:color w:val="000000"/>
+                <w:sz w:val="21"/>
+              </w:rPr>
+              <w:t>MY-HSE-WAH-01、MY-DOSH-OSHA</w:t>
+            </w:r>
+          </w:p>
+        </w:tc>
+      </w:tr>
+      <w:tr>
+        <w:trPr>
+          <w:cantSplit/>
+        </w:trPr>
+        <w:tc>
+          <w:tcPr>
+            <w:tcW w:type="dxa" w:w="1094"/>
+            <w:vAlign w:val="center"/>
+            <w:tcMar>
+              <w:top w:w="100" w:type="dxa"/>
+              <w:start w:w="120" w:type="dxa"/>
+              <w:bottom w:w="100" w:type="dxa"/>
+              <w:end w:w="120" w:type="dxa"/>
+            </w:tcMar>
+            <w:tcBorders>
+              <w:top w:val="single" w:sz="6" w:color="D9E1F2"/>
+              <w:left w:val="single" w:sz="6" w:color="D9E1F2"/>
+              <w:bottom w:val="single" w:sz="6" w:color="D9E1F2"/>
+              <w:right w:val="single" w:sz="6" w:color="D9E1F2"/>
+              <w:insideH w:val="single" w:sz="6" w:color="D9E1F2"/>
+              <w:insideV w:val="single" w:sz="6" w:color="D9E1F2"/>
+            </w:tcBorders>
+            <w:shd w:fill="FFFFFF"/>
+          </w:tcPr>
+          <w:p>
+            <w:pPr>
+              <w:spacing w:line="340" w:lineRule="exact" w:before="20" w:after="20"/>
+              <w:jc w:val="center"/>
+            </w:pPr>
+            <w:r>
+              <w:rPr>
+                <w:rFonts w:ascii="Times New Roman" w:hAnsi="Times New Roman" w:hint="eastAsia" w:eastAsia="仿宋" w:cs="Times New Roman"/>
+                <w:b w:val="0"/>
+                <w:color w:val="000000"/>
+                <w:sz w:val="21"/>
+              </w:rPr>
+              <w:t>七、属地合规与许可</w:t>
+            </w:r>
+          </w:p>
+        </w:tc>
+        <w:tc>
+          <w:tcPr>
+            <w:tcW w:type="dxa" w:w="1545"/>
+            <w:vAlign w:val="center"/>
+            <w:tcMar>
+              <w:top w:w="100" w:type="dxa"/>
+              <w:start w:w="120" w:type="dxa"/>
+              <w:bottom w:w="100" w:type="dxa"/>
+              <w:end w:w="120" w:type="dxa"/>
+            </w:tcMar>
+            <w:tcBorders>
+              <w:top w:val="single" w:sz="6" w:color="D9E1F2"/>
+              <w:left w:val="single" w:sz="6" w:color="D9E1F2"/>
+              <w:bottom w:val="single" w:sz="6" w:color="D9E1F2"/>
+              <w:right w:val="single" w:sz="6" w:color="D9E1F2"/>
+              <w:insideH w:val="single" w:sz="6" w:color="D9E1F2"/>
+              <w:insideV w:val="single" w:sz="6" w:color="D9E1F2"/>
+            </w:tcBorders>
+            <w:shd w:fill="FFFFFF"/>
+          </w:tcPr>
+          <w:p>
+            <w:pPr>
+              <w:spacing w:line="340" w:lineRule="exact" w:before="20" w:after="20"/>
+              <w:jc w:val="left"/>
+            </w:pPr>
+            <w:r>
+              <w:rPr>
+                <w:rFonts w:ascii="Times New Roman" w:hAnsi="Times New Roman" w:hint="eastAsia" w:eastAsia="仿宋" w:cs="Times New Roman"/>
+                <w:b w:val="0"/>
+                <w:color w:val="000000"/>
+                <w:sz w:val="21"/>
+              </w:rPr>
+              <w:t>吊装方案与人员注册来函（DOCX）</w:t>
+            </w:r>
+          </w:p>
+        </w:tc>
+        <w:tc>
+          <w:tcPr>
+            <w:tcW w:type="dxa" w:w="1727"/>
+            <w:vAlign w:val="center"/>
+            <w:tcMar>
+              <w:top w:w="100" w:type="dxa"/>
+              <w:start w:w="120" w:type="dxa"/>
+              <w:bottom w:w="100" w:type="dxa"/>
+              <w:end w:w="120" w:type="dxa"/>
+            </w:tcMar>
+            <w:tcBorders>
+              <w:top w:val="single" w:sz="6" w:color="D9E1F2"/>
+              <w:left w:val="single" w:sz="6" w:color="D9E1F2"/>
+              <w:bottom w:val="single" w:sz="6" w:color="D9E1F2"/>
+              <w:right w:val="single" w:sz="6" w:color="D9E1F2"/>
+              <w:insideH w:val="single" w:sz="6" w:color="D9E1F2"/>
+              <w:insideV w:val="single" w:sz="6" w:color="D9E1F2"/>
+            </w:tcBorders>
+            <w:shd w:fill="FFFFFF"/>
+          </w:tcPr>
+          <w:p>
+            <w:pPr>
+              <w:spacing w:line="340" w:lineRule="exact" w:before="20" w:after="20"/>
+              <w:jc w:val="center"/>
+            </w:pPr>
+            <w:r>
+              <w:rPr>
+                <w:rFonts w:ascii="Times New Roman" w:hAnsi="Times New Roman" w:hint="eastAsia" w:eastAsia="仿宋" w:cs="Times New Roman"/>
+                <w:b w:val="0"/>
+                <w:color w:val="000000"/>
+                <w:sz w:val="21"/>
+              </w:rPr>
+              <w:t>合规，高风险</w:t>
+            </w:r>
+          </w:p>
+        </w:tc>
+        <w:tc>
+          <w:tcPr>
+            <w:tcW w:type="dxa" w:w="1094"/>
+            <w:vAlign w:val="center"/>
+            <w:tcMar>
+              <w:top w:w="100" w:type="dxa"/>
+              <w:start w:w="120" w:type="dxa"/>
+              <w:bottom w:w="100" w:type="dxa"/>
+              <w:end w:w="120" w:type="dxa"/>
+            </w:tcMar>
+            <w:tcBorders>
+              <w:top w:val="single" w:sz="6" w:color="D9E1F2"/>
+              <w:left w:val="single" w:sz="6" w:color="D9E1F2"/>
+              <w:bottom w:val="single" w:sz="6" w:color="D9E1F2"/>
+              <w:right w:val="single" w:sz="6" w:color="D9E1F2"/>
+              <w:insideH w:val="single" w:sz="6" w:color="D9E1F2"/>
+              <w:insideV w:val="single" w:sz="6" w:color="D9E1F2"/>
+            </w:tcBorders>
+            <w:shd w:fill="FFFFFF"/>
+          </w:tcPr>
+          <w:p>
+            <w:pPr>
+              <w:spacing w:line="340" w:lineRule="exact" w:before="20" w:after="20"/>
+              <w:jc w:val="center"/>
+            </w:pPr>
+            <w:r>
+              <w:rPr>
+                <w:rFonts w:ascii="Times New Roman" w:hAnsi="Times New Roman" w:hint="eastAsia" w:eastAsia="仿宋" w:cs="Times New Roman"/>
+                <w:b w:val="0"/>
+                <w:color w:val="000000"/>
+                <w:sz w:val="21"/>
+              </w:rPr>
+              <w:t>5 天</w:t>
+            </w:r>
+          </w:p>
+        </w:tc>
+        <w:tc>
+          <w:tcPr>
+            <w:tcW w:type="dxa" w:w="3180"/>
+            <w:vAlign w:val="center"/>
+            <w:tcMar>
+              <w:top w:w="100" w:type="dxa"/>
+              <w:start w:w="120" w:type="dxa"/>
+              <w:bottom w:w="100" w:type="dxa"/>
+              <w:end w:w="120" w:type="dxa"/>
+            </w:tcMar>
+            <w:tcBorders>
+              <w:top w:val="single" w:sz="6" w:color="D9E1F2"/>
+              <w:left w:val="single" w:sz="6" w:color="D9E1F2"/>
+              <w:bottom w:val="single" w:sz="6" w:color="D9E1F2"/>
+              <w:right w:val="single" w:sz="6" w:color="D9E1F2"/>
+              <w:insideH w:val="single" w:sz="6" w:color="D9E1F2"/>
+              <w:insideV w:val="single" w:sz="6" w:color="D9E1F2"/>
+            </w:tcBorders>
+            <w:shd w:fill="FFFFFF"/>
+          </w:tcPr>
+          <w:p>
+            <w:pPr>
+              <w:spacing w:line="340" w:lineRule="exact" w:before="20" w:after="20"/>
+              <w:jc w:val="left"/>
+            </w:pPr>
+            <w:r>
+              <w:rPr>
+                <w:rFonts w:ascii="Times New Roman" w:hAnsi="Times New Roman" w:hint="eastAsia" w:eastAsia="仿宋" w:cs="Times New Roman"/>
+                <w:b w:val="0"/>
+                <w:color w:val="000000"/>
+                <w:sz w:val="21"/>
+              </w:rPr>
+              <w:t>MY-CIDB-PERSONNEL</w:t>
+            </w:r>
+          </w:p>
+        </w:tc>
+      </w:tr>
+      <w:tr>
+        <w:trPr>
+          <w:cantSplit/>
+        </w:trPr>
+        <w:tc>
+          <w:tcPr>
+            <w:tcW w:type="dxa" w:w="1094"/>
+            <w:vAlign w:val="center"/>
+            <w:tcMar>
+              <w:top w:w="100" w:type="dxa"/>
+              <w:start w:w="120" w:type="dxa"/>
+              <w:bottom w:w="100" w:type="dxa"/>
+              <w:end w:w="120" w:type="dxa"/>
+            </w:tcMar>
+            <w:tcBorders>
+              <w:top w:val="single" w:sz="6" w:color="D9E1F2"/>
+              <w:left w:val="single" w:sz="6" w:color="D9E1F2"/>
+              <w:bottom w:val="single" w:sz="6" w:color="D9E1F2"/>
+              <w:right w:val="single" w:sz="6" w:color="D9E1F2"/>
+              <w:insideH w:val="single" w:sz="6" w:color="D9E1F2"/>
+              <w:insideV w:val="single" w:sz="6" w:color="D9E1F2"/>
+            </w:tcBorders>
+            <w:shd w:fill="EAF2F8"/>
+          </w:tcPr>
+          <w:p>
+            <w:pPr>
+              <w:spacing w:line="340" w:lineRule="exact" w:before="20" w:after="20"/>
+              <w:jc w:val="center"/>
+            </w:pPr>
+            <w:r>
+              <w:rPr>
+                <w:rFonts w:ascii="Times New Roman" w:hAnsi="Times New Roman" w:hint="eastAsia" w:eastAsia="仿宋" w:cs="Times New Roman"/>
+                <w:b w:val="0"/>
+                <w:color w:val="000000"/>
+                <w:sz w:val="21"/>
+              </w:rPr>
+              <w:t>边界情况</w:t>
+            </w:r>
+          </w:p>
+        </w:tc>
+        <w:tc>
+          <w:tcPr>
+            <w:tcW w:type="dxa" w:w="1545"/>
+            <w:vAlign w:val="center"/>
+            <w:tcMar>
+              <w:top w:w="100" w:type="dxa"/>
+              <w:start w:w="120" w:type="dxa"/>
+              <w:bottom w:w="100" w:type="dxa"/>
+              <w:end w:w="120" w:type="dxa"/>
+            </w:tcMar>
+            <w:tcBorders>
+              <w:top w:val="single" w:sz="6" w:color="D9E1F2"/>
+              <w:left w:val="single" w:sz="6" w:color="D9E1F2"/>
+              <w:bottom w:val="single" w:sz="6" w:color="D9E1F2"/>
+              <w:right w:val="single" w:sz="6" w:color="D9E1F2"/>
+              <w:insideH w:val="single" w:sz="6" w:color="D9E1F2"/>
+              <w:insideV w:val="single" w:sz="6" w:color="D9E1F2"/>
+            </w:tcBorders>
+            <w:shd w:fill="EAF2F8"/>
+          </w:tcPr>
+          <w:p>
+            <w:pPr>
+              <w:spacing w:line="340" w:lineRule="exact" w:before="20" w:after="20"/>
+              <w:jc w:val="center"/>
+            </w:pPr>
+            <w:r>
+              <w:rPr>
+                <w:rFonts w:ascii="Times New Roman" w:hAnsi="Times New Roman" w:hint="eastAsia" w:eastAsia="仿宋" w:cs="Times New Roman"/>
+                <w:b w:val="0"/>
+                <w:color w:val="000000"/>
+                <w:sz w:val="21"/>
+              </w:rPr>
+              <w:t>无文字层扫描件（PDF）</w:t>
+            </w:r>
+          </w:p>
+        </w:tc>
+        <w:tc>
+          <w:tcPr>
+            <w:tcW w:type="dxa" w:w="1727"/>
+            <w:vAlign w:val="center"/>
+            <w:tcMar>
+              <w:top w:w="100" w:type="dxa"/>
+              <w:start w:w="120" w:type="dxa"/>
+              <w:bottom w:w="100" w:type="dxa"/>
+              <w:end w:w="120" w:type="dxa"/>
+            </w:tcMar>
+            <w:tcBorders>
+              <w:top w:val="single" w:sz="6" w:color="D9E1F2"/>
+              <w:left w:val="single" w:sz="6" w:color="D9E1F2"/>
+              <w:bottom w:val="single" w:sz="6" w:color="D9E1F2"/>
+              <w:right w:val="single" w:sz="6" w:color="D9E1F2"/>
+              <w:insideH w:val="single" w:sz="6" w:color="D9E1F2"/>
+              <w:insideV w:val="single" w:sz="6" w:color="D9E1F2"/>
+            </w:tcBorders>
+            <w:shd w:fill="EAF2F8"/>
+          </w:tcPr>
+          <w:p>
+            <w:pPr>
+              <w:spacing w:line="340" w:lineRule="exact" w:before="20" w:after="20"/>
+              <w:jc w:val="left"/>
+            </w:pPr>
+            <w:r>
+              <w:rPr>
+                <w:rFonts w:ascii="Times New Roman" w:hAnsi="Times New Roman" w:hint="eastAsia" w:eastAsia="仿宋" w:cs="Times New Roman"/>
+                <w:b w:val="0"/>
+                <w:color w:val="000000"/>
+                <w:sz w:val="21"/>
+              </w:rPr>
+              <w:t>不建立案例，返回需 OCR 的接收回执</w:t>
+            </w:r>
+          </w:p>
+        </w:tc>
+        <w:tc>
+          <w:tcPr>
+            <w:tcW w:type="dxa" w:w="1094"/>
+            <w:vAlign w:val="center"/>
+            <w:tcMar>
+              <w:top w:w="100" w:type="dxa"/>
+              <w:start w:w="120" w:type="dxa"/>
+              <w:bottom w:w="100" w:type="dxa"/>
+              <w:end w:w="120" w:type="dxa"/>
+            </w:tcMar>
+            <w:tcBorders>
+              <w:top w:val="single" w:sz="6" w:color="D9E1F2"/>
+              <w:left w:val="single" w:sz="6" w:color="D9E1F2"/>
+              <w:bottom w:val="single" w:sz="6" w:color="D9E1F2"/>
+              <w:right w:val="single" w:sz="6" w:color="D9E1F2"/>
+              <w:insideH w:val="single" w:sz="6" w:color="D9E1F2"/>
+              <w:insideV w:val="single" w:sz="6" w:color="D9E1F2"/>
+            </w:tcBorders>
+            <w:shd w:fill="EAF2F8"/>
+          </w:tcPr>
+          <w:p>
+            <w:pPr>
+              <w:spacing w:line="340" w:lineRule="exact" w:before="20" w:after="20"/>
+              <w:jc w:val="center"/>
+            </w:pPr>
+            <w:r>
+              <w:rPr>
+                <w:rFonts w:ascii="Times New Roman" w:hAnsi="Times New Roman" w:hint="eastAsia" w:eastAsia="仿宋" w:cs="Times New Roman"/>
+                <w:b w:val="0"/>
+                <w:color w:val="000000"/>
+                <w:sz w:val="21"/>
+              </w:rPr>
+              <w:t>—</w:t>
+            </w:r>
+          </w:p>
+        </w:tc>
+        <w:tc>
+          <w:tcPr>
+            <w:tcW w:type="dxa" w:w="3180"/>
+            <w:vAlign w:val="center"/>
+            <w:tcMar>
+              <w:top w:w="100" w:type="dxa"/>
+              <w:start w:w="120" w:type="dxa"/>
+              <w:bottom w:w="100" w:type="dxa"/>
+              <w:end w:w="120" w:type="dxa"/>
+            </w:tcMar>
+            <w:tcBorders>
+              <w:top w:val="single" w:sz="6" w:color="D9E1F2"/>
+              <w:left w:val="single" w:sz="6" w:color="D9E1F2"/>
+              <w:bottom w:val="single" w:sz="6" w:color="D9E1F2"/>
+              <w:right w:val="single" w:sz="6" w:color="D9E1F2"/>
+              <w:insideH w:val="single" w:sz="6" w:color="D9E1F2"/>
+              <w:insideV w:val="single" w:sz="6" w:color="D9E1F2"/>
+            </w:tcBorders>
+            <w:shd w:fill="EAF2F8"/>
+          </w:tcPr>
+          <w:p>
+            <w:pPr>
+              <w:spacing w:line="340" w:lineRule="exact" w:before="20" w:after="20"/>
+              <w:jc w:val="center"/>
+            </w:pPr>
+            <w:r>
+              <w:rPr>
+                <w:rFonts w:ascii="Times New Roman" w:hAnsi="Times New Roman" w:hint="eastAsia" w:eastAsia="仿宋" w:cs="Times New Roman"/>
+                <w:b w:val="0"/>
+                <w:color w:val="000000"/>
+                <w:sz w:val="21"/>
+              </w:rPr>
+              <w:t>—</w:t>
+            </w:r>
+          </w:p>
+        </w:tc>
+      </w:tr>
+    </w:tbl>
+    <w:p>
+      <w:pPr>
+        <w:spacing w:after="40"/>
+      </w:pPr>
+    </w:p>
+    <w:p>
+      <w:pPr>
+        <w:widowControl/>
+        <w:spacing w:line="540" w:lineRule="exact" w:after="0"/>
+        <w:ind w:firstLine="639"/>
+        <w:jc w:val="both"/>
+      </w:pPr>
+      <w:r>
+        <w:rPr>
+          <w:rFonts w:ascii="Times New Roman" w:hAnsi="Times New Roman" w:hint="eastAsia" w:eastAsia="仿宋" w:cs="Times New Roman"/>
+          <w:b w:val="0"/>
+          <w:color w:val="000000"/>
+          <w:sz w:val="30"/>
+        </w:rPr>
+        <w:t>每个案例随后进入与场景一相同的审批、草稿、核验和关闭流程。系统只引用本国和通用资料，不会把其他国家的法规作为依据；扫描件没有可核验文字时，系统保留原件但不猜测内容。</w:t>
+      </w:r>
+    </w:p>
+    <w:p>
+      <w:pPr>
+        <w:widowControl/>
+        <w:spacing w:line="540" w:lineRule="exact" w:after="0"/>
+        <w:ind w:firstLine="639"/>
+        <w:jc w:val="both"/>
+      </w:pPr>
+      <w:r>
+        <w:rPr>
+          <w:rFonts w:ascii="Times New Roman" w:hAnsi="Times New Roman" w:hint="eastAsia" w:eastAsia="黑体" w:cs="Times New Roman"/>
+          <w:b/>
+          <w:color w:val="000000"/>
+          <w:sz w:val="30"/>
+        </w:rPr>
+        <w:t>场景八：法规与知识问答。</w:t>
+      </w:r>
+      <w:r>
+        <w:rPr>
+          <w:rFonts w:ascii="Times New Roman" w:hAnsi="Times New Roman" w:hint="eastAsia" w:eastAsia="仿宋" w:cs="Times New Roman"/>
+          <w:b w:val="0"/>
+          <w:color w:val="000000"/>
+          <w:sz w:val="30"/>
+        </w:rPr>
+        <w:t xml:space="preserve"> 用户在智能助手中直接提问，例如“马来西亚高处作业有什么要求”。系统检索国家包和项目知识库，由模型仅依据检索到的来源组织回答，并逐句标注来源编号；点击编号可展开条文、主管机关、版本、复核日期和官方链接。没有足够依据时明确拒答，范围外的问题（如天气）会说明不在服务范围。</w:t>
+      </w:r>
+    </w:p>
+    <w:p>
+      <w:pPr>
+        <w:widowControl/>
+        <w:spacing w:line="540" w:lineRule="exact" w:after="0"/>
+        <w:ind w:firstLine="639"/>
+        <w:jc w:val="both"/>
+      </w:pPr>
+      <w:r>
+        <w:rPr>
+          <w:rFonts w:ascii="Times New Roman" w:hAnsi="Times New Roman" w:hint="eastAsia" w:eastAsia="黑体" w:cs="Times New Roman"/>
+          <w:b/>
+          <w:color w:val="000000"/>
+          <w:sz w:val="30"/>
+        </w:rPr>
+        <w:t>场景九：属地多语 HSE 培训。</w:t>
+      </w:r>
+      <w:r>
+        <w:rPr>
+          <w:rFonts w:ascii="Times New Roman" w:hAnsi="Times New Roman" w:hint="eastAsia" w:eastAsia="仿宋" w:cs="Times New Roman"/>
+          <w:b w:val="0"/>
+          <w:color w:val="000000"/>
+          <w:sz w:val="30"/>
+        </w:rPr>
+        <w:t xml:space="preserve"> 培训模块按国家包术语提供高处作业、吊装作业等课程，每门课程同时提供英语、马来语和中文版本，包含危险源识别、管控层级、使用前检查、班前讲话和知识测验，用于属地员工的岗前培训。培训批准和人员资质认定仍由项目负责角色管理。</w:t>
+      </w:r>
+    </w:p>
+    <w:p>
+      <w:pPr>
+        <w:widowControl/>
+        <w:spacing w:line="540" w:lineRule="exact" w:after="0"/>
+        <w:ind w:firstLine="639"/>
+        <w:jc w:val="both"/>
+      </w:pPr>
+      <w:r>
+        <w:rPr>
+          <w:rFonts w:ascii="Times New Roman" w:hAnsi="Times New Roman" w:hint="eastAsia" w:eastAsia="黑体" w:cs="Times New Roman"/>
+          <w:b/>
+          <w:color w:val="000000"/>
+          <w:sz w:val="30"/>
+        </w:rPr>
+        <w:t>场景十：项目管理与审批。</w:t>
+      </w:r>
+      <w:r>
+        <w:rPr>
+          <w:rFonts w:ascii="Times New Roman" w:hAnsi="Times New Roman" w:hint="eastAsia" w:eastAsia="仿宋" w:cs="Times New Roman"/>
+          <w:b w:val="0"/>
+          <w:color w:val="000000"/>
+          <w:sz w:val="30"/>
+        </w:rPr>
+        <w:t xml:space="preserve"> 项目经理在智能助手中询问“项目进展”或“待我审批”，系统汇总各项目的进度、工期偏差、下一关口和待审批事项，可直接在卡片上批准或驳回；要求代为批准时，系统只列出清单，不代为操作。指挥中心全景页汇总项目组合、国家、风险和经核验的决策。</w:t>
+      </w:r>
+    </w:p>
+    <w:p>
+      <w:pPr>
+        <w:widowControl/>
+        <w:spacing w:line="540" w:lineRule="exact" w:after="0"/>
+        <w:ind w:firstLine="639"/>
+        <w:jc w:val="both"/>
+      </w:pPr>
+      <w:r>
+        <w:rPr>
+          <w:rFonts w:ascii="Times New Roman" w:hAnsi="Times New Roman" w:hint="eastAsia" w:eastAsia="黑体" w:cs="Times New Roman"/>
+          <w:b/>
+          <w:color w:val="000000"/>
+          <w:sz w:val="30"/>
+        </w:rPr>
+        <w:t>场景十一：数字孪生运营与方案推演。</w:t>
+      </w:r>
+      <w:r>
+        <w:rPr>
+          <w:rFonts w:ascii="Times New Roman" w:hAnsi="Times New Roman" w:hint="eastAsia" w:eastAsia="仿宋" w:cs="Times New Roman"/>
+          <w:b w:val="0"/>
+          <w:color w:val="000000"/>
+          <w:sz w:val="30"/>
+        </w:rPr>
+        <w:t xml:space="preserve"> 稳定的 Twin ID 把事件定位到具体构件，并关联 4D 进度、5D 成本、调试、遥测和维护状态。方案实验室可运行工期恢复、设备预测性维护和车站能耗优化等方案，结果一律为待审批状态，不直接修改资产状态。当前孪生模型和遥测为合成示例，接入真实 BIM 模型和传感器数据属于规划内容。</w:t>
+      </w:r>
+    </w:p>
+    <w:p>
+      <w:pPr>
+        <w:widowControl/>
+        <w:spacing w:line="540" w:lineRule="exact" w:after="0"/>
+        <w:ind w:firstLine="639"/>
+        <w:jc w:val="both"/>
+      </w:pPr>
+      <w:r>
+        <w:rPr>
+          <w:rFonts w:ascii="Times New Roman" w:hAnsi="Times New Roman" w:hint="eastAsia" w:eastAsia="黑体" w:cs="Times New Roman"/>
+          <w:b/>
+          <w:color w:val="000000"/>
+          <w:sz w:val="30"/>
+        </w:rPr>
+        <w:t>场景十二：现场离线采集与统一数据接入。</w:t>
+      </w:r>
+      <w:r>
+        <w:rPr>
+          <w:rFonts w:ascii="Times New Roman" w:hAnsi="Times New Roman" w:hint="eastAsia" w:eastAsia="仿宋" w:cs="Times New Roman"/>
+          <w:b w:val="0"/>
+          <w:color w:val="000000"/>
+          <w:sz w:val="30"/>
+        </w:rPr>
+        <w:t xml:space="preserve"> 现场移动端支持在弱网或无网条件下采集检查、NCR、HSE、进度和调试观察，网络恢复后自动同步且不会重复提交。统一数据接入中心把输入分为事件与案例、文档与函件、项目主数据、企业系统连接器、BIM/GIS/孪生模型和 IoT 遥测六类通道，每次接入都生成带校验结果、数量和来源血缘的接入回执。</w:t>
       </w:r>
     </w:p>
     <w:p>

</xml_diff>

<commit_message>
docs(submission): state compatibility with DeepSeek and other domestic LLMs
Co-Authored-By: Claude Opus 5.5 <noreply@anthropic.com>
</commit_message>
<xml_diff>
--- a/submission/final/GlobalInfra_AI_AI出海应用设计报告.docx
+++ b/submission/final/GlobalInfra_AI_AI出海应用设计报告.docx
@@ -226,6 +226,40 @@
           <w:sz w:val="28"/>
         </w:rPr>
         <w:t>：共十二个，首批聚焦马来西亚轨道交通项目的业主及分包函件分析与回复、现场质量安全事件闭环处置，并覆盖属地合规、法规问答、多语培训、项目管理、数字孪生和现场离线采集。</w:t>
+      </w:r>
+    </w:p>
+    <w:p>
+      <w:pPr>
+        <w:spacing w:line="500" w:lineRule="exact" w:after="40"/>
+        <w:ind w:left="835" w:hanging="403"/>
+        <w:jc w:val="both"/>
+      </w:pPr>
+      <w:r>
+        <w:rPr>
+          <w:rFonts w:ascii="Times New Roman" w:hAnsi="Times New Roman" w:hint="eastAsia" w:eastAsia="仿宋" w:cs="Times New Roman"/>
+          <w:b/>
+          <w:color w:val="000000"/>
+          <w:sz w:val="28"/>
+        </w:rPr>
+        <w:t xml:space="preserve">• </w:t>
+      </w:r>
+      <w:r>
+        <w:rPr>
+          <w:rFonts w:ascii="Times New Roman" w:hAnsi="Times New Roman" w:hint="eastAsia" w:eastAsia="黑体" w:cs="Times New Roman"/>
+          <w:b/>
+          <w:color w:val="000000"/>
+          <w:sz w:val="28"/>
+        </w:rPr>
+        <w:t>模型兼容</w:t>
+      </w:r>
+      <w:r>
+        <w:rPr>
+          <w:rFonts w:ascii="Times New Roman" w:hAnsi="Times New Roman" w:hint="eastAsia" w:eastAsia="仿宋" w:cs="Times New Roman"/>
+          <w:b w:val="0"/>
+          <w:color w:val="000000"/>
+          <w:sz w:val="28"/>
+        </w:rPr>
+        <w:t>：兼容 DeepSeek、通义千问等国内大模型；本地已实际部署国产开源模型 Qwen3-8B，敏感数据只在本地处理。</w:t>
       </w:r>
     </w:p>
     <w:p>
@@ -8271,7 +8305,7 @@
           <w:color w:val="000000"/>
           <w:sz w:val="30"/>
         </w:rPr>
-        <w:t xml:space="preserve"> 三种运行时路由。本地部署采用 Ollama 运行开源模型 Qwen3-8B；云端通过 OpenAI 兼容接口调用，线上演示使用 OpenAI GPT 系列模型；DeepSeek 等提供 OpenAI 兼容接口的模型可通过配置接入，尚未纳入本次测试。数据分为 public、internal、restricted 三级，其中 </w:t>
+        <w:t xml:space="preserve"> 三种运行时路由。本地部署采用 Ollama 运行国产开源模型 Qwen3-8B（阿里通义千问），已完成实际部署测试；云端通过 OpenAI 兼容接口调用，线上演示使用 OpenAI GPT 系列模型。平台兼容 DeepSeek、通义千问等国内大模型：它们均提供 OpenAI 兼容接口，只需配置接口地址、密钥和模型名称即可切换，无需修改代码，便于在国内或项目所在国的合规要求下选择模型；DeepSeek 等云端模型尚未纳入本次测试。数据分为 public、internal、restricted 三级，其中 </w:t>
       </w:r>
       <w:r>
         <w:rPr>
@@ -8501,7 +8535,7 @@
           <w:color w:val="000000"/>
           <w:sz w:val="30"/>
         </w:rPr>
-        <w:t xml:space="preserve">平台通过 OpenAI 兼容接口接入云端或本地模型，并记录不含凭据的路由轨迹。结构化输出使用 JSON schema 约束；解析器再次校验枚举、类型和原文引用。网关不支持结构化输出、模型不可用或结果越界时，系统回退到确定性规则。离线回退不是错误掩盖机制，返回结果会标明 </w:t>
+        <w:t xml:space="preserve">平台通过 OpenAI 兼容接口接入云端或本地模型，兼容 DeepSeek、通义千问等国内大模型，并记录不含凭据的路由轨迹。结构化输出使用 JSON schema 约束；解析器再次校验枚举、类型和原文引用。网关不支持结构化输出、模型不可用或结果越界时，系统回退到确定性规则。离线回退不是错误掩盖机制，返回结果会标明 </w:t>
       </w:r>
       <w:r>
         <w:rPr>

</xml_diff>

<commit_message>
docs(submission): add future vision and evolution section to the report
Co-Authored-By: Claude Opus 5.5 <noreply@anthropic.com>
</commit_message>
<xml_diff>
--- a/submission/final/GlobalInfra_AI_AI出海应用设计报告.docx
+++ b/submission/final/GlobalInfra_AI_AI出海应用设计报告.docx
@@ -17782,6 +17782,153 @@
           <w:sz w:val="30"/>
         </w:rPr>
         <w:t>限制包括真实项目数据授权、源系统接口质量、属地法规更新、模型语言能力和专业责任边界；在真实项目完成外部验证前，合成评测仅作为工程验证，不宣称行业领先。</w:t>
+      </w:r>
+    </w:p>
+    <w:p>
+      <w:pPr>
+        <w:keepNext/>
+        <w:widowControl/>
+        <w:spacing w:before="200" w:after="80" w:line="520" w:lineRule="exact"/>
+        <w:ind w:firstLine="642"/>
+        <w:jc w:val="both"/>
+      </w:pPr>
+      <w:r>
+        <w:rPr>
+          <w:rFonts w:ascii="Times New Roman" w:hAnsi="Times New Roman" w:hint="eastAsia" w:eastAsia="黑体" w:cs="Times New Roman"/>
+          <w:b/>
+          <w:color w:val="000000"/>
+          <w:sz w:val="30"/>
+        </w:rPr>
+        <w:t>（五）未来愿景与演进方向</w:t>
+      </w:r>
+    </w:p>
+    <w:p>
+      <w:pPr>
+        <w:widowControl/>
+        <w:spacing w:line="540" w:lineRule="exact" w:after="0"/>
+        <w:ind w:firstLine="639"/>
+        <w:jc w:val="both"/>
+      </w:pPr>
+      <w:r>
+        <w:rPr>
+          <w:rFonts w:ascii="Times New Roman" w:hAnsi="Times New Roman" w:hint="eastAsia" w:eastAsia="仿宋" w:cs="Times New Roman"/>
+          <w:b w:val="0"/>
+          <w:color w:val="000000"/>
+          <w:sz w:val="30"/>
+        </w:rPr>
+        <w:t>GlobalInfra AI 的长期目标，是逐步发展成为面向全球交通与重大基础设施的 AI 原生全生命周期项目管理、智能决策与协同执行平台。平台将从当前海外工程高频场景出发，逐步覆盖项目从市场机会、投标、规划设计、采购、施工建造，到调试移交、资产运营和维护的完整生命周期。</w:t>
+      </w:r>
+    </w:p>
+    <w:p>
+      <w:pPr>
+        <w:widowControl/>
+        <w:spacing w:line="540" w:lineRule="exact" w:after="0"/>
+        <w:ind w:firstLine="639"/>
+        <w:jc w:val="both"/>
+      </w:pPr>
+      <w:r>
+        <w:rPr>
+          <w:rFonts w:ascii="Times New Roman" w:hAnsi="Times New Roman" w:hint="eastAsia" w:eastAsia="黑体" w:cs="Times New Roman"/>
+          <w:b/>
+          <w:color w:val="000000"/>
+          <w:sz w:val="30"/>
+        </w:rPr>
+        <w:t>项目层面。</w:t>
+      </w:r>
+      <w:r>
+        <w:rPr>
+          <w:rFonts w:ascii="Times New Roman" w:hAnsi="Times New Roman" w:hint="eastAsia" w:eastAsia="仿宋" w:cs="Times New Roman"/>
+          <w:b w:val="0"/>
+          <w:color w:val="000000"/>
+          <w:sz w:val="30"/>
+        </w:rPr>
+        <w:t xml:space="preserve"> 平台将建设全生命周期项目智能管理能力，以项目目标为核心，统一关联进度、成本、合同商务、设计、采购、质量、安全、风险、资源、文档、接口、调试和资产运营等专业信息。平台不替代现有专业系统，而是通过统一的项目数字主线，把 P6、BIM/CDE、ERP、GIS、IoT、SCADA 及其他业务系统连接起来，使 AI 能够理解项目整体状态、识别跨专业影响、形成决策建议，并推动经授权的行动闭环。</w:t>
+      </w:r>
+    </w:p>
+    <w:p>
+      <w:pPr>
+        <w:widowControl/>
+        <w:spacing w:line="540" w:lineRule="exact" w:after="0"/>
+        <w:ind w:firstLine="639"/>
+        <w:jc w:val="both"/>
+      </w:pPr>
+      <w:r>
+        <w:rPr>
+          <w:rFonts w:ascii="Times New Roman" w:hAnsi="Times New Roman" w:hint="eastAsia" w:eastAsia="黑体" w:cs="Times New Roman"/>
+          <w:b/>
+          <w:color w:val="000000"/>
+          <w:sz w:val="30"/>
+        </w:rPr>
+        <w:t>企业层面。</w:t>
+      </w:r>
+      <w:r>
+        <w:rPr>
+          <w:rFonts w:ascii="Times New Roman" w:hAnsi="Times New Roman" w:hint="eastAsia" w:eastAsia="仿宋" w:cs="Times New Roman"/>
+          <w:b w:val="0"/>
+          <w:color w:val="000000"/>
+          <w:sz w:val="30"/>
+        </w:rPr>
+        <w:t xml:space="preserve"> 平台将由单一项目工作空间扩展为跨国家、跨项目的项目组合智能管理平台。企业管理者可以基于统一数据和知识体系识别重大进度、成本、合同、HSE 和合规风险，实现项目间经验复用、风险对标、资源协同和管理决策支持，逐步形成海外项目的企业级智能管理中枢。</w:t>
+      </w:r>
+    </w:p>
+    <w:p>
+      <w:pPr>
+        <w:widowControl/>
+        <w:spacing w:line="540" w:lineRule="exact" w:after="0"/>
+        <w:ind w:firstLine="639"/>
+        <w:jc w:val="both"/>
+      </w:pPr>
+      <w:r>
+        <w:rPr>
+          <w:rFonts w:ascii="Times New Roman" w:hAnsi="Times New Roman" w:hint="eastAsia" w:eastAsia="黑体" w:cs="Times New Roman"/>
+          <w:b/>
+          <w:color w:val="000000"/>
+          <w:sz w:val="30"/>
+        </w:rPr>
+        <w:t>全球化层面。</w:t>
+      </w:r>
+      <w:r>
+        <w:rPr>
+          <w:rFonts w:ascii="Times New Roman" w:hAnsi="Times New Roman" w:hint="eastAsia" w:eastAsia="仿宋" w:cs="Times New Roman"/>
+          <w:b w:val="0"/>
+          <w:color w:val="000000"/>
+          <w:sz w:val="30"/>
+        </w:rPr>
+        <w:t xml:space="preserve"> 平台将通过“统一核心能力＋国家规则包＋工程领域包”持续扩展到不同国家、基础设施类型和司法辖区，并支持全球控制面、区域数据面和项目边缘部署，使语言、法规、技术标准、数据主权和工程实践能够按项目环境快速适配。</w:t>
+      </w:r>
+    </w:p>
+    <w:p>
+      <w:pPr>
+        <w:widowControl/>
+        <w:spacing w:line="540" w:lineRule="exact" w:after="0"/>
+        <w:ind w:firstLine="639"/>
+        <w:jc w:val="both"/>
+      </w:pPr>
+      <w:r>
+        <w:rPr>
+          <w:rFonts w:ascii="Times New Roman" w:hAnsi="Times New Roman" w:hint="eastAsia" w:eastAsia="仿宋" w:cs="Times New Roman"/>
+          <w:b w:val="0"/>
+          <w:color w:val="000000"/>
+          <w:sz w:val="30"/>
+        </w:rPr>
+        <w:t>最终，GlobalInfra AI 将逐步形成位于 P6、BIM、ERP、GIS、CDE、SCADA、IoT、CMMS 等专业系统之上的全球基础设施智能与行动层（Global Infrastructure Intelligence &amp; Action Layer），连接人员、工程知识、项目系统、AI 智能体、数字孪生和现实基础设施资产，实现从项目全生命周期管理，到企业多项目智能管理，再到全球基础设施智能决策与协同执行。</w:t>
+      </w:r>
+    </w:p>
+    <w:p>
+      <w:pPr>
+        <w:widowControl/>
+        <w:spacing w:line="540" w:lineRule="exact" w:after="0"/>
+        <w:ind w:firstLine="639"/>
+        <w:jc w:val="both"/>
+      </w:pPr>
+      <w:r>
+        <w:rPr>
+          <w:rFonts w:ascii="Times New Roman" w:hAnsi="Times New Roman" w:hint="eastAsia" w:eastAsia="黑体" w:cs="Times New Roman"/>
+          <w:b/>
+          <w:color w:val="000000"/>
+          <w:sz w:val="30"/>
+        </w:rPr>
+        <w:t>最终愿景：让每一个基础设施项目都拥有持续理解项目状态、发现风险、辅助决策、协调资源、推动执行、验证结果并沉淀经验的智能能力。</w:t>
       </w:r>
     </w:p>
     <w:p>

</xml_diff>